<commit_message>
Bab 1 - Memperbaiki layout
</commit_message>
<xml_diff>
--- a/Implementasi Design System V2 pada Perancangan Ulang Platform Reusely untuk Meningkatkan Konsistensi dan Efektivitas Prototipe.docx
+++ b/Implementasi Design System V2 pada Perancangan Ulang Platform Reusely untuk Meningkatkan Konsistensi dan Efektivitas Prototipe.docx
@@ -1349,7 +1349,7 @@
           <w:numId w:val="19"/>
         </w:numPr>
         <w:spacing w:before="0" w:after="120" w:line="360" w:lineRule="auto"/>
-        <w:ind w:left="360"/>
+        <w:ind w:left="540" w:hanging="540"/>
         <w:rPr>
           <w:lang w:val="en-US"/>
         </w:rPr>
@@ -2081,7 +2081,7 @@
           <w:numId w:val="6"/>
         </w:numPr>
         <w:spacing w:after="120" w:line="360" w:lineRule="auto"/>
-        <w:ind w:left="360"/>
+        <w:ind w:left="540" w:hanging="540"/>
         <w:jc w:val="both"/>
         <w:rPr>
           <w:rFonts w:ascii="Times New Roman" w:hAnsi="Times New Roman" w:cs="Times New Roman"/>
@@ -2106,7 +2106,7 @@
       <w:pPr>
         <w:pStyle w:val="ListParagraph"/>
         <w:spacing w:after="120" w:line="360" w:lineRule="auto"/>
-        <w:ind w:left="0" w:firstLine="360"/>
+        <w:ind w:left="0" w:firstLine="540"/>
         <w:jc w:val="both"/>
         <w:rPr>
           <w:rFonts w:ascii="Times New Roman" w:hAnsi="Times New Roman" w:cs="Times New Roman"/>
@@ -2151,7 +2151,7 @@
           <w:numId w:val="7"/>
         </w:numPr>
         <w:spacing w:after="120" w:line="360" w:lineRule="auto"/>
-        <w:ind w:left="720"/>
+        <w:ind w:left="900"/>
         <w:jc w:val="both"/>
         <w:rPr>
           <w:rFonts w:ascii="Times New Roman" w:hAnsi="Times New Roman" w:cs="Times New Roman"/>
@@ -2198,7 +2198,7 @@
           <w:numId w:val="7"/>
         </w:numPr>
         <w:spacing w:after="120" w:line="360" w:lineRule="auto"/>
-        <w:ind w:left="720"/>
+        <w:ind w:left="900"/>
         <w:jc w:val="both"/>
         <w:rPr>
           <w:rFonts w:ascii="Times New Roman" w:hAnsi="Times New Roman" w:cs="Times New Roman"/>
@@ -2354,7 +2354,7 @@
           <w:numId w:val="12"/>
         </w:numPr>
         <w:spacing w:after="120" w:line="360" w:lineRule="auto"/>
-        <w:ind w:left="360"/>
+        <w:ind w:left="540" w:hanging="540"/>
         <w:jc w:val="both"/>
         <w:rPr>
           <w:rFonts w:ascii="Times New Roman" w:hAnsi="Times New Roman" w:cs="Times New Roman"/>
@@ -2381,7 +2381,7 @@
       <w:pPr>
         <w:pStyle w:val="ListParagraph"/>
         <w:spacing w:after="120" w:line="360" w:lineRule="auto"/>
-        <w:ind w:left="0" w:firstLine="360"/>
+        <w:ind w:left="0" w:firstLine="540"/>
         <w:jc w:val="both"/>
         <w:rPr>
           <w:rFonts w:ascii="Times New Roman" w:hAnsi="Times New Roman" w:cs="Times New Roman"/>
@@ -2408,7 +2408,7 @@
           <w:numId w:val="13"/>
         </w:numPr>
         <w:spacing w:after="120" w:line="360" w:lineRule="auto"/>
-        <w:ind w:left="720"/>
+        <w:ind w:left="900"/>
         <w:jc w:val="both"/>
         <w:rPr>
           <w:rFonts w:ascii="Times New Roman" w:hAnsi="Times New Roman" w:cs="Times New Roman"/>
@@ -2476,7 +2476,7 @@
           <w:numId w:val="13"/>
         </w:numPr>
         <w:spacing w:after="120" w:line="360" w:lineRule="auto"/>
-        <w:ind w:left="720"/>
+        <w:ind w:left="900"/>
         <w:jc w:val="both"/>
         <w:rPr>
           <w:rFonts w:ascii="Times New Roman" w:hAnsi="Times New Roman" w:cs="Times New Roman"/>
@@ -2654,7 +2654,7 @@
           <w:numId w:val="12"/>
         </w:numPr>
         <w:spacing w:after="120" w:line="360" w:lineRule="auto"/>
-        <w:ind w:left="360"/>
+        <w:ind w:left="540" w:hanging="540"/>
         <w:jc w:val="both"/>
         <w:rPr>
           <w:rFonts w:ascii="Times New Roman" w:hAnsi="Times New Roman" w:cs="Times New Roman"/>
@@ -2681,7 +2681,7 @@
       <w:pPr>
         <w:pStyle w:val="ListParagraph"/>
         <w:spacing w:after="120" w:line="360" w:lineRule="auto"/>
-        <w:ind w:left="0" w:firstLine="360"/>
+        <w:ind w:left="0" w:firstLine="540"/>
         <w:jc w:val="both"/>
         <w:rPr>
           <w:rFonts w:ascii="Times New Roman" w:hAnsi="Times New Roman" w:cs="Times New Roman"/>
@@ -2703,7 +2703,8 @@
     <w:tbl>
       <w:tblPr>
         <w:tblStyle w:val="TableGrid"/>
-        <w:tblW w:w="0" w:type="auto"/>
+        <w:tblW w:w="7830" w:type="dxa"/>
+        <w:tblInd w:w="540" w:type="dxa"/>
         <w:tblBorders>
           <w:top w:val="none" w:sz="0" w:space="0" w:color="auto"/>
           <w:left w:val="none" w:sz="0" w:space="0" w:color="auto"/>
@@ -2715,14 +2716,14 @@
         <w:tblLook w:val="04A0" w:firstRow="1" w:lastRow="0" w:firstColumn="1" w:lastColumn="0" w:noHBand="0" w:noVBand="1"/>
       </w:tblPr>
       <w:tblGrid>
-        <w:gridCol w:w="2785"/>
-        <w:gridCol w:w="283"/>
-        <w:gridCol w:w="4867"/>
+        <w:gridCol w:w="2712"/>
+        <w:gridCol w:w="628"/>
+        <w:gridCol w:w="4490"/>
       </w:tblGrid>
       <w:tr>
         <w:tc>
           <w:tcPr>
-            <w:tcW w:w="2785" w:type="dxa"/>
+            <w:tcW w:w="2712" w:type="dxa"/>
           </w:tcPr>
           <w:p>
             <w:pPr>
@@ -2732,7 +2733,7 @@
                 <w:numId w:val="20"/>
               </w:numPr>
               <w:spacing w:after="120" w:line="360" w:lineRule="auto"/>
-              <w:ind w:left="600"/>
+              <w:ind w:left="345" w:hanging="450"/>
               <w:jc w:val="both"/>
               <w:rPr>
                 <w:rFonts w:ascii="Times New Roman" w:hAnsi="Times New Roman" w:cs="Times New Roman"/>
@@ -2754,13 +2755,13 @@
         </w:tc>
         <w:tc>
           <w:tcPr>
-            <w:tcW w:w="275" w:type="dxa"/>
+            <w:tcW w:w="628" w:type="dxa"/>
           </w:tcPr>
           <w:p>
             <w:pPr>
               <w:pStyle w:val="ListParagraph"/>
               <w:spacing w:after="120" w:line="360" w:lineRule="auto"/>
-              <w:ind w:left="0"/>
+              <w:ind w:left="345" w:hanging="450"/>
               <w:jc w:val="both"/>
               <w:rPr>
                 <w:rFonts w:ascii="Times New Roman" w:hAnsi="Times New Roman" w:cs="Times New Roman"/>
@@ -2782,13 +2783,13 @@
         </w:tc>
         <w:tc>
           <w:tcPr>
-            <w:tcW w:w="4867" w:type="dxa"/>
+            <w:tcW w:w="4490" w:type="dxa"/>
           </w:tcPr>
           <w:p>
             <w:pPr>
               <w:pStyle w:val="ListParagraph"/>
               <w:spacing w:after="120" w:line="360" w:lineRule="auto"/>
-              <w:ind w:left="0"/>
+              <w:ind w:left="345" w:hanging="450"/>
               <w:jc w:val="both"/>
               <w:rPr>
                 <w:rFonts w:ascii="Times New Roman" w:hAnsi="Times New Roman" w:cs="Times New Roman"/>
@@ -2812,7 +2813,7 @@
       <w:tr>
         <w:tc>
           <w:tcPr>
-            <w:tcW w:w="2785" w:type="dxa"/>
+            <w:tcW w:w="2712" w:type="dxa"/>
           </w:tcPr>
           <w:p>
             <w:pPr>
@@ -2822,7 +2823,7 @@
                 <w:numId w:val="20"/>
               </w:numPr>
               <w:spacing w:after="120" w:line="360" w:lineRule="auto"/>
-              <w:ind w:left="600"/>
+              <w:ind w:left="345" w:hanging="450"/>
               <w:jc w:val="both"/>
               <w:rPr>
                 <w:rFonts w:ascii="Times New Roman" w:hAnsi="Times New Roman" w:cs="Times New Roman"/>
@@ -2844,13 +2845,13 @@
         </w:tc>
         <w:tc>
           <w:tcPr>
-            <w:tcW w:w="275" w:type="dxa"/>
+            <w:tcW w:w="628" w:type="dxa"/>
           </w:tcPr>
           <w:p>
             <w:pPr>
               <w:pStyle w:val="ListParagraph"/>
               <w:spacing w:after="120" w:line="360" w:lineRule="auto"/>
-              <w:ind w:left="0"/>
+              <w:ind w:left="345" w:hanging="450"/>
               <w:jc w:val="both"/>
               <w:rPr>
                 <w:rFonts w:ascii="Times New Roman" w:hAnsi="Times New Roman" w:cs="Times New Roman"/>
@@ -2872,13 +2873,13 @@
         </w:tc>
         <w:tc>
           <w:tcPr>
-            <w:tcW w:w="4867" w:type="dxa"/>
+            <w:tcW w:w="4490" w:type="dxa"/>
           </w:tcPr>
           <w:p>
             <w:pPr>
               <w:pStyle w:val="ListParagraph"/>
               <w:spacing w:after="120" w:line="360" w:lineRule="auto"/>
-              <w:ind w:left="0"/>
+              <w:ind w:left="345" w:hanging="450"/>
               <w:jc w:val="both"/>
               <w:rPr>
                 <w:rFonts w:ascii="Times New Roman" w:hAnsi="Times New Roman" w:cs="Times New Roman"/>
@@ -2911,7 +2912,7 @@
       <w:tr>
         <w:tc>
           <w:tcPr>
-            <w:tcW w:w="2785" w:type="dxa"/>
+            <w:tcW w:w="2712" w:type="dxa"/>
           </w:tcPr>
           <w:p>
             <w:pPr>
@@ -2921,7 +2922,7 @@
                 <w:numId w:val="20"/>
               </w:numPr>
               <w:spacing w:after="120" w:line="360" w:lineRule="auto"/>
-              <w:ind w:left="600"/>
+              <w:ind w:left="345" w:hanging="450"/>
               <w:jc w:val="both"/>
               <w:rPr>
                 <w:rFonts w:ascii="Times New Roman" w:hAnsi="Times New Roman" w:cs="Times New Roman"/>
@@ -2943,13 +2944,13 @@
         </w:tc>
         <w:tc>
           <w:tcPr>
-            <w:tcW w:w="275" w:type="dxa"/>
+            <w:tcW w:w="628" w:type="dxa"/>
           </w:tcPr>
           <w:p>
             <w:pPr>
               <w:pStyle w:val="ListParagraph"/>
               <w:spacing w:after="120" w:line="360" w:lineRule="auto"/>
-              <w:ind w:left="0"/>
+              <w:ind w:left="345" w:hanging="450"/>
               <w:jc w:val="both"/>
               <w:rPr>
                 <w:rFonts w:ascii="Times New Roman" w:hAnsi="Times New Roman" w:cs="Times New Roman"/>
@@ -2971,13 +2972,13 @@
         </w:tc>
         <w:tc>
           <w:tcPr>
-            <w:tcW w:w="4867" w:type="dxa"/>
+            <w:tcW w:w="4490" w:type="dxa"/>
           </w:tcPr>
           <w:p>
             <w:pPr>
               <w:pStyle w:val="ListParagraph"/>
               <w:spacing w:after="120" w:line="360" w:lineRule="auto"/>
-              <w:ind w:left="0"/>
+              <w:ind w:left="345" w:hanging="450"/>
               <w:jc w:val="both"/>
               <w:rPr>
                 <w:rFonts w:ascii="Times New Roman" w:hAnsi="Times New Roman" w:cs="Times New Roman"/>
@@ -3019,7 +3020,7 @@
       <w:tr>
         <w:tc>
           <w:tcPr>
-            <w:tcW w:w="2785" w:type="dxa"/>
+            <w:tcW w:w="2712" w:type="dxa"/>
           </w:tcPr>
           <w:p>
             <w:pPr>
@@ -3029,7 +3030,7 @@
                 <w:numId w:val="20"/>
               </w:numPr>
               <w:spacing w:after="120" w:line="360" w:lineRule="auto"/>
-              <w:ind w:left="605"/>
+              <w:ind w:left="345" w:hanging="450"/>
               <w:jc w:val="both"/>
               <w:rPr>
                 <w:rFonts w:ascii="Times New Roman" w:hAnsi="Times New Roman" w:cs="Times New Roman"/>
@@ -3051,13 +3052,13 @@
         </w:tc>
         <w:tc>
           <w:tcPr>
-            <w:tcW w:w="275" w:type="dxa"/>
+            <w:tcW w:w="628" w:type="dxa"/>
           </w:tcPr>
           <w:p>
             <w:pPr>
               <w:pStyle w:val="ListParagraph"/>
               <w:spacing w:after="120" w:line="360" w:lineRule="auto"/>
-              <w:ind w:left="0"/>
+              <w:ind w:left="345" w:hanging="450"/>
               <w:jc w:val="both"/>
               <w:rPr>
                 <w:rFonts w:ascii="Times New Roman" w:hAnsi="Times New Roman" w:cs="Times New Roman"/>
@@ -3079,13 +3080,13 @@
         </w:tc>
         <w:tc>
           <w:tcPr>
-            <w:tcW w:w="4867" w:type="dxa"/>
+            <w:tcW w:w="4490" w:type="dxa"/>
           </w:tcPr>
           <w:p>
             <w:pPr>
               <w:pStyle w:val="ListParagraph"/>
               <w:spacing w:after="120" w:line="360" w:lineRule="auto"/>
-              <w:ind w:left="0"/>
+              <w:ind w:left="345" w:hanging="450"/>
               <w:jc w:val="both"/>
               <w:rPr>
                 <w:rFonts w:ascii="Times New Roman" w:hAnsi="Times New Roman" w:cs="Times New Roman"/>
@@ -3137,6 +3138,7 @@
           <w:numId w:val="21"/>
         </w:numPr>
         <w:spacing w:after="120" w:line="360" w:lineRule="auto"/>
+        <w:ind w:left="540" w:hanging="540"/>
         <w:jc w:val="both"/>
         <w:rPr>
           <w:rFonts w:ascii="Times New Roman" w:hAnsi="Times New Roman" w:cs="Times New Roman"/>
@@ -3167,7 +3169,7 @@
           <w:numId w:val="18"/>
         </w:numPr>
         <w:spacing w:after="120" w:line="360" w:lineRule="auto"/>
-        <w:ind w:left="900" w:hanging="540"/>
+        <w:ind w:left="1080" w:hanging="540"/>
         <w:jc w:val="both"/>
         <w:rPr>
           <w:rFonts w:ascii="Times New Roman" w:hAnsi="Times New Roman" w:cs="Times New Roman"/>
@@ -3198,7 +3200,7 @@
           <w:numId w:val="18"/>
         </w:numPr>
         <w:spacing w:after="120" w:line="360" w:lineRule="auto"/>
-        <w:ind w:left="1260"/>
+        <w:ind w:left="1440"/>
         <w:jc w:val="both"/>
         <w:rPr>
           <w:rFonts w:ascii="Times New Roman" w:hAnsi="Times New Roman" w:cs="Times New Roman"/>
@@ -3254,7 +3256,7 @@
           <w:numId w:val="18"/>
         </w:numPr>
         <w:spacing w:after="120" w:line="360" w:lineRule="auto"/>
-        <w:ind w:left="1260"/>
+        <w:ind w:left="1440"/>
         <w:jc w:val="both"/>
         <w:rPr>
           <w:rFonts w:ascii="Times New Roman" w:hAnsi="Times New Roman" w:cs="Times New Roman"/>
@@ -3281,7 +3283,7 @@
           <w:numId w:val="18"/>
         </w:numPr>
         <w:spacing w:after="120" w:line="360" w:lineRule="auto"/>
-        <w:ind w:left="1260"/>
+        <w:ind w:left="1440"/>
         <w:jc w:val="both"/>
         <w:rPr>
           <w:rFonts w:ascii="Times New Roman" w:hAnsi="Times New Roman" w:cs="Times New Roman"/>
@@ -3348,7 +3350,7 @@
           <w:numId w:val="18"/>
         </w:numPr>
         <w:spacing w:after="120" w:line="360" w:lineRule="auto"/>
-        <w:ind w:left="900" w:hanging="540"/>
+        <w:ind w:left="1080" w:hanging="540"/>
         <w:jc w:val="both"/>
         <w:rPr>
           <w:rFonts w:ascii="Times New Roman" w:hAnsi="Times New Roman" w:cs="Times New Roman"/>
@@ -3379,7 +3381,7 @@
           <w:numId w:val="18"/>
         </w:numPr>
         <w:spacing w:after="120" w:line="360" w:lineRule="auto"/>
-        <w:ind w:left="1260"/>
+        <w:ind w:left="1440"/>
         <w:jc w:val="both"/>
         <w:rPr>
           <w:rFonts w:ascii="Times New Roman" w:hAnsi="Times New Roman" w:cs="Times New Roman"/>
@@ -3406,7 +3408,7 @@
           <w:numId w:val="12"/>
         </w:numPr>
         <w:spacing w:after="120" w:line="360" w:lineRule="auto"/>
-        <w:ind w:left="1620"/>
+        <w:ind w:left="1800"/>
         <w:jc w:val="both"/>
         <w:rPr>
           <w:rFonts w:ascii="Times New Roman" w:hAnsi="Times New Roman" w:cs="Times New Roman"/>
@@ -3471,7 +3473,7 @@
           <w:numId w:val="12"/>
         </w:numPr>
         <w:spacing w:after="120" w:line="360" w:lineRule="auto"/>
-        <w:ind w:left="1620"/>
+        <w:ind w:left="1800"/>
         <w:jc w:val="both"/>
         <w:rPr>
           <w:rFonts w:ascii="Times New Roman" w:hAnsi="Times New Roman" w:cs="Times New Roman"/>
@@ -3498,7 +3500,7 @@
           <w:numId w:val="18"/>
         </w:numPr>
         <w:spacing w:after="120" w:line="360" w:lineRule="auto"/>
-        <w:ind w:left="1260"/>
+        <w:ind w:left="1440"/>
         <w:jc w:val="both"/>
         <w:rPr>
           <w:rFonts w:ascii="Times New Roman" w:hAnsi="Times New Roman" w:cs="Times New Roman"/>
@@ -3514,6 +3516,7 @@
           <w:szCs w:val="24"/>
           <w:lang w:val="en-US"/>
         </w:rPr>
+        <w:lastRenderedPageBreak/>
         <w:t>Bagi Penulis:</w:t>
       </w:r>
     </w:p>
@@ -3525,7 +3528,7 @@
           <w:numId w:val="22"/>
         </w:numPr>
         <w:spacing w:after="120" w:line="360" w:lineRule="auto"/>
-        <w:ind w:left="1620"/>
+        <w:ind w:left="1800"/>
         <w:jc w:val="both"/>
         <w:rPr>
           <w:rFonts w:ascii="Times New Roman" w:hAnsi="Times New Roman" w:cs="Times New Roman"/>
@@ -3541,7 +3544,6 @@
           <w:szCs w:val="24"/>
           <w:lang w:val="en-US"/>
         </w:rPr>
-        <w:lastRenderedPageBreak/>
         <w:t xml:space="preserve">Memperdalam pemahaman mengenai implementasi </w:t>
       </w:r>
       <w:r>
@@ -3573,7 +3575,7 @@
           <w:numId w:val="22"/>
         </w:numPr>
         <w:spacing w:after="120" w:line="360" w:lineRule="auto"/>
-        <w:ind w:left="1620"/>
+        <w:ind w:left="1800"/>
         <w:jc w:val="both"/>
         <w:rPr>
           <w:rFonts w:ascii="Times New Roman" w:hAnsi="Times New Roman" w:cs="Times New Roman"/>
@@ -3742,7 +3744,7 @@
           <w:numId w:val="15"/>
         </w:numPr>
         <w:spacing w:after="120" w:line="360" w:lineRule="auto"/>
-        <w:ind w:left="360"/>
+        <w:ind w:left="540" w:hanging="540"/>
         <w:jc w:val="both"/>
         <w:rPr>
           <w:rFonts w:ascii="Times New Roman" w:hAnsi="Times New Roman" w:cs="Times New Roman"/>
@@ -3767,7 +3769,7 @@
       <w:pPr>
         <w:pStyle w:val="ListParagraph"/>
         <w:spacing w:after="120" w:line="360" w:lineRule="auto"/>
-        <w:ind w:left="0" w:firstLine="360"/>
+        <w:ind w:left="0" w:firstLine="540"/>
         <w:jc w:val="both"/>
         <w:rPr>
           <w:rFonts w:ascii="Times New Roman" w:hAnsi="Times New Roman" w:cs="Times New Roman"/>
@@ -3790,7 +3792,7 @@
       <w:pPr>
         <w:pStyle w:val="ListParagraph"/>
         <w:spacing w:after="120" w:line="360" w:lineRule="auto"/>
-        <w:ind w:left="1800" w:hanging="1440"/>
+        <w:ind w:left="1800" w:hanging="1260"/>
         <w:jc w:val="both"/>
         <w:rPr>
           <w:rFonts w:ascii="Times New Roman" w:hAnsi="Times New Roman" w:cs="Times New Roman"/>
@@ -3914,7 +3916,7 @@
       <w:pPr>
         <w:pStyle w:val="ListParagraph"/>
         <w:spacing w:after="120" w:line="360" w:lineRule="auto"/>
-        <w:ind w:left="1800" w:hanging="1440"/>
+        <w:ind w:left="1800" w:hanging="1260"/>
         <w:jc w:val="both"/>
         <w:rPr>
           <w:rFonts w:ascii="Times New Roman" w:hAnsi="Times New Roman" w:cs="Times New Roman"/>
@@ -4002,7 +4004,7 @@
       <w:pPr>
         <w:pStyle w:val="ListParagraph"/>
         <w:spacing w:after="120" w:line="360" w:lineRule="auto"/>
-        <w:ind w:left="1800" w:hanging="1440"/>
+        <w:ind w:left="1800" w:hanging="1260"/>
         <w:jc w:val="both"/>
         <w:rPr>
           <w:rFonts w:ascii="Times New Roman" w:hAnsi="Times New Roman" w:cs="Times New Roman"/>
@@ -4194,7 +4196,7 @@
     <w:p>
       <w:pPr>
         <w:spacing w:after="120" w:line="360" w:lineRule="auto"/>
-        <w:ind w:left="1800" w:hanging="1440"/>
+        <w:ind w:left="1800" w:hanging="1260"/>
         <w:jc w:val="both"/>
         <w:rPr>
           <w:rFonts w:ascii="Times New Roman" w:hAnsi="Times New Roman" w:cs="Times New Roman"/>
@@ -4254,7 +4256,17 @@
           <w:szCs w:val="24"/>
           <w:lang w:val="en-US"/>
         </w:rPr>
-        <w:t>Berisi Kesimpulan yang ditarik dari seluruh kegiatan kerja praktek serta Saran-saran yang relevan baik bagi perusahaan (terkait pengembangan platform Reusely) maupun bagi institusi pendidikan.</w:t>
+        <w:t xml:space="preserve">Berisi Kesimpulan yang ditarik dari seluruh kegiatan kerja praktek serta Saran-saran yang relevan baik bagi perusahaan </w:t>
+      </w:r>
+      <w:r>
+        <w:rPr>
+          <w:rFonts w:ascii="Times New Roman" w:hAnsi="Times New Roman" w:cs="Times New Roman"/>
+          <w:sz w:val="24"/>
+          <w:szCs w:val="24"/>
+          <w:lang w:val="en-US"/>
+        </w:rPr>
+        <w:lastRenderedPageBreak/>
+        <w:t>(terkait pengembangan platform Reusely) maupun bagi institusi pendidikan.</w:t>
       </w:r>
     </w:p>
     <w:sectPr>

</xml_diff>

<commit_message>
Bab 1 - Menambahkan 3 sitasi.
</commit_message>
<xml_diff>
--- a/Implementasi Design System V2 pada Perancangan Ulang Platform Reusely untuk Meningkatkan Konsistensi dan Efektivitas Prototipe.docx
+++ b/Implementasi Design System V2 pada Perancangan Ulang Platform Reusely untuk Meningkatkan Konsistensi dan Efektivitas Prototipe.docx
@@ -221,7 +221,31 @@
           <w:szCs w:val="24"/>
           <w:lang w:val="en-US"/>
         </w:rPr>
-        <w:t>LAPORAN KERJA PRAKTEK</w:t>
+        <w:t>LAPORAN KERJA PRAKT</w:t>
+      </w:r>
+      <w:r>
+        <w:rPr>
+          <w:rFonts w:ascii="Times New Roman" w:eastAsia="Times New Roman" w:hAnsi="Times New Roman" w:cs="Times New Roman"/>
+          <w:b/>
+          <w:bCs/>
+          <w:color w:val="000000"/>
+          <w:sz w:val="24"/>
+          <w:szCs w:val="24"/>
+          <w:lang w:val="en-US"/>
+        </w:rPr>
+        <w:t>I</w:t>
+      </w:r>
+      <w:r>
+        <w:rPr>
+          <w:rFonts w:ascii="Times New Roman" w:eastAsia="Times New Roman" w:hAnsi="Times New Roman" w:cs="Times New Roman"/>
+          <w:b/>
+          <w:bCs/>
+          <w:color w:val="000000"/>
+          <w:sz w:val="24"/>
+          <w:szCs w:val="24"/>
+          <w:lang w:val="en-US"/>
+        </w:rPr>
+        <w:t>K</w:t>
       </w:r>
     </w:p>
     <w:p>
@@ -274,7 +298,23 @@
           <w:color w:val="000000"/>
           <w:lang w:val="en-US"/>
         </w:rPr>
-        <w:t>Untuk Memenuhi Mata Kuliah Kerja Praktek</w:t>
+        <w:t>Untuk Memenuhi Mata Kuliah Kerja Prakt</w:t>
+      </w:r>
+      <w:r>
+        <w:rPr>
+          <w:rFonts w:ascii="Times New Roman" w:eastAsia="Times New Roman" w:hAnsi="Times New Roman" w:cs="Times New Roman"/>
+          <w:color w:val="000000"/>
+          <w:lang w:val="en-US"/>
+        </w:rPr>
+        <w:t>i</w:t>
+      </w:r>
+      <w:r>
+        <w:rPr>
+          <w:rFonts w:ascii="Times New Roman" w:eastAsia="Times New Roman" w:hAnsi="Times New Roman" w:cs="Times New Roman"/>
+          <w:color w:val="000000"/>
+          <w:lang w:val="en-US"/>
+        </w:rPr>
+        <w:t>k</w:t>
       </w:r>
     </w:p>
     <w:p>
@@ -659,7 +699,31 @@
           <w:lang w:val="en-US"/>
         </w:rPr>
         <w:lastRenderedPageBreak/>
-        <w:t>LEMBAR PENGESAHAN KERJA PRAKTEK</w:t>
+        <w:t>LEMBAR PENGESAHAN KERJA PRAKT</w:t>
+      </w:r>
+      <w:r>
+        <w:rPr>
+          <w:rFonts w:ascii="Times New Roman" w:eastAsia="Times New Roman" w:hAnsi="Times New Roman" w:cs="Times New Roman"/>
+          <w:b/>
+          <w:bCs/>
+          <w:color w:val="000000"/>
+          <w:sz w:val="24"/>
+          <w:szCs w:val="24"/>
+          <w:lang w:val="en-US"/>
+        </w:rPr>
+        <w:t>I</w:t>
+      </w:r>
+      <w:r>
+        <w:rPr>
+          <w:rFonts w:ascii="Times New Roman" w:eastAsia="Times New Roman" w:hAnsi="Times New Roman" w:cs="Times New Roman"/>
+          <w:b/>
+          <w:bCs/>
+          <w:color w:val="000000"/>
+          <w:sz w:val="24"/>
+          <w:szCs w:val="24"/>
+          <w:lang w:val="en-US"/>
+        </w:rPr>
+        <w:t>K</w:t>
       </w:r>
     </w:p>
     <w:p>
@@ -792,7 +856,17 @@
           <w:szCs w:val="24"/>
           <w:lang w:val="en-US"/>
         </w:rPr>
-        <w:t xml:space="preserve"> 123121014</w:t>
+        <w:t xml:space="preserve"> </w:t>
+      </w:r>
+      <w:r>
+        <w:rPr>
+          <w:rFonts w:ascii="Times New Roman" w:eastAsia="Times New Roman" w:hAnsi="Times New Roman" w:cs="Times New Roman"/>
+          <w:color w:val="000000"/>
+          <w:sz w:val="24"/>
+          <w:szCs w:val="24"/>
+          <w:lang w:val="en-US"/>
+        </w:rPr>
+        <w:t>123121014</w:t>
       </w:r>
     </w:p>
     <w:p>
@@ -892,6 +966,8 @@
       <w:r>
         <w:rPr>
           <w:rFonts w:ascii="Times New Roman" w:eastAsia="Times New Roman" w:hAnsi="Times New Roman" w:cs="Times New Roman"/>
+          <w:i/>
+          <w:iCs/>
           <w:color w:val="000000"/>
           <w:sz w:val="24"/>
           <w:szCs w:val="24"/>
@@ -949,7 +1025,7 @@
           <w:szCs w:val="24"/>
           <w:lang w:val="en-US"/>
         </w:rPr>
-        <w:t>User Interface</w:t>
+        <w:t>ui</w:t>
       </w:r>
       <w:r>
         <w:rPr>
@@ -1014,8 +1090,8 @@
         <w:tblLook w:val="04A0" w:firstRow="1" w:lastRow="0" w:firstColumn="1" w:lastColumn="0" w:noHBand="0" w:noVBand="1"/>
       </w:tblPr>
       <w:tblGrid>
-        <w:gridCol w:w="4317"/>
-        <w:gridCol w:w="3620"/>
+        <w:gridCol w:w="4100"/>
+        <w:gridCol w:w="3837"/>
       </w:tblGrid>
       <w:tr>
         <w:trPr>
@@ -1055,7 +1131,7 @@
                 <w:szCs w:val="24"/>
                 <w:lang w:val="en-US"/>
               </w:rPr>
-              <w:t>User Interface</w:t>
+              <w:t xml:space="preserve">ui </w:t>
             </w:r>
             <w:r>
               <w:rPr>
@@ -1065,7 +1141,7 @@
                 <w:szCs w:val="24"/>
                 <w:lang w:val="en-US"/>
               </w:rPr>
-              <w:t xml:space="preserve"> Ketua Program Studi</w:t>
+              <w:t>Ketua Program Studi</w:t>
             </w:r>
           </w:p>
           <w:p>
@@ -1442,7 +1518,68 @@
           <w:szCs w:val="24"/>
           <w:lang w:val="en-US"/>
         </w:rPr>
-        <w:t>, pengguna cenderung mengharapkan pola interaksi yang serupa pada setiap bagian aplikasi untuk mengurangi beban kognitif mereka. Ketika sebuah produk digital memiliki elemen visual yang tidak seragam, seperti perbedaan warna, tipografi, hingga gaya tombol antar halaman, hal tersebut tidak hanya merusak estetika tetapi juga menurunkan tingkat kepercayaan dan kredibilitas pengguna terhadap layanan tersebut.</w:t>
+        <w:t>, pengguna cenderung mengharapkan pola interaksi yang serupa pada setiap bagian aplikasi untuk mengurangi beban kognitif mereka</w:t>
+      </w:r>
+      <w:r>
+        <w:rPr>
+          <w:rFonts w:ascii="Times New Roman" w:hAnsi="Times New Roman" w:cs="Times New Roman"/>
+          <w:sz w:val="24"/>
+          <w:szCs w:val="24"/>
+          <w:lang w:val="en-US"/>
+        </w:rPr>
+        <w:t xml:space="preserve"> </w:t>
+      </w:r>
+      <w:r>
+        <w:rPr>
+          <w:rFonts w:ascii="Times New Roman" w:hAnsi="Times New Roman" w:cs="Times New Roman"/>
+          <w:sz w:val="24"/>
+          <w:szCs w:val="24"/>
+          <w:lang w:val="en-US"/>
+        </w:rPr>
+        <w:fldChar w:fldCharType="begin"/>
+      </w:r>
+      <w:r>
+        <w:rPr>
+          <w:rFonts w:ascii="Times New Roman" w:hAnsi="Times New Roman" w:cs="Times New Roman"/>
+          <w:sz w:val="24"/>
+          <w:szCs w:val="24"/>
+          <w:lang w:val="en-US"/>
+        </w:rPr>
+        <w:instrText xml:space="preserve"> ADDIN ZOTERO_ITEM CSL_CITATION {"citationID":"iDy6wVaB","properties":{"unsorted":false,"formattedCitation":"(Yablonski, 2020)","plainCitation":"(Yablonski, 2020)","noteIndex":0},"citationItems":[{"id":2,"uris":["http://zotero.org/users/local/Tywae54I/items/MGDE9ARR"],"itemData":{"id":2,"type":"book","abstract":"Cover -- Copyright -- Table of Contents -- Preface -- Why I Wrote This Book -- Who This Book Is For -- What's in This Book -- O'Reilly Online Learning -- How to Contact Us -- Acknowledgments -- Chapter 1. Jakob's Law -- Overview -- Origins -- Examples -- Conclusion -- Chapter 2. Fitts's Law -- Overview -- Origins -- Examples -- Conclusion -- Chapter 3. Hick's Law -- Overview -- Origins -- Examples -- Conclusion -- Chapter 4. Miller's Law -- Overview -- Origins -- Examples -- Conclusion -- Chapter 5. Postel's Law -- Overview -- Origins -- Examples -- Conclusion -- Chapter 6. Peak-End Rule -- Overview -- Origins -- Examples -- Conclusion -- Chapter 7. Aesthetic-Usability Effect -- Overview -- Origins -- Examples -- Conclusion -- Chapter 8. von Restorff Effect -- Overview -- Origins -- Examples -- Conclusion -- Chapter 9. Tesler's Law -- Overview -- Origins -- Examples -- Conclusion -- Chapter 10. Doherty Threshold -- Overview -- Origins -- Examples -- Conclusion -- Chapter 11. With Power Comes Responsibility -- How Technology Shapes Behavior -- Intermittent Variable Rewards -- Infinite Loops -- Social Affirmation -- Defaults -- (Lack of) Friction -- Reciprocity -- Dark Patterns -- Why Ethics Matter -- Good Intentions, Unintended Consequences -- The Ethical Imperative -- Slow Down and Be Intentional -- Think Beyond the Happy Path -- Diversify Teams and Thinking -- Look Beyond Data -- Chapter 12. Applying Psychological Principles in Design -- Building Awareness -- Visibility -- Show-and-Tell -- Design Principles -- Defining Your Principles -- Best Practices -- Connecting Principles to Laws -- Conclusion -- Index -- About the Author","ISBN":"978-1-4920-5531-0","language":"eng","number-of-pages":"1","publisher":"O´Reilly","publisher-place":"Beijing Boston Farnham Sebastopol Tokyo","source":"K10plus ISBN","title":"Laws of UX: using psychology to design better products &amp; services","title-short":"Laws of UX","author":[{"family":"Yablonski","given":"Jon"}],"issued":{"date-parts":[["2020"]]}}}],"schema":"https://github.com/citation-style-language/schema/raw/master/csl-citation.json"} </w:instrText>
+      </w:r>
+      <w:r>
+        <w:rPr>
+          <w:rFonts w:ascii="Times New Roman" w:hAnsi="Times New Roman" w:cs="Times New Roman"/>
+          <w:sz w:val="24"/>
+          <w:szCs w:val="24"/>
+          <w:lang w:val="en-US"/>
+        </w:rPr>
+        <w:fldChar w:fldCharType="separate"/>
+      </w:r>
+      <w:r>
+        <w:rPr>
+          <w:rFonts w:ascii="Times New Roman" w:hAnsi="Times New Roman" w:cs="Times New Roman"/>
+          <w:sz w:val="24"/>
+        </w:rPr>
+        <w:t>(Yablonski, 2020)</w:t>
+      </w:r>
+      <w:r>
+        <w:rPr>
+          <w:rFonts w:ascii="Times New Roman" w:hAnsi="Times New Roman" w:cs="Times New Roman"/>
+          <w:sz w:val="24"/>
+          <w:szCs w:val="24"/>
+          <w:lang w:val="en-US"/>
+        </w:rPr>
+        <w:fldChar w:fldCharType="end"/>
+      </w:r>
+      <w:r>
+        <w:rPr>
+          <w:rFonts w:ascii="Times New Roman" w:hAnsi="Times New Roman" w:cs="Times New Roman"/>
+          <w:sz w:val="24"/>
+          <w:szCs w:val="24"/>
+          <w:lang w:val="en-US"/>
+        </w:rPr>
+        <w:t>. Ketika sebuah produk digital memiliki elemen visual yang tidak seragam, seperti perbedaan warna, tipografi, hingga gaya tombol antar halaman, hal tersebut tidak hanya merusak estetika tetapi juga menurunkan tingkat kepercayaan dan kredibilitas pengguna terhadap layanan tersebut.</w:t>
       </w:r>
     </w:p>
     <w:p>
@@ -1736,7 +1873,68 @@
           <w:szCs w:val="24"/>
           <w:lang w:val="en-US"/>
         </w:rPr>
-        <w:t xml:space="preserve">). Hal ini memastikan bahwa setiap perubahan yang dilakukan dapat terdistribusi secara otomatis dan akurat, sehingga </w:t>
+        <w:t>)</w:t>
+      </w:r>
+      <w:r>
+        <w:rPr>
+          <w:rFonts w:ascii="Times New Roman" w:hAnsi="Times New Roman" w:cs="Times New Roman"/>
+          <w:sz w:val="24"/>
+          <w:szCs w:val="24"/>
+          <w:lang w:val="en-US"/>
+        </w:rPr>
+        <w:t xml:space="preserve"> </w:t>
+      </w:r>
+      <w:r>
+        <w:rPr>
+          <w:rFonts w:ascii="Times New Roman" w:hAnsi="Times New Roman" w:cs="Times New Roman"/>
+          <w:sz w:val="24"/>
+          <w:szCs w:val="24"/>
+          <w:lang w:val="en-US"/>
+        </w:rPr>
+        <w:fldChar w:fldCharType="begin"/>
+      </w:r>
+      <w:r>
+        <w:rPr>
+          <w:rFonts w:ascii="Times New Roman" w:hAnsi="Times New Roman" w:cs="Times New Roman"/>
+          <w:sz w:val="24"/>
+          <w:szCs w:val="24"/>
+          <w:lang w:val="en-US"/>
+        </w:rPr>
+        <w:instrText xml:space="preserve"> ADDIN ZOTERO_ITEM CSL_CITATION {"citationID":"zY0n7cHM","properties":{"unsorted":false,"formattedCitation":"(Matra dkk., 2023)","plainCitation":"(Matra dkk., 2023)","noteIndex":0},"citationItems":[{"id":6,"uris":["http://zotero.org/users/local/Tywae54I/items/CRMQJH63"],"itemData":{"id":6,"type":"article-journal","container-title":"JIPI (Jurnal Ilmiah Penelitian dan Pembelajaran Informatika)","DOI":"10.29100/jipi.v8i2.3502","ISSN":"2540-8984","issue":"2","journalAbbreviation":"jipi. jurnal. ilmiah. penelitian. dan. pembelajaran. informatika.","license":"http://creativecommons.org/licenses/by-sa/4.0","page":"500-513","source":"DOI.org (Crossref)","title":"REDESIGN USER INTERFACE WEBSITE PORTAL MENGGUNAKAN METODE ATOMIC DESIGN (STUDI KASUS : BADAN PENGAWAS OBAT DAN MAKANAN)","title-short":"REDESIGN USER INTERFACE WEBSITE PORTAL MENGGUNAKAN METODE ATOMIC DESIGN (STUDI KASUS","volume":"8","author":[{"family":"Matra","given":"Muhammad Yusuf"},{"family":"Kusumasari","given":"Tien Febrianti"},{"family":"Al-Anshary","given":"Faishal Mufied"}],"issued":{"date-parts":[["2023",5,30]]}}}],"schema":"https://github.com/citation-style-language/schema/raw/master/csl-citation.json"} </w:instrText>
+      </w:r>
+      <w:r>
+        <w:rPr>
+          <w:rFonts w:ascii="Times New Roman" w:hAnsi="Times New Roman" w:cs="Times New Roman"/>
+          <w:sz w:val="24"/>
+          <w:szCs w:val="24"/>
+          <w:lang w:val="en-US"/>
+        </w:rPr>
+        <w:fldChar w:fldCharType="separate"/>
+      </w:r>
+      <w:r>
+        <w:rPr>
+          <w:rFonts w:ascii="Times New Roman" w:hAnsi="Times New Roman" w:cs="Times New Roman"/>
+          <w:sz w:val="24"/>
+        </w:rPr>
+        <w:t>(Matra dkk., 2023)</w:t>
+      </w:r>
+      <w:r>
+        <w:rPr>
+          <w:rFonts w:ascii="Times New Roman" w:hAnsi="Times New Roman" w:cs="Times New Roman"/>
+          <w:sz w:val="24"/>
+          <w:szCs w:val="24"/>
+          <w:lang w:val="en-US"/>
+        </w:rPr>
+        <w:fldChar w:fldCharType="end"/>
+      </w:r>
+      <w:r>
+        <w:rPr>
+          <w:rFonts w:ascii="Times New Roman" w:hAnsi="Times New Roman" w:cs="Times New Roman"/>
+          <w:sz w:val="24"/>
+          <w:szCs w:val="24"/>
+          <w:lang w:val="en-US"/>
+        </w:rPr>
+        <w:t xml:space="preserve">. Hal ini </w:t>
       </w:r>
       <w:r>
         <w:rPr>
@@ -1746,7 +1944,7 @@
           <w:lang w:val="en-US"/>
         </w:rPr>
         <w:lastRenderedPageBreak/>
-        <w:t>menyelaraskan persepsi antara desainer dan pengembang dalam satu bahasa teknis yang sama.</w:t>
+        <w:t>memastikan bahwa setiap perubahan yang dilakukan dapat terdistribusi secara otomatis dan akurat, sehingga menyelaraskan persepsi antara desainer dan pengembang dalam satu bahasa teknis yang sama.</w:t>
       </w:r>
     </w:p>
     <w:p>
@@ -1810,7 +2008,68 @@
           <w:szCs w:val="24"/>
           <w:lang w:val="en-US"/>
         </w:rPr>
-        <w:t xml:space="preserve">2 untuk mengakomodasi kebutuhan skalabilitas modul-modul baru yang semakin kompleks. Ketiadaan </w:t>
+        <w:t>2 untuk mengakomodasi kebutuhan skalabilitas modul-modul baru yang semakin kompleks</w:t>
+      </w:r>
+      <w:r>
+        <w:rPr>
+          <w:rFonts w:ascii="Times New Roman" w:hAnsi="Times New Roman" w:cs="Times New Roman"/>
+          <w:sz w:val="24"/>
+          <w:szCs w:val="24"/>
+          <w:lang w:val="en-US"/>
+        </w:rPr>
+        <w:t xml:space="preserve"> </w:t>
+      </w:r>
+      <w:r>
+        <w:rPr>
+          <w:rFonts w:ascii="Times New Roman" w:hAnsi="Times New Roman" w:cs="Times New Roman"/>
+          <w:sz w:val="24"/>
+          <w:szCs w:val="24"/>
+          <w:lang w:val="en-US"/>
+        </w:rPr>
+        <w:fldChar w:fldCharType="begin"/>
+      </w:r>
+      <w:r>
+        <w:rPr>
+          <w:rFonts w:ascii="Times New Roman" w:hAnsi="Times New Roman" w:cs="Times New Roman"/>
+          <w:sz w:val="24"/>
+          <w:szCs w:val="24"/>
+          <w:lang w:val="en-US"/>
+        </w:rPr>
+        <w:instrText xml:space="preserve"> ADDIN ZOTERO_ITEM CSL_CITATION {"citationID":"cZJgPNbv","properties":{"unsorted":false,"formattedCitation":"(Matra dkk., 2023)","plainCitation":"(Matra dkk., 2023)","noteIndex":0},"citationItems":[{"id":6,"uris":["http://zotero.org/users/local/Tywae54I/items/CRMQJH63"],"itemData":{"id":6,"type":"article-journal","container-title":"JIPI (Jurnal Ilmiah Penelitian dan Pembelajaran Informatika)","DOI":"10.29100/jipi.v8i2.3502","ISSN":"2540-8984","issue":"2","journalAbbreviation":"jipi. jurnal. ilmiah. penelitian. dan. pembelajaran. informatika.","license":"http://creativecommons.org/licenses/by-sa/4.0","page":"500-513","source":"DOI.org (Crossref)","title":"REDESIGN USER INTERFACE WEBSITE PORTAL MENGGUNAKAN METODE ATOMIC DESIGN (STUDI KASUS : BADAN PENGAWAS OBAT DAN MAKANAN)","title-short":"REDESIGN USER INTERFACE WEBSITE PORTAL MENGGUNAKAN METODE ATOMIC DESIGN (STUDI KASUS","volume":"8","author":[{"family":"Matra","given":"Muhammad Yusuf"},{"family":"Kusumasari","given":"Tien Febrianti"},{"family":"Al-Anshary","given":"Faishal Mufied"}],"issued":{"date-parts":[["2023",5,30]]}}}],"schema":"https://github.com/citation-style-language/schema/raw/master/csl-citation.json"} </w:instrText>
+      </w:r>
+      <w:r>
+        <w:rPr>
+          <w:rFonts w:ascii="Times New Roman" w:hAnsi="Times New Roman" w:cs="Times New Roman"/>
+          <w:sz w:val="24"/>
+          <w:szCs w:val="24"/>
+          <w:lang w:val="en-US"/>
+        </w:rPr>
+        <w:fldChar w:fldCharType="separate"/>
+      </w:r>
+      <w:r>
+        <w:rPr>
+          <w:rFonts w:ascii="Times New Roman" w:hAnsi="Times New Roman" w:cs="Times New Roman"/>
+          <w:sz w:val="24"/>
+        </w:rPr>
+        <w:t>(Matra dkk., 2023)</w:t>
+      </w:r>
+      <w:r>
+        <w:rPr>
+          <w:rFonts w:ascii="Times New Roman" w:hAnsi="Times New Roman" w:cs="Times New Roman"/>
+          <w:sz w:val="24"/>
+          <w:szCs w:val="24"/>
+          <w:lang w:val="en-US"/>
+        </w:rPr>
+        <w:fldChar w:fldCharType="end"/>
+      </w:r>
+      <w:r>
+        <w:rPr>
+          <w:rFonts w:ascii="Times New Roman" w:hAnsi="Times New Roman" w:cs="Times New Roman"/>
+          <w:sz w:val="24"/>
+          <w:szCs w:val="24"/>
+          <w:lang w:val="en-US"/>
+        </w:rPr>
+        <w:t xml:space="preserve">. Ketiadaan </w:t>
       </w:r>
       <w:r>
         <w:rPr>
@@ -1950,7 +2209,68 @@
           <w:szCs w:val="24"/>
           <w:lang w:val="en-US"/>
         </w:rPr>
-        <w:t xml:space="preserve"> sebelum masuk ke tahap pengembangan.</w:t>
+        <w:t xml:space="preserve"> sebelum masuk ke tahap pengembangan</w:t>
+      </w:r>
+      <w:r>
+        <w:rPr>
+          <w:rFonts w:ascii="Times New Roman" w:hAnsi="Times New Roman" w:cs="Times New Roman"/>
+          <w:sz w:val="24"/>
+          <w:szCs w:val="24"/>
+          <w:lang w:val="en-US"/>
+        </w:rPr>
+        <w:t xml:space="preserve"> </w:t>
+      </w:r>
+      <w:r>
+        <w:rPr>
+          <w:rFonts w:ascii="Times New Roman" w:hAnsi="Times New Roman" w:cs="Times New Roman"/>
+          <w:sz w:val="24"/>
+          <w:szCs w:val="24"/>
+          <w:lang w:val="en-US"/>
+        </w:rPr>
+        <w:fldChar w:fldCharType="begin"/>
+      </w:r>
+      <w:r>
+        <w:rPr>
+          <w:rFonts w:ascii="Times New Roman" w:hAnsi="Times New Roman" w:cs="Times New Roman"/>
+          <w:sz w:val="24"/>
+          <w:szCs w:val="24"/>
+          <w:lang w:val="en-US"/>
+        </w:rPr>
+        <w:instrText xml:space="preserve"> ADDIN ZOTERO_ITEM CSL_CITATION {"citationID":"FVkJClrj","properties":{"unsorted":false,"formattedCitation":"(Kurniawan, 2024)","plainCitation":"(Kurniawan, 2024)","noteIndex":0},"citationItems":[{"id":12,"uris":["http://zotero.org/users/local/Tywae54I/items/IVASVFB2"],"itemData":{"id":12,"type":"article-journal","abstract":"Kehadiran produk digital telah menjadi bagian integral dari kehidupan sehari-hari manusia. Antarmuka pengguna (UI) memiliki peran sentral dalam menentukan keberhasilan dan adopsi produk. Konsistensi dan koherensi dalam desain UI menjadi kunci untuk memastikan pengguna dapat dengan mudah memahami dan menggunakan produk secara efisien. Meskipun demikian, menciptakan UI yang konsisten, terutama untuk produk digital yang kompleks, merupakan tantangan yang tidak ringan. Oleh karena itu, Design System muncul sebagai solusi inovatif. Dari perspektif pengalaman pengguna, konsistensi dianggap sebagai faktor krusial yang mempengaruhi kemudahan pengguna dalam berinteraksi dengan desain. Penelitian ini bertujuan untuk mengkaji penerapan pendekatan atomic design dan A/B testing dalam pembuatan Design System dengan studi kasus pada perusahaan Asuransi Astra Buana. Diharapkan temuan penelitian ini dapat memberikan kontribusi teoritis dan praktis dalam pengembangan Design System yang efektif dan efisien.","container-title":"Jurnal Teknologi  Dan Sistem Informasi Bisnis","DOI":"10.47233/jteksis.v6i3.1346","ISSN":"2655-8238, 2964-2132","issue":"3","journalAbbreviation":"JTEKSIS","license":"http://creativecommons.org/licenses/by/4.0","page":"543-549","source":"DOI.org (Crossref)","title":"Pembuatan Design System Menggunakan Pendekatan Atomic Design dan A/B Testing","volume":"6","author":[{"family":"Kurniawan","given":"Reyhan Adinata"}],"issued":{"date-parts":[["2024",7,10]]}}}],"schema":"https://github.com/citation-style-language/schema/raw/master/csl-citation.json"} </w:instrText>
+      </w:r>
+      <w:r>
+        <w:rPr>
+          <w:rFonts w:ascii="Times New Roman" w:hAnsi="Times New Roman" w:cs="Times New Roman"/>
+          <w:sz w:val="24"/>
+          <w:szCs w:val="24"/>
+          <w:lang w:val="en-US"/>
+        </w:rPr>
+        <w:fldChar w:fldCharType="separate"/>
+      </w:r>
+      <w:r>
+        <w:rPr>
+          <w:rFonts w:ascii="Times New Roman" w:hAnsi="Times New Roman" w:cs="Times New Roman"/>
+          <w:sz w:val="24"/>
+        </w:rPr>
+        <w:t>(Kurniawan, 2024)</w:t>
+      </w:r>
+      <w:r>
+        <w:rPr>
+          <w:rFonts w:ascii="Times New Roman" w:hAnsi="Times New Roman" w:cs="Times New Roman"/>
+          <w:sz w:val="24"/>
+          <w:szCs w:val="24"/>
+          <w:lang w:val="en-US"/>
+        </w:rPr>
+        <w:fldChar w:fldCharType="end"/>
+      </w:r>
+      <w:r>
+        <w:rPr>
+          <w:rFonts w:ascii="Times New Roman" w:hAnsi="Times New Roman" w:cs="Times New Roman"/>
+          <w:sz w:val="24"/>
+          <w:szCs w:val="24"/>
+          <w:lang w:val="en-US"/>
+        </w:rPr>
+        <w:t>.</w:t>
       </w:r>
     </w:p>
     <w:p>
@@ -2075,28 +2395,18 @@
     </w:p>
     <w:p>
       <w:pPr>
-        <w:pStyle w:val="ListParagraph"/>
+        <w:pStyle w:val="Heading2"/>
         <w:numPr>
           <w:ilvl w:val="0"/>
-          <w:numId w:val="6"/>
+          <w:numId w:val="19"/>
         </w:numPr>
-        <w:spacing w:after="120" w:line="360" w:lineRule="auto"/>
         <w:ind w:left="540" w:hanging="540"/>
-        <w:jc w:val="both"/>
-        <w:rPr>
-          <w:rFonts w:ascii="Times New Roman" w:hAnsi="Times New Roman" w:cs="Times New Roman"/>
-          <w:sz w:val="24"/>
-          <w:szCs w:val="24"/>
-          <w:lang w:val="en-US"/>
-        </w:rPr>
-      </w:pPr>
-      <w:r>
-        <w:rPr>
-          <w:rFonts w:ascii="Times New Roman" w:hAnsi="Times New Roman" w:cs="Times New Roman"/>
-          <w:b/>
-          <w:bCs/>
-          <w:sz w:val="24"/>
-          <w:szCs w:val="24"/>
+        <w:rPr>
+          <w:lang w:val="en-US"/>
+        </w:rPr>
+      </w:pPr>
+      <w:r>
+        <w:rPr>
           <w:lang w:val="en-US"/>
         </w:rPr>
         <w:t>Perumusan Masalah</w:t>
@@ -2348,30 +2658,18 @@
     </w:p>
     <w:p>
       <w:pPr>
-        <w:pStyle w:val="ListParagraph"/>
+        <w:pStyle w:val="Heading2"/>
         <w:numPr>
           <w:ilvl w:val="0"/>
-          <w:numId w:val="12"/>
+          <w:numId w:val="19"/>
         </w:numPr>
-        <w:spacing w:after="120" w:line="360" w:lineRule="auto"/>
         <w:ind w:left="540" w:hanging="540"/>
-        <w:jc w:val="both"/>
-        <w:rPr>
-          <w:rFonts w:ascii="Times New Roman" w:hAnsi="Times New Roman" w:cs="Times New Roman"/>
-          <w:b/>
-          <w:bCs/>
-          <w:sz w:val="24"/>
-          <w:szCs w:val="24"/>
-          <w:lang w:val="en-US"/>
-        </w:rPr>
-      </w:pPr>
-      <w:r>
-        <w:rPr>
-          <w:rFonts w:ascii="Times New Roman" w:hAnsi="Times New Roman" w:cs="Times New Roman"/>
-          <w:b/>
-          <w:bCs/>
-          <w:sz w:val="24"/>
-          <w:szCs w:val="24"/>
+        <w:rPr>
+          <w:lang w:val="en-US"/>
+        </w:rPr>
+      </w:pPr>
+      <w:r>
+        <w:rPr>
           <w:lang w:val="en-US"/>
         </w:rPr>
         <w:t>Batasan Masalah</w:t>
@@ -2424,7 +2722,6 @@
           <w:szCs w:val="24"/>
           <w:lang w:val="en-US"/>
         </w:rPr>
-        <w:lastRenderedPageBreak/>
         <w:t xml:space="preserve">Lingkup pekerjaan berfokus pada migrasi elemen visual dan implementasi komponen dari </w:t>
       </w:r>
       <w:r>
@@ -2488,22 +2785,31 @@
       <w:r>
         <w:rPr>
           <w:rFonts w:ascii="Times New Roman" w:hAnsi="Times New Roman" w:cs="Times New Roman"/>
+          <w:sz w:val="24"/>
+          <w:szCs w:val="24"/>
+          <w:lang w:val="en-US"/>
+        </w:rPr>
+        <w:t xml:space="preserve">Lingkup penelitian dibatasi hingga tahap pembuatan </w:t>
+      </w:r>
+      <w:r>
+        <w:rPr>
+          <w:rFonts w:ascii="Times New Roman" w:hAnsi="Times New Roman" w:cs="Times New Roman"/>
           <w:i/>
           <w:iCs/>
           <w:sz w:val="24"/>
           <w:szCs w:val="24"/>
           <w:lang w:val="en-US"/>
         </w:rPr>
-        <w:t>Output</w:t>
-      </w:r>
-      <w:r>
-        <w:rPr>
-          <w:rFonts w:ascii="Times New Roman" w:hAnsi="Times New Roman" w:cs="Times New Roman"/>
-          <w:sz w:val="24"/>
-          <w:szCs w:val="24"/>
-          <w:lang w:val="en-US"/>
-        </w:rPr>
-        <w:t xml:space="preserve"> akhir dari laporan ini adalah </w:t>
+        <w:t>High-Fidelity Prototype</w:t>
+      </w:r>
+      <w:r>
+        <w:rPr>
+          <w:rFonts w:ascii="Times New Roman" w:hAnsi="Times New Roman" w:cs="Times New Roman"/>
+          <w:sz w:val="24"/>
+          <w:szCs w:val="24"/>
+          <w:lang w:val="en-US"/>
+        </w:rPr>
+        <w:t xml:space="preserve"> yang interaktif menggunakan Figma, serta tidak mencakup tahap implementasi ke dalam bahasa pemrograman (</w:t>
       </w:r>
       <w:r>
         <w:rPr>
@@ -2514,16 +2820,16 @@
           <w:szCs w:val="24"/>
           <w:lang w:val="en-US"/>
         </w:rPr>
-        <w:t>High</w:t>
-      </w:r>
-      <w:r>
-        <w:rPr>
-          <w:rFonts w:ascii="Times New Roman" w:hAnsi="Times New Roman" w:cs="Times New Roman"/>
-          <w:sz w:val="24"/>
-          <w:szCs w:val="24"/>
-          <w:lang w:val="en-US"/>
-        </w:rPr>
-        <w:t>-</w:t>
+        <w:t>coding</w:t>
+      </w:r>
+      <w:r>
+        <w:rPr>
+          <w:rFonts w:ascii="Times New Roman" w:hAnsi="Times New Roman" w:cs="Times New Roman"/>
+          <w:sz w:val="24"/>
+          <w:szCs w:val="24"/>
+          <w:lang w:val="en-US"/>
+        </w:rPr>
+        <w:t>) maupun pengujian pengguna (</w:t>
       </w:r>
       <w:r>
         <w:rPr>
@@ -2534,56 +2840,16 @@
           <w:szCs w:val="24"/>
           <w:lang w:val="en-US"/>
         </w:rPr>
-        <w:t>Fidelity</w:t>
-      </w:r>
-      <w:r>
-        <w:rPr>
-          <w:rFonts w:ascii="Times New Roman" w:hAnsi="Times New Roman" w:cs="Times New Roman"/>
-          <w:sz w:val="24"/>
-          <w:szCs w:val="24"/>
-          <w:lang w:val="en-US"/>
-        </w:rPr>
-        <w:t xml:space="preserve"> </w:t>
-      </w:r>
-      <w:r>
-        <w:rPr>
-          <w:rFonts w:ascii="Times New Roman" w:hAnsi="Times New Roman" w:cs="Times New Roman"/>
-          <w:i/>
-          <w:iCs/>
-          <w:sz w:val="24"/>
-          <w:szCs w:val="24"/>
-          <w:lang w:val="en-US"/>
-        </w:rPr>
-        <w:t>Prototype</w:t>
-      </w:r>
-      <w:r>
-        <w:rPr>
-          <w:rFonts w:ascii="Times New Roman" w:hAnsi="Times New Roman" w:cs="Times New Roman"/>
-          <w:sz w:val="24"/>
-          <w:szCs w:val="24"/>
-          <w:lang w:val="en-US"/>
-        </w:rPr>
-        <w:t xml:space="preserve"> yang interaktif, tidak mencakup tahap implementasi ke dalam bahasa pemrograman (</w:t>
-      </w:r>
-      <w:r>
-        <w:rPr>
-          <w:rFonts w:ascii="Times New Roman" w:hAnsi="Times New Roman" w:cs="Times New Roman"/>
-          <w:i/>
-          <w:iCs/>
-          <w:sz w:val="24"/>
-          <w:szCs w:val="24"/>
-          <w:lang w:val="en-US"/>
-        </w:rPr>
-        <w:t>coding</w:t>
-      </w:r>
-      <w:r>
-        <w:rPr>
-          <w:rFonts w:ascii="Times New Roman" w:hAnsi="Times New Roman" w:cs="Times New Roman"/>
-          <w:sz w:val="24"/>
-          <w:szCs w:val="24"/>
-          <w:lang w:val="en-US"/>
-        </w:rPr>
-        <w:t>).</w:t>
+        <w:t>usability testing</w:t>
+      </w:r>
+      <w:r>
+        <w:rPr>
+          <w:rFonts w:ascii="Times New Roman" w:hAnsi="Times New Roman" w:cs="Times New Roman"/>
+          <w:sz w:val="24"/>
+          <w:szCs w:val="24"/>
+          <w:lang w:val="en-US"/>
+        </w:rPr>
+        <w:t>) skala luas.</w:t>
       </w:r>
     </w:p>
     <w:p>
@@ -2648,33 +2914,33 @@
     </w:p>
     <w:p>
       <w:pPr>
-        <w:pStyle w:val="ListParagraph"/>
+        <w:pStyle w:val="Heading2"/>
         <w:numPr>
           <w:ilvl w:val="0"/>
-          <w:numId w:val="12"/>
+          <w:numId w:val="19"/>
         </w:numPr>
-        <w:spacing w:after="120" w:line="360" w:lineRule="auto"/>
         <w:ind w:left="540" w:hanging="540"/>
-        <w:jc w:val="both"/>
-        <w:rPr>
-          <w:rFonts w:ascii="Times New Roman" w:hAnsi="Times New Roman" w:cs="Times New Roman"/>
-          <w:b/>
-          <w:bCs/>
-          <w:sz w:val="24"/>
-          <w:szCs w:val="24"/>
-          <w:lang w:val="en-US"/>
-        </w:rPr>
-      </w:pPr>
-      <w:r>
-        <w:rPr>
-          <w:rFonts w:ascii="Times New Roman" w:hAnsi="Times New Roman" w:cs="Times New Roman"/>
-          <w:b/>
-          <w:bCs/>
-          <w:sz w:val="24"/>
-          <w:szCs w:val="24"/>
-          <w:lang w:val="en-US"/>
-        </w:rPr>
-        <w:t>Waktu dan Tempat Pelaksanaan Kerja Praktek</w:t>
+        <w:rPr>
+          <w:lang w:val="en-US"/>
+        </w:rPr>
+      </w:pPr>
+      <w:r>
+        <w:rPr>
+          <w:lang w:val="en-US"/>
+        </w:rPr>
+        <w:t>Waktu dan Tempat Pelaksanaan Kerja Prakt</w:t>
+      </w:r>
+      <w:r>
+        <w:rPr>
+          <w:lang w:val="en-US"/>
+        </w:rPr>
+        <w:t>i</w:t>
+      </w:r>
+      <w:r>
+        <w:rPr>
+          <w:lang w:val="en-US"/>
+        </w:rPr>
+        <w:t>k</w:t>
       </w:r>
     </w:p>
     <w:p>
@@ -2697,7 +2963,25 @@
           <w:szCs w:val="24"/>
           <w:lang w:val="en-US"/>
         </w:rPr>
-        <w:t>Kegiatan Kerja Praktek ini dilaksanakan pada:</w:t>
+        <w:t>Kegiatan Kerja Prakt</w:t>
+      </w:r>
+      <w:r>
+        <w:rPr>
+          <w:rFonts w:ascii="Times New Roman" w:hAnsi="Times New Roman" w:cs="Times New Roman"/>
+          <w:sz w:val="24"/>
+          <w:szCs w:val="24"/>
+          <w:lang w:val="en-US"/>
+        </w:rPr>
+        <w:t>i</w:t>
+      </w:r>
+      <w:r>
+        <w:rPr>
+          <w:rFonts w:ascii="Times New Roman" w:hAnsi="Times New Roman" w:cs="Times New Roman"/>
+          <w:sz w:val="24"/>
+          <w:szCs w:val="24"/>
+          <w:lang w:val="en-US"/>
+        </w:rPr>
+        <w:t>k ini dilaksanakan pada:</w:t>
       </w:r>
     </w:p>
     <w:tbl>
@@ -3132,30 +3416,18 @@
     </w:tbl>
     <w:p>
       <w:pPr>
-        <w:pStyle w:val="ListParagraph"/>
+        <w:pStyle w:val="Heading2"/>
         <w:numPr>
-          <w:ilvl w:val="1"/>
-          <w:numId w:val="21"/>
+          <w:ilvl w:val="0"/>
+          <w:numId w:val="19"/>
         </w:numPr>
-        <w:spacing w:after="120" w:line="360" w:lineRule="auto"/>
         <w:ind w:left="540" w:hanging="540"/>
-        <w:jc w:val="both"/>
-        <w:rPr>
-          <w:rFonts w:ascii="Times New Roman" w:hAnsi="Times New Roman" w:cs="Times New Roman"/>
-          <w:b/>
-          <w:bCs/>
-          <w:sz w:val="24"/>
-          <w:szCs w:val="24"/>
-          <w:lang w:val="en-US"/>
-        </w:rPr>
-      </w:pPr>
-      <w:r>
-        <w:rPr>
-          <w:rFonts w:ascii="Times New Roman" w:hAnsi="Times New Roman" w:cs="Times New Roman"/>
-          <w:b/>
-          <w:bCs/>
-          <w:sz w:val="24"/>
-          <w:szCs w:val="24"/>
+        <w:rPr>
+          <w:lang w:val="en-US"/>
+        </w:rPr>
+      </w:pPr>
+      <w:r>
+        <w:rPr>
           <w:lang w:val="en-US"/>
         </w:rPr>
         <w:t>Tujuan dan Manfaat</w:t>
@@ -3424,25 +3696,7 @@
           <w:szCs w:val="24"/>
           <w:lang w:val="en-US"/>
         </w:rPr>
-        <w:t>Mempercepat siklus pengerjaan desain produk melal</w:t>
-      </w:r>
-      <w:r>
-        <w:rPr>
-          <w:rFonts w:ascii="Times New Roman" w:hAnsi="Times New Roman" w:cs="Times New Roman"/>
-          <w:sz w:val="24"/>
-          <w:szCs w:val="24"/>
-          <w:lang w:val="en-US"/>
-        </w:rPr>
-        <w:t>ui</w:t>
-      </w:r>
-      <w:r>
-        <w:rPr>
-          <w:rFonts w:ascii="Times New Roman" w:hAnsi="Times New Roman" w:cs="Times New Roman"/>
-          <w:sz w:val="24"/>
-          <w:szCs w:val="24"/>
-          <w:lang w:val="en-US"/>
-        </w:rPr>
-        <w:t xml:space="preserve"> penggunaan komponen yang </w:t>
+        <w:t xml:space="preserve">Menghasilkan halaman-halaman yang telah terimplementasi dengan </w:t>
       </w:r>
       <w:r>
         <w:rPr>
@@ -3453,7 +3707,57 @@
           <w:szCs w:val="24"/>
           <w:lang w:val="en-US"/>
         </w:rPr>
-        <w:t>reusable</w:t>
+        <w:t>component</w:t>
+      </w:r>
+      <w:r>
+        <w:rPr>
+          <w:rFonts w:ascii="Times New Roman" w:hAnsi="Times New Roman" w:cs="Times New Roman"/>
+          <w:sz w:val="24"/>
+          <w:szCs w:val="24"/>
+          <w:lang w:val="en-US"/>
+        </w:rPr>
+        <w:t xml:space="preserve"> resmi </w:t>
+      </w:r>
+      <w:r>
+        <w:rPr>
+          <w:rFonts w:ascii="Times New Roman" w:hAnsi="Times New Roman" w:cs="Times New Roman"/>
+          <w:i/>
+          <w:iCs/>
+          <w:sz w:val="24"/>
+          <w:szCs w:val="24"/>
+          <w:lang w:val="en-US"/>
+        </w:rPr>
+        <w:t>Design System V2</w:t>
+      </w:r>
+      <w:r>
+        <w:rPr>
+          <w:rFonts w:ascii="Times New Roman" w:hAnsi="Times New Roman" w:cs="Times New Roman"/>
+          <w:sz w:val="24"/>
+          <w:szCs w:val="24"/>
+          <w:lang w:val="en-US"/>
+        </w:rPr>
+        <w:t xml:space="preserve">, sehingga siap </w:t>
+      </w:r>
+      <w:r>
+        <w:rPr>
+          <w:rFonts w:ascii="Times New Roman" w:hAnsi="Times New Roman" w:cs="Times New Roman"/>
+          <w:sz w:val="24"/>
+          <w:szCs w:val="24"/>
+          <w:lang w:val="en-US"/>
+        </w:rPr>
+        <w:lastRenderedPageBreak/>
+        <w:t xml:space="preserve">digunakan sebagai basis data yang akurat untuk proses otomatisasi </w:t>
+      </w:r>
+      <w:r>
+        <w:rPr>
+          <w:rFonts w:ascii="Times New Roman" w:hAnsi="Times New Roman" w:cs="Times New Roman"/>
+          <w:i/>
+          <w:iCs/>
+          <w:sz w:val="24"/>
+          <w:szCs w:val="24"/>
+          <w:lang w:val="en-US"/>
+        </w:rPr>
+        <w:t>prototype</w:t>
       </w:r>
       <w:r>
         <w:rPr>
@@ -3516,7 +3820,6 @@
           <w:szCs w:val="24"/>
           <w:lang w:val="en-US"/>
         </w:rPr>
-        <w:lastRenderedPageBreak/>
         <w:t>Bagi Penulis:</w:t>
       </w:r>
     </w:p>
@@ -3738,28 +4041,18 @@
     </w:p>
     <w:p>
       <w:pPr>
-        <w:pStyle w:val="ListParagraph"/>
+        <w:pStyle w:val="Heading2"/>
         <w:numPr>
           <w:ilvl w:val="0"/>
-          <w:numId w:val="15"/>
+          <w:numId w:val="19"/>
         </w:numPr>
-        <w:spacing w:after="120" w:line="360" w:lineRule="auto"/>
         <w:ind w:left="540" w:hanging="540"/>
-        <w:jc w:val="both"/>
-        <w:rPr>
-          <w:rFonts w:ascii="Times New Roman" w:hAnsi="Times New Roman" w:cs="Times New Roman"/>
-          <w:sz w:val="24"/>
-          <w:szCs w:val="24"/>
-          <w:lang w:val="en-US"/>
-        </w:rPr>
-      </w:pPr>
-      <w:r>
-        <w:rPr>
-          <w:rFonts w:ascii="Times New Roman" w:hAnsi="Times New Roman" w:cs="Times New Roman"/>
-          <w:b/>
-          <w:bCs/>
-          <w:sz w:val="24"/>
-          <w:szCs w:val="24"/>
+        <w:rPr>
+          <w:lang w:val="en-US"/>
+        </w:rPr>
+      </w:pPr>
+      <w:r>
+        <w:rPr>
           <w:lang w:val="en-US"/>
         </w:rPr>
         <w:t>Sistematika Penulisan</w:t>
@@ -3785,7 +4078,25 @@
           <w:szCs w:val="24"/>
           <w:lang w:val="en-US"/>
         </w:rPr>
-        <w:t>Laporan Kerja Praktek ini disusun secara sistematis agar memberikan gambaran yang jelas mengenai proses dan hasil pekerjaan yang dilakukan. Berikut adalah sistematika pembahasannya:</w:t>
+        <w:t>Laporan Kerja Prakt</w:t>
+      </w:r>
+      <w:r>
+        <w:rPr>
+          <w:rFonts w:ascii="Times New Roman" w:hAnsi="Times New Roman" w:cs="Times New Roman"/>
+          <w:sz w:val="24"/>
+          <w:szCs w:val="24"/>
+          <w:lang w:val="en-US"/>
+        </w:rPr>
+        <w:t>i</w:t>
+      </w:r>
+      <w:r>
+        <w:rPr>
+          <w:rFonts w:ascii="Times New Roman" w:hAnsi="Times New Roman" w:cs="Times New Roman"/>
+          <w:sz w:val="24"/>
+          <w:szCs w:val="24"/>
+          <w:lang w:val="en-US"/>
+        </w:rPr>
+        <w:t>k ini disusun secara sistematis agar memberikan gambaran yang jelas mengenai proses dan hasil pekerjaan yang dilakukan. Berikut adalah sistematika pembahasannya:</w:t>
       </w:r>
     </w:p>
     <w:p>
@@ -4034,7 +4345,29 @@
           <w:lang w:val="en-US"/>
         </w:rPr>
         <w:tab/>
-        <w:t>HASIL KEGIATAN KERJA PRAKTEK</w:t>
+        <w:t>HASIL KEGIATAN KERJA PRAKT</w:t>
+      </w:r>
+      <w:r>
+        <w:rPr>
+          <w:rFonts w:ascii="Times New Roman" w:hAnsi="Times New Roman" w:cs="Times New Roman"/>
+          <w:b/>
+          <w:bCs/>
+          <w:sz w:val="24"/>
+          <w:szCs w:val="24"/>
+          <w:lang w:val="en-US"/>
+        </w:rPr>
+        <w:t>I</w:t>
+      </w:r>
+      <w:r>
+        <w:rPr>
+          <w:rFonts w:ascii="Times New Roman" w:hAnsi="Times New Roman" w:cs="Times New Roman"/>
+          <w:b/>
+          <w:bCs/>
+          <w:sz w:val="24"/>
+          <w:szCs w:val="24"/>
+          <w:lang w:val="en-US"/>
+        </w:rPr>
+        <w:t>K</w:t>
       </w:r>
     </w:p>
     <w:p>
@@ -4057,7 +4390,34 @@
           <w:szCs w:val="24"/>
           <w:lang w:val="en-US"/>
         </w:rPr>
-        <w:t>Merupakan bab inti yang memaparkan rincian Waktu Pelaksanaan, Bidang Kegiatan Kerja Praktek (</w:t>
+        <w:t xml:space="preserve">Merupakan bab inti yang memaparkan rincian Waktu Pelaksanaan, Bidang Kegiatan Kerja </w:t>
+      </w:r>
+      <w:r>
+        <w:rPr>
+          <w:rFonts w:ascii="Times New Roman" w:hAnsi="Times New Roman" w:cs="Times New Roman"/>
+          <w:sz w:val="24"/>
+          <w:szCs w:val="24"/>
+          <w:lang w:val="en-US"/>
+        </w:rPr>
+        <w:t>Prakt</w:t>
+      </w:r>
+      <w:r>
+        <w:rPr>
+          <w:rFonts w:ascii="Times New Roman" w:hAnsi="Times New Roman" w:cs="Times New Roman"/>
+          <w:sz w:val="24"/>
+          <w:szCs w:val="24"/>
+          <w:lang w:val="en-US"/>
+        </w:rPr>
+        <w:t>i</w:t>
+      </w:r>
+      <w:r>
+        <w:rPr>
+          <w:rFonts w:ascii="Times New Roman" w:hAnsi="Times New Roman" w:cs="Times New Roman"/>
+          <w:sz w:val="24"/>
+          <w:szCs w:val="24"/>
+          <w:lang w:val="en-US"/>
+        </w:rPr>
+        <w:t>k (</w:t>
       </w:r>
       <w:r>
         <w:rPr>
@@ -4150,7 +4510,17 @@
           <w:szCs w:val="24"/>
           <w:lang w:val="en-US"/>
         </w:rPr>
-        <w:t xml:space="preserve">, serta rincian Tugas dan Tanggung Jawab penulis dalam mengimplementasikan </w:t>
+        <w:t xml:space="preserve">, serta rincian Tugas dan Tanggung Jawab penulis dalam </w:t>
+      </w:r>
+      <w:r>
+        <w:rPr>
+          <w:rFonts w:ascii="Times New Roman" w:hAnsi="Times New Roman" w:cs="Times New Roman"/>
+          <w:sz w:val="24"/>
+          <w:szCs w:val="24"/>
+          <w:lang w:val="en-US"/>
+        </w:rPr>
+        <w:lastRenderedPageBreak/>
+        <w:t xml:space="preserve">mengimplementasikan </w:t>
       </w:r>
       <w:r>
         <w:rPr>
@@ -4256,17 +4626,241 @@
           <w:szCs w:val="24"/>
           <w:lang w:val="en-US"/>
         </w:rPr>
-        <w:t xml:space="preserve">Berisi Kesimpulan yang ditarik dari seluruh kegiatan kerja praktek serta Saran-saran yang relevan baik bagi perusahaan </w:t>
-      </w:r>
-      <w:r>
-        <w:rPr>
-          <w:rFonts w:ascii="Times New Roman" w:hAnsi="Times New Roman" w:cs="Times New Roman"/>
-          <w:sz w:val="24"/>
-          <w:szCs w:val="24"/>
+        <w:t>Berisi Kesimpulan yang ditarik dari seluruh kegiatan kerja prakt</w:t>
+      </w:r>
+      <w:r>
+        <w:rPr>
+          <w:rFonts w:ascii="Times New Roman" w:hAnsi="Times New Roman" w:cs="Times New Roman"/>
+          <w:sz w:val="24"/>
+          <w:szCs w:val="24"/>
+          <w:lang w:val="en-US"/>
+        </w:rPr>
+        <w:t>i</w:t>
+      </w:r>
+      <w:r>
+        <w:rPr>
+          <w:rFonts w:ascii="Times New Roman" w:hAnsi="Times New Roman" w:cs="Times New Roman"/>
+          <w:sz w:val="24"/>
+          <w:szCs w:val="24"/>
+          <w:lang w:val="en-US"/>
+        </w:rPr>
+        <w:t>k serta Saran-saran yang relevan baik bagi perusahaan (terkait pengembangan platform Reusely) maupun bagi institusi pendidikan.</w:t>
+      </w:r>
+    </w:p>
+    <w:p>
+      <w:pPr>
+        <w:rPr>
+          <w:rFonts w:ascii="Times New Roman" w:hAnsi="Times New Roman" w:cs="Times New Roman"/>
+          <w:sz w:val="24"/>
+          <w:szCs w:val="24"/>
+          <w:lang w:val="en-US"/>
+        </w:rPr>
+      </w:pPr>
+      <w:r>
+        <w:rPr>
+          <w:rFonts w:ascii="Times New Roman" w:hAnsi="Times New Roman" w:cs="Times New Roman"/>
+          <w:sz w:val="24"/>
+          <w:szCs w:val="24"/>
+          <w:lang w:val="en-US"/>
+        </w:rPr>
+        <w:br w:type="page"/>
+      </w:r>
+    </w:p>
+    <w:p>
+      <w:pPr>
+        <w:pStyle w:val="Heading1"/>
+        <w:rPr>
+          <w:lang w:val="en-US"/>
+        </w:rPr>
+      </w:pPr>
+      <w:r>
+        <w:rPr>
           <w:lang w:val="en-US"/>
         </w:rPr>
         <w:lastRenderedPageBreak/>
-        <w:t>(terkait pengembangan platform Reusely) maupun bagi institusi pendidikan.</w:t>
+        <w:t>DAFTAR PUSTAKA</w:t>
+      </w:r>
+    </w:p>
+    <w:p>
+      <w:pPr>
+        <w:pStyle w:val="Bibliography"/>
+        <w:jc w:val="both"/>
+        <w:rPr>
+          <w:rFonts w:ascii="Times New Roman" w:hAnsi="Times New Roman" w:cs="Times New Roman"/>
+          <w:sz w:val="24"/>
+          <w:szCs w:val="24"/>
+        </w:rPr>
+      </w:pPr>
+      <w:r>
+        <w:rPr>
+          <w:lang w:val="en-US"/>
+        </w:rPr>
+        <w:fldChar w:fldCharType="begin"/>
+      </w:r>
+      <w:r>
+        <w:rPr>
+          <w:lang w:val="en-US"/>
+        </w:rPr>
+        <w:instrText xml:space="preserve"> ADDIN ZOTERO_BIBL {"uncited":[],"omitted":[],"custom":[]} CSL_BIBLIOGRAPHY </w:instrText>
+      </w:r>
+      <w:r>
+        <w:rPr>
+          <w:lang w:val="en-US"/>
+        </w:rPr>
+        <w:fldChar w:fldCharType="separate"/>
+      </w:r>
+      <w:r>
+        <w:rPr>
+          <w:rFonts w:ascii="Times New Roman" w:hAnsi="Times New Roman" w:cs="Times New Roman"/>
+          <w:sz w:val="24"/>
+          <w:szCs w:val="24"/>
+        </w:rPr>
+        <w:t xml:space="preserve">Kurniawan, R. A. (2024). Pembuatan Design System Menggunakan Pendekatan Atomic Design dan A/B Testing. </w:t>
+      </w:r>
+      <w:r>
+        <w:rPr>
+          <w:rFonts w:ascii="Times New Roman" w:hAnsi="Times New Roman" w:cs="Times New Roman"/>
+          <w:i/>
+          <w:iCs/>
+          <w:sz w:val="24"/>
+          <w:szCs w:val="24"/>
+        </w:rPr>
+        <w:t>Jurnal Teknologi  Dan Sistem Informasi Bisnis</w:t>
+      </w:r>
+      <w:r>
+        <w:rPr>
+          <w:rFonts w:ascii="Times New Roman" w:hAnsi="Times New Roman" w:cs="Times New Roman"/>
+          <w:sz w:val="24"/>
+          <w:szCs w:val="24"/>
+        </w:rPr>
+        <w:t xml:space="preserve">, </w:t>
+      </w:r>
+      <w:r>
+        <w:rPr>
+          <w:rFonts w:ascii="Times New Roman" w:hAnsi="Times New Roman" w:cs="Times New Roman"/>
+          <w:i/>
+          <w:iCs/>
+          <w:sz w:val="24"/>
+          <w:szCs w:val="24"/>
+        </w:rPr>
+        <w:t>6</w:t>
+      </w:r>
+      <w:r>
+        <w:rPr>
+          <w:rFonts w:ascii="Times New Roman" w:hAnsi="Times New Roman" w:cs="Times New Roman"/>
+          <w:sz w:val="24"/>
+          <w:szCs w:val="24"/>
+        </w:rPr>
+        <w:t>(3), 543–549. https://doi.org/10.47233/jteksis.v6i3.1346</w:t>
+      </w:r>
+    </w:p>
+    <w:p>
+      <w:pPr>
+        <w:pStyle w:val="Bibliography"/>
+        <w:jc w:val="both"/>
+        <w:rPr>
+          <w:rFonts w:ascii="Times New Roman" w:hAnsi="Times New Roman" w:cs="Times New Roman"/>
+          <w:sz w:val="24"/>
+          <w:szCs w:val="24"/>
+        </w:rPr>
+      </w:pPr>
+      <w:r>
+        <w:rPr>
+          <w:rFonts w:ascii="Times New Roman" w:hAnsi="Times New Roman" w:cs="Times New Roman"/>
+          <w:sz w:val="24"/>
+          <w:szCs w:val="24"/>
+        </w:rPr>
+        <w:t xml:space="preserve">Matra, M. Y., Kusumasari, T. F., &amp; Al-Anshary, F. M. (2023). REDESIGN USER INTERFACE WEBSITE PORTAL MENGGUNAKAN METODE ATOMIC DESIGN (STUDI KASUS: BADAN PENGAWAS OBAT DAN MAKANAN). </w:t>
+      </w:r>
+      <w:r>
+        <w:rPr>
+          <w:rFonts w:ascii="Times New Roman" w:hAnsi="Times New Roman" w:cs="Times New Roman"/>
+          <w:i/>
+          <w:iCs/>
+          <w:sz w:val="24"/>
+          <w:szCs w:val="24"/>
+        </w:rPr>
+        <w:t>JIPI (Jurnal Ilmiah Penelitian dan Pembelajaran Informatika)</w:t>
+      </w:r>
+      <w:r>
+        <w:rPr>
+          <w:rFonts w:ascii="Times New Roman" w:hAnsi="Times New Roman" w:cs="Times New Roman"/>
+          <w:sz w:val="24"/>
+          <w:szCs w:val="24"/>
+        </w:rPr>
+        <w:t xml:space="preserve">, </w:t>
+      </w:r>
+      <w:r>
+        <w:rPr>
+          <w:rFonts w:ascii="Times New Roman" w:hAnsi="Times New Roman" w:cs="Times New Roman"/>
+          <w:i/>
+          <w:iCs/>
+          <w:sz w:val="24"/>
+          <w:szCs w:val="24"/>
+        </w:rPr>
+        <w:t>8</w:t>
+      </w:r>
+      <w:r>
+        <w:rPr>
+          <w:rFonts w:ascii="Times New Roman" w:hAnsi="Times New Roman" w:cs="Times New Roman"/>
+          <w:sz w:val="24"/>
+          <w:szCs w:val="24"/>
+        </w:rPr>
+        <w:t>(2), 500–513. https://doi.org/10.29100/jipi.v8i2.3502</w:t>
+      </w:r>
+    </w:p>
+    <w:p>
+      <w:pPr>
+        <w:pStyle w:val="Bibliography"/>
+        <w:jc w:val="both"/>
+      </w:pPr>
+      <w:r>
+        <w:rPr>
+          <w:rFonts w:ascii="Times New Roman" w:hAnsi="Times New Roman" w:cs="Times New Roman"/>
+          <w:sz w:val="24"/>
+          <w:szCs w:val="24"/>
+        </w:rPr>
+        <w:t xml:space="preserve">Yablonski, J. (2020). </w:t>
+      </w:r>
+      <w:r>
+        <w:rPr>
+          <w:rFonts w:ascii="Times New Roman" w:hAnsi="Times New Roman" w:cs="Times New Roman"/>
+          <w:i/>
+          <w:iCs/>
+          <w:sz w:val="24"/>
+          <w:szCs w:val="24"/>
+        </w:rPr>
+        <w:t>Laws of UX: Using psychology to design better products &amp; services</w:t>
+      </w:r>
+      <w:r>
+        <w:rPr>
+          <w:rFonts w:ascii="Times New Roman" w:hAnsi="Times New Roman" w:cs="Times New Roman"/>
+          <w:sz w:val="24"/>
+          <w:szCs w:val="24"/>
+        </w:rPr>
+        <w:t>. O´Reilly.</w:t>
+      </w:r>
+    </w:p>
+    <w:p>
+      <w:pPr>
+        <w:spacing w:after="120" w:line="360" w:lineRule="auto"/>
+        <w:ind w:left="540" w:hanging="540"/>
+        <w:jc w:val="both"/>
+        <w:rPr>
+          <w:rFonts w:ascii="Times New Roman" w:hAnsi="Times New Roman" w:cs="Times New Roman"/>
+          <w:sz w:val="24"/>
+          <w:szCs w:val="24"/>
+          <w:lang w:val="en-US"/>
+        </w:rPr>
+      </w:pPr>
+      <w:r>
+        <w:rPr>
+          <w:rFonts w:ascii="Times New Roman" w:hAnsi="Times New Roman" w:cs="Times New Roman"/>
+          <w:sz w:val="24"/>
+          <w:szCs w:val="24"/>
+          <w:lang w:val="en-US"/>
+        </w:rPr>
+        <w:fldChar w:fldCharType="end"/>
       </w:r>
     </w:p>
     <w:sectPr>
@@ -4548,6 +5142,95 @@
     </w:lvl>
   </w:abstractNum>
   <w:abstractNum w:abstractNumId="3" w15:restartNumberingAfterBreak="0">
+    <w:nsid w:val="0DD9630E"/>
+    <w:multiLevelType w:val="hybridMultilevel"/>
+    <w:tmpl w:val="BD2CBE86"/>
+    <w:lvl w:ilvl="0" w:tplc="39002586">
+      <w:start w:val="1"/>
+      <w:numFmt w:val="decimal"/>
+      <w:lvlText w:val="1.%1"/>
+      <w:lvlJc w:val="left"/>
+      <w:pPr>
+        <w:ind w:left="720" w:hanging="360"/>
+      </w:pPr>
+      <w:rPr>
+        <w:rFonts w:hint="default"/>
+      </w:rPr>
+    </w:lvl>
+    <w:lvl w:ilvl="1" w:tplc="04090019" w:tentative="1">
+      <w:start w:val="1"/>
+      <w:numFmt w:val="lowerLetter"/>
+      <w:lvlText w:val="%2."/>
+      <w:lvlJc w:val="left"/>
+      <w:pPr>
+        <w:ind w:left="1440" w:hanging="360"/>
+      </w:pPr>
+    </w:lvl>
+    <w:lvl w:ilvl="2" w:tplc="0409001B" w:tentative="1">
+      <w:start w:val="1"/>
+      <w:numFmt w:val="lowerRoman"/>
+      <w:lvlText w:val="%3."/>
+      <w:lvlJc w:val="right"/>
+      <w:pPr>
+        <w:ind w:left="2160" w:hanging="180"/>
+      </w:pPr>
+    </w:lvl>
+    <w:lvl w:ilvl="3" w:tplc="0409000F" w:tentative="1">
+      <w:start w:val="1"/>
+      <w:numFmt w:val="decimal"/>
+      <w:lvlText w:val="%4."/>
+      <w:lvlJc w:val="left"/>
+      <w:pPr>
+        <w:ind w:left="2880" w:hanging="360"/>
+      </w:pPr>
+    </w:lvl>
+    <w:lvl w:ilvl="4" w:tplc="04090019" w:tentative="1">
+      <w:start w:val="1"/>
+      <w:numFmt w:val="lowerLetter"/>
+      <w:lvlText w:val="%5."/>
+      <w:lvlJc w:val="left"/>
+      <w:pPr>
+        <w:ind w:left="3600" w:hanging="360"/>
+      </w:pPr>
+    </w:lvl>
+    <w:lvl w:ilvl="5" w:tplc="0409001B" w:tentative="1">
+      <w:start w:val="1"/>
+      <w:numFmt w:val="lowerRoman"/>
+      <w:lvlText w:val="%6."/>
+      <w:lvlJc w:val="right"/>
+      <w:pPr>
+        <w:ind w:left="4320" w:hanging="180"/>
+      </w:pPr>
+    </w:lvl>
+    <w:lvl w:ilvl="6" w:tplc="0409000F" w:tentative="1">
+      <w:start w:val="1"/>
+      <w:numFmt w:val="decimal"/>
+      <w:lvlText w:val="%7."/>
+      <w:lvlJc w:val="left"/>
+      <w:pPr>
+        <w:ind w:left="5040" w:hanging="360"/>
+      </w:pPr>
+    </w:lvl>
+    <w:lvl w:ilvl="7" w:tplc="04090019" w:tentative="1">
+      <w:start w:val="1"/>
+      <w:numFmt w:val="lowerLetter"/>
+      <w:lvlText w:val="%8."/>
+      <w:lvlJc w:val="left"/>
+      <w:pPr>
+        <w:ind w:left="5760" w:hanging="360"/>
+      </w:pPr>
+    </w:lvl>
+    <w:lvl w:ilvl="8" w:tplc="0409001B" w:tentative="1">
+      <w:start w:val="1"/>
+      <w:numFmt w:val="lowerRoman"/>
+      <w:lvlText w:val="%9."/>
+      <w:lvlJc w:val="right"/>
+      <w:pPr>
+        <w:ind w:left="6480" w:hanging="180"/>
+      </w:pPr>
+    </w:lvl>
+  </w:abstractNum>
+  <w:abstractNum w:abstractNumId="4" w15:restartNumberingAfterBreak="0">
     <w:nsid w:val="0ECD105C"/>
     <w:multiLevelType w:val="hybridMultilevel"/>
     <w:tmpl w:val="144C2C7C"/>
@@ -4638,7 +5321,7 @@
       </w:pPr>
     </w:lvl>
   </w:abstractNum>
-  <w:abstractNum w:abstractNumId="4" w15:restartNumberingAfterBreak="0">
+  <w:abstractNum w:abstractNumId="5" w15:restartNumberingAfterBreak="0">
     <w:nsid w:val="149A0B3C"/>
     <w:multiLevelType w:val="hybridMultilevel"/>
     <w:tmpl w:val="660C58D2"/>
@@ -4727,7 +5410,7 @@
       </w:pPr>
     </w:lvl>
   </w:abstractNum>
-  <w:abstractNum w:abstractNumId="5" w15:restartNumberingAfterBreak="0">
+  <w:abstractNum w:abstractNumId="6" w15:restartNumberingAfterBreak="0">
     <w:nsid w:val="156D1CCF"/>
     <w:multiLevelType w:val="hybridMultilevel"/>
     <w:tmpl w:val="C9D6C662"/>
@@ -4816,7 +5499,7 @@
       </w:pPr>
     </w:lvl>
   </w:abstractNum>
-  <w:abstractNum w:abstractNumId="6" w15:restartNumberingAfterBreak="0">
+  <w:abstractNum w:abstractNumId="7" w15:restartNumberingAfterBreak="0">
     <w:nsid w:val="1BC87822"/>
     <w:multiLevelType w:val="hybridMultilevel"/>
     <w:tmpl w:val="EE20D2F4"/>
@@ -4905,7 +5588,7 @@
       </w:pPr>
     </w:lvl>
   </w:abstractNum>
-  <w:abstractNum w:abstractNumId="7" w15:restartNumberingAfterBreak="0">
+  <w:abstractNum w:abstractNumId="8" w15:restartNumberingAfterBreak="0">
     <w:nsid w:val="228033D7"/>
     <w:multiLevelType w:val="hybridMultilevel"/>
     <w:tmpl w:val="8F58BEB6"/>
@@ -4994,7 +5677,7 @@
       </w:pPr>
     </w:lvl>
   </w:abstractNum>
-  <w:abstractNum w:abstractNumId="8" w15:restartNumberingAfterBreak="0">
+  <w:abstractNum w:abstractNumId="9" w15:restartNumberingAfterBreak="0">
     <w:nsid w:val="26537972"/>
     <w:multiLevelType w:val="hybridMultilevel"/>
     <w:tmpl w:val="DDC0BD44"/>
@@ -5083,7 +5766,7 @@
       </w:pPr>
     </w:lvl>
   </w:abstractNum>
-  <w:abstractNum w:abstractNumId="9" w15:restartNumberingAfterBreak="0">
+  <w:abstractNum w:abstractNumId="10" w15:restartNumberingAfterBreak="0">
     <w:nsid w:val="2A5A063C"/>
     <w:multiLevelType w:val="hybridMultilevel"/>
     <w:tmpl w:val="D014092C"/>
@@ -5172,7 +5855,7 @@
       </w:pPr>
     </w:lvl>
   </w:abstractNum>
-  <w:abstractNum w:abstractNumId="10" w15:restartNumberingAfterBreak="0">
+  <w:abstractNum w:abstractNumId="11" w15:restartNumberingAfterBreak="0">
     <w:nsid w:val="2ADB5C47"/>
     <w:multiLevelType w:val="hybridMultilevel"/>
     <w:tmpl w:val="92E26774"/>
@@ -5261,10 +5944,10 @@
       </w:pPr>
     </w:lvl>
   </w:abstractNum>
-  <w:abstractNum w:abstractNumId="11" w15:restartNumberingAfterBreak="0">
-    <w:nsid w:val="38403F92"/>
+  <w:abstractNum w:abstractNumId="12" w15:restartNumberingAfterBreak="0">
+    <w:nsid w:val="35745131"/>
     <w:multiLevelType w:val="hybridMultilevel"/>
-    <w:tmpl w:val="F2AA22B8"/>
+    <w:tmpl w:val="011CD0CC"/>
     <w:lvl w:ilvl="0" w:tplc="39002586">
       <w:start w:val="1"/>
       <w:numFmt w:val="decimal"/>
@@ -5350,7 +6033,96 @@
       </w:pPr>
     </w:lvl>
   </w:abstractNum>
-  <w:abstractNum w:abstractNumId="12" w15:restartNumberingAfterBreak="0">
+  <w:abstractNum w:abstractNumId="13" w15:restartNumberingAfterBreak="0">
+    <w:nsid w:val="38403F92"/>
+    <w:multiLevelType w:val="hybridMultilevel"/>
+    <w:tmpl w:val="AAA62270"/>
+    <w:lvl w:ilvl="0" w:tplc="39002586">
+      <w:start w:val="1"/>
+      <w:numFmt w:val="decimal"/>
+      <w:lvlText w:val="1.%1"/>
+      <w:lvlJc w:val="left"/>
+      <w:pPr>
+        <w:ind w:left="720" w:hanging="360"/>
+      </w:pPr>
+      <w:rPr>
+        <w:rFonts w:hint="default"/>
+      </w:rPr>
+    </w:lvl>
+    <w:lvl w:ilvl="1" w:tplc="04090019" w:tentative="1">
+      <w:start w:val="1"/>
+      <w:numFmt w:val="lowerLetter"/>
+      <w:lvlText w:val="%2."/>
+      <w:lvlJc w:val="left"/>
+      <w:pPr>
+        <w:ind w:left="1440" w:hanging="360"/>
+      </w:pPr>
+    </w:lvl>
+    <w:lvl w:ilvl="2" w:tplc="0409001B" w:tentative="1">
+      <w:start w:val="1"/>
+      <w:numFmt w:val="lowerRoman"/>
+      <w:lvlText w:val="%3."/>
+      <w:lvlJc w:val="right"/>
+      <w:pPr>
+        <w:ind w:left="2160" w:hanging="180"/>
+      </w:pPr>
+    </w:lvl>
+    <w:lvl w:ilvl="3" w:tplc="0409000F" w:tentative="1">
+      <w:start w:val="1"/>
+      <w:numFmt w:val="decimal"/>
+      <w:lvlText w:val="%4."/>
+      <w:lvlJc w:val="left"/>
+      <w:pPr>
+        <w:ind w:left="2880" w:hanging="360"/>
+      </w:pPr>
+    </w:lvl>
+    <w:lvl w:ilvl="4" w:tplc="04090019" w:tentative="1">
+      <w:start w:val="1"/>
+      <w:numFmt w:val="lowerLetter"/>
+      <w:lvlText w:val="%5."/>
+      <w:lvlJc w:val="left"/>
+      <w:pPr>
+        <w:ind w:left="3600" w:hanging="360"/>
+      </w:pPr>
+    </w:lvl>
+    <w:lvl w:ilvl="5" w:tplc="0409001B" w:tentative="1">
+      <w:start w:val="1"/>
+      <w:numFmt w:val="lowerRoman"/>
+      <w:lvlText w:val="%6."/>
+      <w:lvlJc w:val="right"/>
+      <w:pPr>
+        <w:ind w:left="4320" w:hanging="180"/>
+      </w:pPr>
+    </w:lvl>
+    <w:lvl w:ilvl="6" w:tplc="0409000F" w:tentative="1">
+      <w:start w:val="1"/>
+      <w:numFmt w:val="decimal"/>
+      <w:lvlText w:val="%7."/>
+      <w:lvlJc w:val="left"/>
+      <w:pPr>
+        <w:ind w:left="5040" w:hanging="360"/>
+      </w:pPr>
+    </w:lvl>
+    <w:lvl w:ilvl="7" w:tplc="04090019" w:tentative="1">
+      <w:start w:val="1"/>
+      <w:numFmt w:val="lowerLetter"/>
+      <w:lvlText w:val="%8."/>
+      <w:lvlJc w:val="left"/>
+      <w:pPr>
+        <w:ind w:left="5760" w:hanging="360"/>
+      </w:pPr>
+    </w:lvl>
+    <w:lvl w:ilvl="8" w:tplc="0409001B" w:tentative="1">
+      <w:start w:val="1"/>
+      <w:numFmt w:val="lowerRoman"/>
+      <w:lvlText w:val="%9."/>
+      <w:lvlJc w:val="right"/>
+      <w:pPr>
+        <w:ind w:left="6480" w:hanging="180"/>
+      </w:pPr>
+    </w:lvl>
+  </w:abstractNum>
+  <w:abstractNum w:abstractNumId="14" w15:restartNumberingAfterBreak="0">
     <w:nsid w:val="38750F9A"/>
     <w:multiLevelType w:val="hybridMultilevel"/>
     <w:tmpl w:val="408477A6"/>
@@ -5439,7 +6211,7 @@
       </w:pPr>
     </w:lvl>
   </w:abstractNum>
-  <w:abstractNum w:abstractNumId="13" w15:restartNumberingAfterBreak="0">
+  <w:abstractNum w:abstractNumId="15" w15:restartNumberingAfterBreak="0">
     <w:nsid w:val="4A130A51"/>
     <w:multiLevelType w:val="hybridMultilevel"/>
     <w:tmpl w:val="682AAAE2"/>
@@ -5530,7 +6302,7 @@
       </w:pPr>
     </w:lvl>
   </w:abstractNum>
-  <w:abstractNum w:abstractNumId="14" w15:restartNumberingAfterBreak="0">
+  <w:abstractNum w:abstractNumId="16" w15:restartNumberingAfterBreak="0">
     <w:nsid w:val="4ABA10ED"/>
     <w:multiLevelType w:val="hybridMultilevel"/>
     <w:tmpl w:val="EB328EF2"/>
@@ -5619,7 +6391,96 @@
       </w:pPr>
     </w:lvl>
   </w:abstractNum>
-  <w:abstractNum w:abstractNumId="15" w15:restartNumberingAfterBreak="0">
+  <w:abstractNum w:abstractNumId="17" w15:restartNumberingAfterBreak="0">
+    <w:nsid w:val="4BB7614E"/>
+    <w:multiLevelType w:val="hybridMultilevel"/>
+    <w:tmpl w:val="6F20B608"/>
+    <w:lvl w:ilvl="0" w:tplc="39002586">
+      <w:start w:val="1"/>
+      <w:numFmt w:val="decimal"/>
+      <w:lvlText w:val="1.%1"/>
+      <w:lvlJc w:val="left"/>
+      <w:pPr>
+        <w:ind w:left="720" w:hanging="360"/>
+      </w:pPr>
+      <w:rPr>
+        <w:rFonts w:hint="default"/>
+      </w:rPr>
+    </w:lvl>
+    <w:lvl w:ilvl="1" w:tplc="04090019" w:tentative="1">
+      <w:start w:val="1"/>
+      <w:numFmt w:val="lowerLetter"/>
+      <w:lvlText w:val="%2."/>
+      <w:lvlJc w:val="left"/>
+      <w:pPr>
+        <w:ind w:left="1440" w:hanging="360"/>
+      </w:pPr>
+    </w:lvl>
+    <w:lvl w:ilvl="2" w:tplc="0409001B" w:tentative="1">
+      <w:start w:val="1"/>
+      <w:numFmt w:val="lowerRoman"/>
+      <w:lvlText w:val="%3."/>
+      <w:lvlJc w:val="right"/>
+      <w:pPr>
+        <w:ind w:left="2160" w:hanging="180"/>
+      </w:pPr>
+    </w:lvl>
+    <w:lvl w:ilvl="3" w:tplc="0409000F" w:tentative="1">
+      <w:start w:val="1"/>
+      <w:numFmt w:val="decimal"/>
+      <w:lvlText w:val="%4."/>
+      <w:lvlJc w:val="left"/>
+      <w:pPr>
+        <w:ind w:left="2880" w:hanging="360"/>
+      </w:pPr>
+    </w:lvl>
+    <w:lvl w:ilvl="4" w:tplc="04090019" w:tentative="1">
+      <w:start w:val="1"/>
+      <w:numFmt w:val="lowerLetter"/>
+      <w:lvlText w:val="%5."/>
+      <w:lvlJc w:val="left"/>
+      <w:pPr>
+        <w:ind w:left="3600" w:hanging="360"/>
+      </w:pPr>
+    </w:lvl>
+    <w:lvl w:ilvl="5" w:tplc="0409001B" w:tentative="1">
+      <w:start w:val="1"/>
+      <w:numFmt w:val="lowerRoman"/>
+      <w:lvlText w:val="%6."/>
+      <w:lvlJc w:val="right"/>
+      <w:pPr>
+        <w:ind w:left="4320" w:hanging="180"/>
+      </w:pPr>
+    </w:lvl>
+    <w:lvl w:ilvl="6" w:tplc="0409000F" w:tentative="1">
+      <w:start w:val="1"/>
+      <w:numFmt w:val="decimal"/>
+      <w:lvlText w:val="%7."/>
+      <w:lvlJc w:val="left"/>
+      <w:pPr>
+        <w:ind w:left="5040" w:hanging="360"/>
+      </w:pPr>
+    </w:lvl>
+    <w:lvl w:ilvl="7" w:tplc="04090019" w:tentative="1">
+      <w:start w:val="1"/>
+      <w:numFmt w:val="lowerLetter"/>
+      <w:lvlText w:val="%8."/>
+      <w:lvlJc w:val="left"/>
+      <w:pPr>
+        <w:ind w:left="5760" w:hanging="360"/>
+      </w:pPr>
+    </w:lvl>
+    <w:lvl w:ilvl="8" w:tplc="0409001B" w:tentative="1">
+      <w:start w:val="1"/>
+      <w:numFmt w:val="lowerRoman"/>
+      <w:lvlText w:val="%9."/>
+      <w:lvlJc w:val="right"/>
+      <w:pPr>
+        <w:ind w:left="6480" w:hanging="180"/>
+      </w:pPr>
+    </w:lvl>
+  </w:abstractNum>
+  <w:abstractNum w:abstractNumId="18" w15:restartNumberingAfterBreak="0">
     <w:nsid w:val="62BD333D"/>
     <w:multiLevelType w:val="hybridMultilevel"/>
     <w:tmpl w:val="BD1A07D2"/>
@@ -5708,7 +6569,7 @@
       </w:pPr>
     </w:lvl>
   </w:abstractNum>
-  <w:abstractNum w:abstractNumId="16" w15:restartNumberingAfterBreak="0">
+  <w:abstractNum w:abstractNumId="19" w15:restartNumberingAfterBreak="0">
     <w:nsid w:val="68B70247"/>
     <w:multiLevelType w:val="hybridMultilevel"/>
     <w:tmpl w:val="1910DCC8"/>
@@ -5797,7 +6658,7 @@
       </w:pPr>
     </w:lvl>
   </w:abstractNum>
-  <w:abstractNum w:abstractNumId="17" w15:restartNumberingAfterBreak="0">
+  <w:abstractNum w:abstractNumId="20" w15:restartNumberingAfterBreak="0">
     <w:nsid w:val="6A0E7424"/>
     <w:multiLevelType w:val="hybridMultilevel"/>
     <w:tmpl w:val="2C926970"/>
@@ -5886,7 +6747,7 @@
       </w:pPr>
     </w:lvl>
   </w:abstractNum>
-  <w:abstractNum w:abstractNumId="18" w15:restartNumberingAfterBreak="0">
+  <w:abstractNum w:abstractNumId="21" w15:restartNumberingAfterBreak="0">
     <w:nsid w:val="6FAE41C9"/>
     <w:multiLevelType w:val="multilevel"/>
     <w:tmpl w:val="E54AD4D0"/>
@@ -5999,7 +6860,96 @@
       </w:rPr>
     </w:lvl>
   </w:abstractNum>
-  <w:abstractNum w:abstractNumId="19" w15:restartNumberingAfterBreak="0">
+  <w:abstractNum w:abstractNumId="22" w15:restartNumberingAfterBreak="0">
+    <w:nsid w:val="6FF01191"/>
+    <w:multiLevelType w:val="hybridMultilevel"/>
+    <w:tmpl w:val="2020D4FC"/>
+    <w:lvl w:ilvl="0" w:tplc="39002586">
+      <w:start w:val="1"/>
+      <w:numFmt w:val="decimal"/>
+      <w:lvlText w:val="1.%1"/>
+      <w:lvlJc w:val="left"/>
+      <w:pPr>
+        <w:ind w:left="720" w:hanging="360"/>
+      </w:pPr>
+      <w:rPr>
+        <w:rFonts w:hint="default"/>
+      </w:rPr>
+    </w:lvl>
+    <w:lvl w:ilvl="1" w:tplc="04090019" w:tentative="1">
+      <w:start w:val="1"/>
+      <w:numFmt w:val="lowerLetter"/>
+      <w:lvlText w:val="%2."/>
+      <w:lvlJc w:val="left"/>
+      <w:pPr>
+        <w:ind w:left="1440" w:hanging="360"/>
+      </w:pPr>
+    </w:lvl>
+    <w:lvl w:ilvl="2" w:tplc="0409001B" w:tentative="1">
+      <w:start w:val="1"/>
+      <w:numFmt w:val="lowerRoman"/>
+      <w:lvlText w:val="%3."/>
+      <w:lvlJc w:val="right"/>
+      <w:pPr>
+        <w:ind w:left="2160" w:hanging="180"/>
+      </w:pPr>
+    </w:lvl>
+    <w:lvl w:ilvl="3" w:tplc="0409000F" w:tentative="1">
+      <w:start w:val="1"/>
+      <w:numFmt w:val="decimal"/>
+      <w:lvlText w:val="%4."/>
+      <w:lvlJc w:val="left"/>
+      <w:pPr>
+        <w:ind w:left="2880" w:hanging="360"/>
+      </w:pPr>
+    </w:lvl>
+    <w:lvl w:ilvl="4" w:tplc="04090019" w:tentative="1">
+      <w:start w:val="1"/>
+      <w:numFmt w:val="lowerLetter"/>
+      <w:lvlText w:val="%5."/>
+      <w:lvlJc w:val="left"/>
+      <w:pPr>
+        <w:ind w:left="3600" w:hanging="360"/>
+      </w:pPr>
+    </w:lvl>
+    <w:lvl w:ilvl="5" w:tplc="0409001B" w:tentative="1">
+      <w:start w:val="1"/>
+      <w:numFmt w:val="lowerRoman"/>
+      <w:lvlText w:val="%6."/>
+      <w:lvlJc w:val="right"/>
+      <w:pPr>
+        <w:ind w:left="4320" w:hanging="180"/>
+      </w:pPr>
+    </w:lvl>
+    <w:lvl w:ilvl="6" w:tplc="0409000F" w:tentative="1">
+      <w:start w:val="1"/>
+      <w:numFmt w:val="decimal"/>
+      <w:lvlText w:val="%7."/>
+      <w:lvlJc w:val="left"/>
+      <w:pPr>
+        <w:ind w:left="5040" w:hanging="360"/>
+      </w:pPr>
+    </w:lvl>
+    <w:lvl w:ilvl="7" w:tplc="04090019" w:tentative="1">
+      <w:start w:val="1"/>
+      <w:numFmt w:val="lowerLetter"/>
+      <w:lvlText w:val="%8."/>
+      <w:lvlJc w:val="left"/>
+      <w:pPr>
+        <w:ind w:left="5760" w:hanging="360"/>
+      </w:pPr>
+    </w:lvl>
+    <w:lvl w:ilvl="8" w:tplc="0409001B" w:tentative="1">
+      <w:start w:val="1"/>
+      <w:numFmt w:val="lowerRoman"/>
+      <w:lvlText w:val="%9."/>
+      <w:lvlJc w:val="right"/>
+      <w:pPr>
+        <w:ind w:left="6480" w:hanging="180"/>
+      </w:pPr>
+    </w:lvl>
+  </w:abstractNum>
+  <w:abstractNum w:abstractNumId="23" w15:restartNumberingAfterBreak="0">
     <w:nsid w:val="72404559"/>
     <w:multiLevelType w:val="multilevel"/>
     <w:tmpl w:val="D8AE1EE2"/>
@@ -6088,7 +7038,7 @@
       </w:pPr>
     </w:lvl>
   </w:abstractNum>
-  <w:abstractNum w:abstractNumId="20" w15:restartNumberingAfterBreak="0">
+  <w:abstractNum w:abstractNumId="24" w15:restartNumberingAfterBreak="0">
     <w:nsid w:val="727E2DF9"/>
     <w:multiLevelType w:val="hybridMultilevel"/>
     <w:tmpl w:val="EFE60872"/>
@@ -6177,7 +7127,96 @@
       </w:pPr>
     </w:lvl>
   </w:abstractNum>
-  <w:abstractNum w:abstractNumId="21" w15:restartNumberingAfterBreak="0">
+  <w:abstractNum w:abstractNumId="25" w15:restartNumberingAfterBreak="0">
+    <w:nsid w:val="74901908"/>
+    <w:multiLevelType w:val="hybridMultilevel"/>
+    <w:tmpl w:val="EA0C71B0"/>
+    <w:lvl w:ilvl="0" w:tplc="39002586">
+      <w:start w:val="1"/>
+      <w:numFmt w:val="decimal"/>
+      <w:lvlText w:val="1.%1"/>
+      <w:lvlJc w:val="left"/>
+      <w:pPr>
+        <w:ind w:left="720" w:hanging="360"/>
+      </w:pPr>
+      <w:rPr>
+        <w:rFonts w:hint="default"/>
+      </w:rPr>
+    </w:lvl>
+    <w:lvl w:ilvl="1" w:tplc="04090019" w:tentative="1">
+      <w:start w:val="1"/>
+      <w:numFmt w:val="lowerLetter"/>
+      <w:lvlText w:val="%2."/>
+      <w:lvlJc w:val="left"/>
+      <w:pPr>
+        <w:ind w:left="1440" w:hanging="360"/>
+      </w:pPr>
+    </w:lvl>
+    <w:lvl w:ilvl="2" w:tplc="0409001B" w:tentative="1">
+      <w:start w:val="1"/>
+      <w:numFmt w:val="lowerRoman"/>
+      <w:lvlText w:val="%3."/>
+      <w:lvlJc w:val="right"/>
+      <w:pPr>
+        <w:ind w:left="2160" w:hanging="180"/>
+      </w:pPr>
+    </w:lvl>
+    <w:lvl w:ilvl="3" w:tplc="0409000F" w:tentative="1">
+      <w:start w:val="1"/>
+      <w:numFmt w:val="decimal"/>
+      <w:lvlText w:val="%4."/>
+      <w:lvlJc w:val="left"/>
+      <w:pPr>
+        <w:ind w:left="2880" w:hanging="360"/>
+      </w:pPr>
+    </w:lvl>
+    <w:lvl w:ilvl="4" w:tplc="04090019" w:tentative="1">
+      <w:start w:val="1"/>
+      <w:numFmt w:val="lowerLetter"/>
+      <w:lvlText w:val="%5."/>
+      <w:lvlJc w:val="left"/>
+      <w:pPr>
+        <w:ind w:left="3600" w:hanging="360"/>
+      </w:pPr>
+    </w:lvl>
+    <w:lvl w:ilvl="5" w:tplc="0409001B" w:tentative="1">
+      <w:start w:val="1"/>
+      <w:numFmt w:val="lowerRoman"/>
+      <w:lvlText w:val="%6."/>
+      <w:lvlJc w:val="right"/>
+      <w:pPr>
+        <w:ind w:left="4320" w:hanging="180"/>
+      </w:pPr>
+    </w:lvl>
+    <w:lvl w:ilvl="6" w:tplc="0409000F" w:tentative="1">
+      <w:start w:val="1"/>
+      <w:numFmt w:val="decimal"/>
+      <w:lvlText w:val="%7."/>
+      <w:lvlJc w:val="left"/>
+      <w:pPr>
+        <w:ind w:left="5040" w:hanging="360"/>
+      </w:pPr>
+    </w:lvl>
+    <w:lvl w:ilvl="7" w:tplc="04090019" w:tentative="1">
+      <w:start w:val="1"/>
+      <w:numFmt w:val="lowerLetter"/>
+      <w:lvlText w:val="%8."/>
+      <w:lvlJc w:val="left"/>
+      <w:pPr>
+        <w:ind w:left="5760" w:hanging="360"/>
+      </w:pPr>
+    </w:lvl>
+    <w:lvl w:ilvl="8" w:tplc="0409001B" w:tentative="1">
+      <w:start w:val="1"/>
+      <w:numFmt w:val="lowerRoman"/>
+      <w:lvlText w:val="%9."/>
+      <w:lvlJc w:val="right"/>
+      <w:pPr>
+        <w:ind w:left="6480" w:hanging="180"/>
+      </w:pPr>
+    </w:lvl>
+  </w:abstractNum>
+  <w:abstractNum w:abstractNumId="26" w15:restartNumberingAfterBreak="0">
     <w:nsid w:val="77500AC5"/>
     <w:multiLevelType w:val="hybridMultilevel"/>
     <w:tmpl w:val="FC2E3392"/>
@@ -6280,67 +7319,82 @@
     <w:abstractNumId w:val="2"/>
   </w:num>
   <w:num w:numId="2">
+    <w:abstractNumId w:val="23"/>
+  </w:num>
+  <w:num w:numId="3">
+    <w:abstractNumId w:val="7"/>
+  </w:num>
+  <w:num w:numId="4">
+    <w:abstractNumId w:val="8"/>
+  </w:num>
+  <w:num w:numId="5">
+    <w:abstractNumId w:val="18"/>
+  </w:num>
+  <w:num w:numId="6">
+    <w:abstractNumId w:val="4"/>
+  </w:num>
+  <w:num w:numId="7">
+    <w:abstractNumId w:val="14"/>
+  </w:num>
+  <w:num w:numId="8">
+    <w:abstractNumId w:val="24"/>
+  </w:num>
+  <w:num w:numId="9">
+    <w:abstractNumId w:val="9"/>
+  </w:num>
+  <w:num w:numId="10">
     <w:abstractNumId w:val="19"/>
   </w:num>
-  <w:num w:numId="3">
+  <w:num w:numId="11">
     <w:abstractNumId w:val="6"/>
   </w:num>
-  <w:num w:numId="4">
-    <w:abstractNumId w:val="7"/>
-  </w:num>
-  <w:num w:numId="5">
+  <w:num w:numId="12">
     <w:abstractNumId w:val="15"/>
   </w:num>
-  <w:num w:numId="6">
-    <w:abstractNumId w:val="3"/>
-  </w:num>
-  <w:num w:numId="7">
-    <w:abstractNumId w:val="12"/>
-  </w:num>
-  <w:num w:numId="8">
-    <w:abstractNumId w:val="20"/>
-  </w:num>
-  <w:num w:numId="9">
-    <w:abstractNumId w:val="8"/>
-  </w:num>
-  <w:num w:numId="10">
-    <w:abstractNumId w:val="16"/>
-  </w:num>
-  <w:num w:numId="11">
+  <w:num w:numId="13">
     <w:abstractNumId w:val="5"/>
   </w:num>
-  <w:num w:numId="12">
-    <w:abstractNumId w:val="13"/>
-  </w:num>
-  <w:num w:numId="13">
-    <w:abstractNumId w:val="4"/>
-  </w:num>
   <w:num w:numId="14">
-    <w:abstractNumId w:val="14"/>
+    <w:abstractNumId w:val="16"/>
   </w:num>
   <w:num w:numId="15">
     <w:abstractNumId w:val="1"/>
   </w:num>
   <w:num w:numId="16">
-    <w:abstractNumId w:val="10"/>
+    <w:abstractNumId w:val="11"/>
   </w:num>
   <w:num w:numId="17">
-    <w:abstractNumId w:val="17"/>
+    <w:abstractNumId w:val="20"/>
   </w:num>
   <w:num w:numId="18">
-    <w:abstractNumId w:val="21"/>
+    <w:abstractNumId w:val="26"/>
   </w:num>
   <w:num w:numId="19">
-    <w:abstractNumId w:val="11"/>
+    <w:abstractNumId w:val="13"/>
   </w:num>
   <w:num w:numId="20">
     <w:abstractNumId w:val="0"/>
   </w:num>
   <w:num w:numId="21">
-    <w:abstractNumId w:val="18"/>
+    <w:abstractNumId w:val="21"/>
   </w:num>
   <w:num w:numId="22">
-    <w:abstractNumId w:val="9"/>
+    <w:abstractNumId w:val="10"/>
+  </w:num>
+  <w:num w:numId="23">
+    <w:abstractNumId w:val="12"/>
+  </w:num>
+  <w:num w:numId="24">
+    <w:abstractNumId w:val="22"/>
+  </w:num>
+  <w:num w:numId="25">
+    <w:abstractNumId w:val="25"/>
+  </w:num>
+  <w:num w:numId="26">
+    <w:abstractNumId w:val="17"/>
+  </w:num>
+  <w:num w:numId="27">
+    <w:abstractNumId w:val="3"/>
   </w:num>
 </w:numbering>
 </file>
@@ -6794,7 +7848,6 @@
   <w:style w:type="character" w:default="1" w:styleId="DefaultParagraphFont">
     <w:name w:val="Default Paragraph Font"/>
     <w:uiPriority w:val="1"/>
-    <w:semiHidden/>
     <w:unhideWhenUsed/>
   </w:style>
   <w:style w:type="table" w:default="1" w:styleId="TableNormal">
@@ -6897,6 +7950,18 @@
         <w:insideV w:val="single" w:sz="4" w:space="0" w:color="auto"/>
       </w:tblBorders>
     </w:tblPr>
+  </w:style>
+  <w:style w:type="paragraph" w:styleId="Bibliography">
+    <w:name w:val="Bibliography"/>
+    <w:basedOn w:val="Normal"/>
+    <w:next w:val="Normal"/>
+    <w:uiPriority w:val="37"/>
+    <w:unhideWhenUsed/>
+    <w:rsid w:val="00566AE3"/>
+    <w:pPr>
+      <w:spacing w:after="0" w:line="480" w:lineRule="auto"/>
+      <w:ind w:left="720" w:hanging="720"/>
+    </w:pPr>
   </w:style>
 </w:styles>
 </file>

</xml_diff>

<commit_message>
Mengerjakan BAB II, baru sampe 2.2.
</commit_message>
<xml_diff>
--- a/Implementasi Design System V2 pada Perancangan Ulang Platform Reusely untuk Meningkatkan Konsistensi dan Efektivitas Prototipe.docx
+++ b/Implementasi Design System V2 pada Perancangan Ulang Platform Reusely untuk Meningkatkan Konsistensi dan Efektivitas Prototipe.docx
@@ -724,44 +724,6 @@
           <w:lang w:val="en-US"/>
         </w:rPr>
         <w:t>K</w:t>
-      </w:r>
-    </w:p>
-    <w:p>
-      <w:pPr>
-        <w:spacing w:after="240" w:line="360" w:lineRule="auto"/>
-        <w:rPr>
-          <w:rFonts w:ascii="Times New Roman" w:eastAsia="Times New Roman" w:hAnsi="Times New Roman" w:cs="Times New Roman"/>
-          <w:sz w:val="24"/>
-          <w:szCs w:val="24"/>
-          <w:lang w:val="en-US"/>
-        </w:rPr>
-      </w:pPr>
-      <w:r>
-        <w:rPr>
-          <w:rFonts w:ascii="Times New Roman" w:eastAsia="Times New Roman" w:hAnsi="Times New Roman" w:cs="Times New Roman"/>
-          <w:sz w:val="24"/>
-          <w:szCs w:val="24"/>
-          <w:lang w:val="en-US"/>
-        </w:rPr>
-        <w:br/>
-      </w:r>
-      <w:r>
-        <w:rPr>
-          <w:rFonts w:ascii="Times New Roman" w:eastAsia="Times New Roman" w:hAnsi="Times New Roman" w:cs="Times New Roman"/>
-          <w:sz w:val="24"/>
-          <w:szCs w:val="24"/>
-          <w:lang w:val="en-US"/>
-        </w:rPr>
-        <w:br/>
-      </w:r>
-      <w:r>
-        <w:rPr>
-          <w:rFonts w:ascii="Times New Roman" w:eastAsia="Times New Roman" w:hAnsi="Times New Roman" w:cs="Times New Roman"/>
-          <w:sz w:val="24"/>
-          <w:szCs w:val="24"/>
-          <w:lang w:val="en-US"/>
-        </w:rPr>
-        <w:br/>
       </w:r>
       <w:r>
         <w:rPr>
@@ -4649,8 +4611,357 @@
     </w:p>
     <w:p>
       <w:pPr>
-        <w:rPr>
-          <w:rFonts w:ascii="Times New Roman" w:hAnsi="Times New Roman" w:cs="Times New Roman"/>
+        <w:pStyle w:val="Heading1"/>
+        <w:spacing w:after="0"/>
+        <w:rPr>
+          <w:lang w:val="en-US"/>
+        </w:rPr>
+      </w:pPr>
+      <w:r>
+        <w:rPr>
+          <w:lang w:val="en-US"/>
+        </w:rPr>
+        <w:br w:type="page"/>
+      </w:r>
+      <w:r>
+        <w:rPr>
+          <w:lang w:val="en-US"/>
+        </w:rPr>
+        <w:lastRenderedPageBreak/>
+        <w:br w:type="page"/>
+      </w:r>
+      <w:r>
+        <w:rPr>
+          <w:lang w:val="en-US"/>
+        </w:rPr>
+        <w:lastRenderedPageBreak/>
+        <w:t>BAB II</w:t>
+      </w:r>
+    </w:p>
+    <w:p>
+      <w:pPr>
+        <w:pStyle w:val="Heading1"/>
+        <w:spacing w:before="0"/>
+        <w:rPr>
+          <w:lang w:val="en-US"/>
+        </w:rPr>
+      </w:pPr>
+      <w:r>
+        <w:rPr>
+          <w:lang w:val="en-US"/>
+        </w:rPr>
+        <w:t>GAMBARAN UMUM PERUSAHAAN</w:t>
+      </w:r>
+    </w:p>
+    <w:p>
+      <w:pPr>
+        <w:pStyle w:val="Heading2"/>
+        <w:numPr>
+          <w:ilvl w:val="0"/>
+          <w:numId w:val="29"/>
+        </w:numPr>
+        <w:spacing w:before="0" w:after="240"/>
+        <w:ind w:left="540" w:hanging="540"/>
+        <w:rPr>
+          <w:lang w:val="en-US"/>
+        </w:rPr>
+      </w:pPr>
+      <w:r>
+        <w:rPr>
+          <w:lang w:val="en-US"/>
+        </w:rPr>
+        <w:t>Sejarah Perusahaan</w:t>
+      </w:r>
+    </w:p>
+    <w:p>
+      <w:pPr>
+        <w:ind w:firstLine="540"/>
+        <w:jc w:val="both"/>
+        <w:rPr>
+          <w:rFonts w:ascii="Times New Roman" w:hAnsi="Times New Roman" w:cs="Times New Roman"/>
+          <w:sz w:val="24"/>
+          <w:szCs w:val="24"/>
+        </w:rPr>
+      </w:pPr>
+      <w:r>
+        <w:rPr>
+          <w:rFonts w:ascii="Times New Roman" w:hAnsi="Times New Roman" w:cs="Times New Roman"/>
+          <w:sz w:val="24"/>
+          <w:szCs w:val="24"/>
+        </w:rPr>
+        <w:t xml:space="preserve">Reusely merupakan perusahaan yang bergerak di bidang solusi digital untuk mendukung proses </w:t>
+      </w:r>
+      <w:r>
+        <w:rPr>
+          <w:rFonts w:ascii="Times New Roman" w:hAnsi="Times New Roman" w:cs="Times New Roman"/>
+          <w:i/>
+          <w:iCs/>
+          <w:sz w:val="24"/>
+          <w:szCs w:val="24"/>
+        </w:rPr>
+        <w:t>trade-in</w:t>
+      </w:r>
+      <w:r>
+        <w:rPr>
+          <w:rFonts w:ascii="Times New Roman" w:hAnsi="Times New Roman" w:cs="Times New Roman"/>
+          <w:sz w:val="24"/>
+          <w:szCs w:val="24"/>
+        </w:rPr>
+        <w:t xml:space="preserve"> dan </w:t>
+      </w:r>
+      <w:r>
+        <w:rPr>
+          <w:rFonts w:ascii="Times New Roman" w:hAnsi="Times New Roman" w:cs="Times New Roman"/>
+          <w:i/>
+          <w:iCs/>
+          <w:sz w:val="24"/>
+          <w:szCs w:val="24"/>
+        </w:rPr>
+        <w:t>buyback</w:t>
+      </w:r>
+      <w:r>
+        <w:rPr>
+          <w:rFonts w:ascii="Times New Roman" w:hAnsi="Times New Roman" w:cs="Times New Roman"/>
+          <w:sz w:val="24"/>
+          <w:szCs w:val="24"/>
+        </w:rPr>
+        <w:t xml:space="preserve"> secara terintegrasi. Perusahaan ini pertama kali didirikan pada tahun 2011 dengan fokus awal sebagai solusi internal yang dirancang untuk menyederhanakan proses logistik dan </w:t>
+      </w:r>
+      <w:r>
+        <w:rPr>
+          <w:rFonts w:ascii="Times New Roman" w:hAnsi="Times New Roman" w:cs="Times New Roman"/>
+          <w:i/>
+          <w:iCs/>
+          <w:sz w:val="24"/>
+          <w:szCs w:val="24"/>
+        </w:rPr>
+        <w:t>trade-in</w:t>
+      </w:r>
+      <w:r>
+        <w:rPr>
+          <w:rFonts w:ascii="Times New Roman" w:hAnsi="Times New Roman" w:cs="Times New Roman"/>
+          <w:sz w:val="24"/>
+          <w:szCs w:val="24"/>
+        </w:rPr>
+        <w:t xml:space="preserve"> pada satu perusahaan. Pada tahap awal pengembangannya, Reusely telah menghadirkan inovasi berupa integrasi label pengiriman otomatis yang bertujuan untuk mempercepat proses pengiriman serta mengurangi kesalahan dan pekerjaan manual.</w:t>
+      </w:r>
+    </w:p>
+    <w:p>
+      <w:pPr>
+        <w:ind w:firstLine="540"/>
+        <w:jc w:val="both"/>
+        <w:rPr>
+          <w:rFonts w:ascii="Times New Roman" w:hAnsi="Times New Roman" w:cs="Times New Roman"/>
+          <w:sz w:val="24"/>
+          <w:szCs w:val="24"/>
+          <w:lang w:val="en-US"/>
+        </w:rPr>
+      </w:pPr>
+      <w:r>
+        <w:rPr>
+          <w:rFonts w:ascii="Times New Roman" w:hAnsi="Times New Roman" w:cs="Times New Roman"/>
+          <w:sz w:val="24"/>
+          <w:szCs w:val="24"/>
+          <w:lang w:val="en-US"/>
+        </w:rPr>
+        <w:t>Seiring dengan perkembangan kebutuhan operasional, pada tahun 2016 Reusely mulai memperluas kegiatannya dengan membuka toko buyback fisik. Langkah ini dilakukan untuk memperoleh pemahaman yang lebih mendalam terkait proses trade-in secara langsung di lapangan. Dengan dimulainya operasional dua toko pertama, perusahaan mendapatkan berbagai pengalaman terkait penentuan harga, proses penerimaan barang, pengelolaan logistik, serta mekanisme pembayaran kepada pelanggan.</w:t>
+      </w:r>
+    </w:p>
+    <w:p>
+      <w:pPr>
+        <w:ind w:firstLine="540"/>
+        <w:jc w:val="both"/>
+        <w:rPr>
+          <w:rFonts w:ascii="Times New Roman" w:hAnsi="Times New Roman" w:cs="Times New Roman"/>
+          <w:sz w:val="24"/>
+          <w:szCs w:val="24"/>
+          <w:lang w:val="en-US"/>
+        </w:rPr>
+      </w:pPr>
+      <w:r>
+        <w:rPr>
+          <w:rFonts w:ascii="Times New Roman" w:hAnsi="Times New Roman" w:cs="Times New Roman"/>
+          <w:sz w:val="24"/>
+          <w:szCs w:val="24"/>
+          <w:lang w:val="en-US"/>
+        </w:rPr>
+        <w:t>Pada tahun 2020, Reusely berhasil memperluas operasionalnya dengan mengelola hingga tujuh toko trade-in dan buyback. Dalam tahap ini, perusahaan menemukan adanya kebutuhan akan sistem yang terintegrasi untuk mengelola berbagai aspek operasional seperti penentuan harga, pengiriman, pelacakan status, hingga proses pembayaran dalam satu platform yang saling terhubung.</w:t>
+      </w:r>
+    </w:p>
+    <w:p>
+      <w:pPr>
+        <w:ind w:firstLine="540"/>
+        <w:jc w:val="both"/>
+        <w:rPr>
+          <w:rFonts w:ascii="Times New Roman" w:hAnsi="Times New Roman" w:cs="Times New Roman"/>
+          <w:sz w:val="24"/>
+          <w:szCs w:val="24"/>
+          <w:lang w:val="en-US"/>
+        </w:rPr>
+      </w:pPr>
+      <w:r>
+        <w:rPr>
+          <w:rFonts w:ascii="Times New Roman" w:hAnsi="Times New Roman" w:cs="Times New Roman"/>
+          <w:sz w:val="24"/>
+          <w:szCs w:val="24"/>
+          <w:lang w:val="en-US"/>
+        </w:rPr>
+        <w:t>Perkembangan tersebut mendorong Reusely untuk melakukan transformasi pada tahun 2022, di mana sistem yang sebelumnya digunakan sebagai alat internal dikembangkan menjadi sebuah platform yang dapat dimanfaatkan oleh berbagai perusahaan. Reusely secara resmi menjadi platform trade-in dan buyback yang bertujuan untuk membantu pelaku bisnis dalam melakukan digitalisasi, standarisasi, serta pengembangan operasional tanpa harus membangun sistem dari awal.</w:t>
+      </w:r>
+    </w:p>
+    <w:p>
+      <w:pPr>
+        <w:ind w:firstLine="540"/>
+        <w:jc w:val="both"/>
+        <w:rPr>
+          <w:rFonts w:ascii="Times New Roman" w:hAnsi="Times New Roman" w:cs="Times New Roman"/>
+          <w:sz w:val="24"/>
+          <w:szCs w:val="24"/>
+          <w:lang w:val="en-US"/>
+        </w:rPr>
+      </w:pPr>
+      <w:r>
+        <w:rPr>
+          <w:rFonts w:ascii="Times New Roman" w:hAnsi="Times New Roman" w:cs="Times New Roman"/>
+          <w:sz w:val="24"/>
+          <w:szCs w:val="24"/>
+          <w:lang w:val="en-US"/>
+        </w:rPr>
+        <w:t>Pada tahun 2023, Reusely mulai menjalin kerja sama dengan berbagai penyedia layanan logistik global guna mendukung proses trade-in lintas negara. Kerja sama ini memungkinkan perusahaan untuk memperluas jangkauan layanan ke berbagai wilayah dengan tetap menjaga konsistensi dalam proses pengiriman dan pelacakan.</w:t>
+      </w:r>
+    </w:p>
+    <w:p>
+      <w:pPr>
+        <w:ind w:firstLine="540"/>
+        <w:jc w:val="both"/>
+        <w:rPr>
+          <w:rFonts w:ascii="Times New Roman" w:hAnsi="Times New Roman" w:cs="Times New Roman"/>
+          <w:sz w:val="24"/>
+          <w:szCs w:val="24"/>
+          <w:lang w:val="en-US"/>
+        </w:rPr>
+      </w:pPr>
+      <w:r>
+        <w:rPr>
+          <w:rFonts w:ascii="Times New Roman" w:hAnsi="Times New Roman" w:cs="Times New Roman"/>
+          <w:sz w:val="24"/>
+          <w:szCs w:val="24"/>
+          <w:lang w:val="en-US"/>
+        </w:rPr>
+        <w:t xml:space="preserve">Kemudian, pada tahun 2024 Reusely terus mengalami pertumbuhan dengan memperluas katalog produk yang didukung. Tidak hanya terbatas pada perangkat elektronik, jumlah item yang dapat diproses meningkat secara signifikan hingga </w:t>
+      </w:r>
+      <w:r>
+        <w:rPr>
+          <w:rFonts w:ascii="Times New Roman" w:hAnsi="Times New Roman" w:cs="Times New Roman"/>
+          <w:sz w:val="24"/>
+          <w:szCs w:val="24"/>
+          <w:lang w:val="en-US"/>
+        </w:rPr>
+        <w:lastRenderedPageBreak/>
+        <w:t>mencapai ratusan ribu SKU, sehingga memungkinkan perusahaan untuk melayani berbagai kategori produk.</w:t>
+      </w:r>
+    </w:p>
+    <w:p>
+      <w:pPr>
+        <w:ind w:firstLine="540"/>
+        <w:jc w:val="both"/>
+        <w:rPr>
+          <w:rFonts w:ascii="Times New Roman" w:hAnsi="Times New Roman" w:cs="Times New Roman"/>
+          <w:sz w:val="24"/>
+          <w:szCs w:val="24"/>
+          <w:lang w:val="en-US"/>
+        </w:rPr>
+      </w:pPr>
+      <w:r>
+        <w:rPr>
+          <w:rFonts w:ascii="Times New Roman" w:hAnsi="Times New Roman" w:cs="Times New Roman"/>
+          <w:sz w:val="24"/>
+          <w:szCs w:val="24"/>
+          <w:lang w:val="en-US"/>
+        </w:rPr>
+        <w:t>Memasuki tahun 2025, Reusely memperluas ekspansinya ke pasar internasional, khususnya di kawasan Eropa dan Asia Pasifik. Perusahaan mulai mendukung operasional multi-wilayah dengan penyesuaian terhadap alur kerja lokal, mata uang, serta regulasi yang berlaku di masing-masing negara.</w:t>
+      </w:r>
+    </w:p>
+    <w:p>
+      <w:pPr>
+        <w:ind w:firstLine="540"/>
+        <w:jc w:val="both"/>
+        <w:rPr>
+          <w:rFonts w:ascii="Times New Roman" w:hAnsi="Times New Roman" w:cs="Times New Roman"/>
+          <w:sz w:val="24"/>
+          <w:szCs w:val="24"/>
+          <w:lang w:val="en-US"/>
+        </w:rPr>
+      </w:pPr>
+      <w:r>
+        <w:rPr>
+          <w:rFonts w:ascii="Times New Roman" w:hAnsi="Times New Roman" w:cs="Times New Roman"/>
+          <w:sz w:val="24"/>
+          <w:szCs w:val="24"/>
+          <w:lang w:val="en-US"/>
+        </w:rPr>
+        <w:t>Pada tahun 2026, Reusely melakukan pembaruan terhadap identitas merek, visi, dan misi perusahaan sebagai bagian dari strategi penguatan posisi di pasar global. Hingga saat ini, Reusely terus berkembang sebagai platform yang mendukung operasional trade-in dan buyback modern dengan mengedepankan efisiensi, skalabilitas, dan keunggulan operasional.</w:t>
+      </w:r>
+    </w:p>
+    <w:p>
+      <w:pPr>
+        <w:pStyle w:val="Heading2"/>
+        <w:numPr>
+          <w:ilvl w:val="0"/>
+          <w:numId w:val="29"/>
+        </w:numPr>
+        <w:spacing w:before="0" w:after="240"/>
+        <w:ind w:left="540" w:hanging="540"/>
+        <w:rPr>
+          <w:lang w:val="en-US"/>
+        </w:rPr>
+      </w:pPr>
+      <w:r>
+        <w:rPr>
+          <w:lang w:val="en-US"/>
+        </w:rPr>
+        <w:t>Struktur Organisasi</w:t>
+      </w:r>
+    </w:p>
+    <w:p>
+      <w:pPr>
+        <w:ind w:firstLine="540"/>
+        <w:jc w:val="both"/>
+        <w:rPr>
+          <w:rFonts w:ascii="Times New Roman" w:hAnsi="Times New Roman" w:cs="Times New Roman"/>
+          <w:sz w:val="24"/>
+          <w:szCs w:val="24"/>
+          <w:lang w:val="en-US"/>
+        </w:rPr>
+      </w:pPr>
+      <w:r>
+        <w:rPr>
+          <w:rFonts w:ascii="Times New Roman" w:hAnsi="Times New Roman" w:cs="Times New Roman"/>
+          <w:sz w:val="24"/>
+          <w:szCs w:val="24"/>
+          <w:lang w:val="en-US"/>
+        </w:rPr>
+        <w:t>Struktur organisasi merupakan susunan yang menggambarkan pembagian tugas, wewenang, dan tanggung jawab dalam suatu perusahaan. Struktur ini berfungsi untuk memperjelas hubungan kerja serta mendukung kelancaran koordinasi dalam mencapai tujuan organisasi. Berikut merupakan struktur organisasi pada perusahaan Reusely:</w:t>
+      </w:r>
+    </w:p>
+    <w:p>
+      <w:pPr>
+        <w:ind w:firstLine="540"/>
+        <w:jc w:val="both"/>
+        <w:rPr>
+          <w:rFonts w:ascii="Times New Roman" w:hAnsi="Times New Roman" w:cs="Times New Roman"/>
+          <w:sz w:val="24"/>
+          <w:szCs w:val="24"/>
+          <w:lang w:val="en-US"/>
+        </w:rPr>
+      </w:pPr>
+    </w:p>
+    <w:p>
+      <w:pPr>
+        <w:ind w:firstLine="540"/>
+        <w:jc w:val="both"/>
+        <w:rPr>
+          <w:rFonts w:ascii="Times New Roman" w:eastAsiaTheme="majorEastAsia" w:hAnsi="Times New Roman" w:cs="Times New Roman"/>
           <w:sz w:val="24"/>
           <w:szCs w:val="24"/>
           <w:lang w:val="en-US"/>
@@ -5500,6 +5811,95 @@
     </w:lvl>
   </w:abstractNum>
   <w:abstractNum w:abstractNumId="7" w15:restartNumberingAfterBreak="0">
+    <w:nsid w:val="172F1A4F"/>
+    <w:multiLevelType w:val="hybridMultilevel"/>
+    <w:tmpl w:val="8012C736"/>
+    <w:lvl w:ilvl="0" w:tplc="A1782816">
+      <w:start w:val="1"/>
+      <w:numFmt w:val="decimal"/>
+      <w:lvlText w:val="2.%1"/>
+      <w:lvlJc w:val="left"/>
+      <w:pPr>
+        <w:ind w:left="720" w:hanging="360"/>
+      </w:pPr>
+      <w:rPr>
+        <w:rFonts w:hint="default"/>
+      </w:rPr>
+    </w:lvl>
+    <w:lvl w:ilvl="1" w:tplc="04090019" w:tentative="1">
+      <w:start w:val="1"/>
+      <w:numFmt w:val="lowerLetter"/>
+      <w:lvlText w:val="%2."/>
+      <w:lvlJc w:val="left"/>
+      <w:pPr>
+        <w:ind w:left="1440" w:hanging="360"/>
+      </w:pPr>
+    </w:lvl>
+    <w:lvl w:ilvl="2" w:tplc="0409001B" w:tentative="1">
+      <w:start w:val="1"/>
+      <w:numFmt w:val="lowerRoman"/>
+      <w:lvlText w:val="%3."/>
+      <w:lvlJc w:val="right"/>
+      <w:pPr>
+        <w:ind w:left="2160" w:hanging="180"/>
+      </w:pPr>
+    </w:lvl>
+    <w:lvl w:ilvl="3" w:tplc="0409000F" w:tentative="1">
+      <w:start w:val="1"/>
+      <w:numFmt w:val="decimal"/>
+      <w:lvlText w:val="%4."/>
+      <w:lvlJc w:val="left"/>
+      <w:pPr>
+        <w:ind w:left="2880" w:hanging="360"/>
+      </w:pPr>
+    </w:lvl>
+    <w:lvl w:ilvl="4" w:tplc="04090019" w:tentative="1">
+      <w:start w:val="1"/>
+      <w:numFmt w:val="lowerLetter"/>
+      <w:lvlText w:val="%5."/>
+      <w:lvlJc w:val="left"/>
+      <w:pPr>
+        <w:ind w:left="3600" w:hanging="360"/>
+      </w:pPr>
+    </w:lvl>
+    <w:lvl w:ilvl="5" w:tplc="0409001B" w:tentative="1">
+      <w:start w:val="1"/>
+      <w:numFmt w:val="lowerRoman"/>
+      <w:lvlText w:val="%6."/>
+      <w:lvlJc w:val="right"/>
+      <w:pPr>
+        <w:ind w:left="4320" w:hanging="180"/>
+      </w:pPr>
+    </w:lvl>
+    <w:lvl w:ilvl="6" w:tplc="0409000F" w:tentative="1">
+      <w:start w:val="1"/>
+      <w:numFmt w:val="decimal"/>
+      <w:lvlText w:val="%7."/>
+      <w:lvlJc w:val="left"/>
+      <w:pPr>
+        <w:ind w:left="5040" w:hanging="360"/>
+      </w:pPr>
+    </w:lvl>
+    <w:lvl w:ilvl="7" w:tplc="04090019" w:tentative="1">
+      <w:start w:val="1"/>
+      <w:numFmt w:val="lowerLetter"/>
+      <w:lvlText w:val="%8."/>
+      <w:lvlJc w:val="left"/>
+      <w:pPr>
+        <w:ind w:left="5760" w:hanging="360"/>
+      </w:pPr>
+    </w:lvl>
+    <w:lvl w:ilvl="8" w:tplc="0409001B" w:tentative="1">
+      <w:start w:val="1"/>
+      <w:numFmt w:val="lowerRoman"/>
+      <w:lvlText w:val="%9."/>
+      <w:lvlJc w:val="right"/>
+      <w:pPr>
+        <w:ind w:left="6480" w:hanging="180"/>
+      </w:pPr>
+    </w:lvl>
+  </w:abstractNum>
+  <w:abstractNum w:abstractNumId="8" w15:restartNumberingAfterBreak="0">
     <w:nsid w:val="1BC87822"/>
     <w:multiLevelType w:val="hybridMultilevel"/>
     <w:tmpl w:val="EE20D2F4"/>
@@ -5588,7 +5988,7 @@
       </w:pPr>
     </w:lvl>
   </w:abstractNum>
-  <w:abstractNum w:abstractNumId="8" w15:restartNumberingAfterBreak="0">
+  <w:abstractNum w:abstractNumId="9" w15:restartNumberingAfterBreak="0">
     <w:nsid w:val="228033D7"/>
     <w:multiLevelType w:val="hybridMultilevel"/>
     <w:tmpl w:val="8F58BEB6"/>
@@ -5677,7 +6077,7 @@
       </w:pPr>
     </w:lvl>
   </w:abstractNum>
-  <w:abstractNum w:abstractNumId="9" w15:restartNumberingAfterBreak="0">
+  <w:abstractNum w:abstractNumId="10" w15:restartNumberingAfterBreak="0">
     <w:nsid w:val="26537972"/>
     <w:multiLevelType w:val="hybridMultilevel"/>
     <w:tmpl w:val="DDC0BD44"/>
@@ -5766,7 +6166,7 @@
       </w:pPr>
     </w:lvl>
   </w:abstractNum>
-  <w:abstractNum w:abstractNumId="10" w15:restartNumberingAfterBreak="0">
+  <w:abstractNum w:abstractNumId="11" w15:restartNumberingAfterBreak="0">
     <w:nsid w:val="2A5A063C"/>
     <w:multiLevelType w:val="hybridMultilevel"/>
     <w:tmpl w:val="D014092C"/>
@@ -5855,7 +6255,7 @@
       </w:pPr>
     </w:lvl>
   </w:abstractNum>
-  <w:abstractNum w:abstractNumId="11" w15:restartNumberingAfterBreak="0">
+  <w:abstractNum w:abstractNumId="12" w15:restartNumberingAfterBreak="0">
     <w:nsid w:val="2ADB5C47"/>
     <w:multiLevelType w:val="hybridMultilevel"/>
     <w:tmpl w:val="92E26774"/>
@@ -5944,7 +6344,7 @@
       </w:pPr>
     </w:lvl>
   </w:abstractNum>
-  <w:abstractNum w:abstractNumId="12" w15:restartNumberingAfterBreak="0">
+  <w:abstractNum w:abstractNumId="13" w15:restartNumberingAfterBreak="0">
     <w:nsid w:val="35745131"/>
     <w:multiLevelType w:val="hybridMultilevel"/>
     <w:tmpl w:val="011CD0CC"/>
@@ -6033,7 +6433,7 @@
       </w:pPr>
     </w:lvl>
   </w:abstractNum>
-  <w:abstractNum w:abstractNumId="13" w15:restartNumberingAfterBreak="0">
+  <w:abstractNum w:abstractNumId="14" w15:restartNumberingAfterBreak="0">
     <w:nsid w:val="38403F92"/>
     <w:multiLevelType w:val="hybridMultilevel"/>
     <w:tmpl w:val="AAA62270"/>
@@ -6122,7 +6522,7 @@
       </w:pPr>
     </w:lvl>
   </w:abstractNum>
-  <w:abstractNum w:abstractNumId="14" w15:restartNumberingAfterBreak="0">
+  <w:abstractNum w:abstractNumId="15" w15:restartNumberingAfterBreak="0">
     <w:nsid w:val="38750F9A"/>
     <w:multiLevelType w:val="hybridMultilevel"/>
     <w:tmpl w:val="408477A6"/>
@@ -6211,7 +6611,7 @@
       </w:pPr>
     </w:lvl>
   </w:abstractNum>
-  <w:abstractNum w:abstractNumId="15" w15:restartNumberingAfterBreak="0">
+  <w:abstractNum w:abstractNumId="16" w15:restartNumberingAfterBreak="0">
     <w:nsid w:val="4A130A51"/>
     <w:multiLevelType w:val="hybridMultilevel"/>
     <w:tmpl w:val="682AAAE2"/>
@@ -6302,7 +6702,7 @@
       </w:pPr>
     </w:lvl>
   </w:abstractNum>
-  <w:abstractNum w:abstractNumId="16" w15:restartNumberingAfterBreak="0">
+  <w:abstractNum w:abstractNumId="17" w15:restartNumberingAfterBreak="0">
     <w:nsid w:val="4ABA10ED"/>
     <w:multiLevelType w:val="hybridMultilevel"/>
     <w:tmpl w:val="EB328EF2"/>
@@ -6391,7 +6791,7 @@
       </w:pPr>
     </w:lvl>
   </w:abstractNum>
-  <w:abstractNum w:abstractNumId="17" w15:restartNumberingAfterBreak="0">
+  <w:abstractNum w:abstractNumId="18" w15:restartNumberingAfterBreak="0">
     <w:nsid w:val="4BB7614E"/>
     <w:multiLevelType w:val="hybridMultilevel"/>
     <w:tmpl w:val="6F20B608"/>
@@ -6480,7 +6880,96 @@
       </w:pPr>
     </w:lvl>
   </w:abstractNum>
-  <w:abstractNum w:abstractNumId="18" w15:restartNumberingAfterBreak="0">
+  <w:abstractNum w:abstractNumId="19" w15:restartNumberingAfterBreak="0">
+    <w:nsid w:val="4F110EC1"/>
+    <w:multiLevelType w:val="hybridMultilevel"/>
+    <w:tmpl w:val="4C5A7E9E"/>
+    <w:lvl w:ilvl="0" w:tplc="0442959E">
+      <w:start w:val="1"/>
+      <w:numFmt w:val="decimal"/>
+      <w:lvlText w:val="2.%1."/>
+      <w:lvlJc w:val="left"/>
+      <w:pPr>
+        <w:ind w:left="720" w:hanging="360"/>
+      </w:pPr>
+      <w:rPr>
+        <w:rFonts w:hint="default"/>
+      </w:rPr>
+    </w:lvl>
+    <w:lvl w:ilvl="1" w:tplc="04090019" w:tentative="1">
+      <w:start w:val="1"/>
+      <w:numFmt w:val="lowerLetter"/>
+      <w:lvlText w:val="%2."/>
+      <w:lvlJc w:val="left"/>
+      <w:pPr>
+        <w:ind w:left="1440" w:hanging="360"/>
+      </w:pPr>
+    </w:lvl>
+    <w:lvl w:ilvl="2" w:tplc="0409001B" w:tentative="1">
+      <w:start w:val="1"/>
+      <w:numFmt w:val="lowerRoman"/>
+      <w:lvlText w:val="%3."/>
+      <w:lvlJc w:val="right"/>
+      <w:pPr>
+        <w:ind w:left="2160" w:hanging="180"/>
+      </w:pPr>
+    </w:lvl>
+    <w:lvl w:ilvl="3" w:tplc="0409000F" w:tentative="1">
+      <w:start w:val="1"/>
+      <w:numFmt w:val="decimal"/>
+      <w:lvlText w:val="%4."/>
+      <w:lvlJc w:val="left"/>
+      <w:pPr>
+        <w:ind w:left="2880" w:hanging="360"/>
+      </w:pPr>
+    </w:lvl>
+    <w:lvl w:ilvl="4" w:tplc="04090019" w:tentative="1">
+      <w:start w:val="1"/>
+      <w:numFmt w:val="lowerLetter"/>
+      <w:lvlText w:val="%5."/>
+      <w:lvlJc w:val="left"/>
+      <w:pPr>
+        <w:ind w:left="3600" w:hanging="360"/>
+      </w:pPr>
+    </w:lvl>
+    <w:lvl w:ilvl="5" w:tplc="0409001B" w:tentative="1">
+      <w:start w:val="1"/>
+      <w:numFmt w:val="lowerRoman"/>
+      <w:lvlText w:val="%6."/>
+      <w:lvlJc w:val="right"/>
+      <w:pPr>
+        <w:ind w:left="4320" w:hanging="180"/>
+      </w:pPr>
+    </w:lvl>
+    <w:lvl w:ilvl="6" w:tplc="0409000F" w:tentative="1">
+      <w:start w:val="1"/>
+      <w:numFmt w:val="decimal"/>
+      <w:lvlText w:val="%7."/>
+      <w:lvlJc w:val="left"/>
+      <w:pPr>
+        <w:ind w:left="5040" w:hanging="360"/>
+      </w:pPr>
+    </w:lvl>
+    <w:lvl w:ilvl="7" w:tplc="04090019" w:tentative="1">
+      <w:start w:val="1"/>
+      <w:numFmt w:val="lowerLetter"/>
+      <w:lvlText w:val="%8."/>
+      <w:lvlJc w:val="left"/>
+      <w:pPr>
+        <w:ind w:left="5760" w:hanging="360"/>
+      </w:pPr>
+    </w:lvl>
+    <w:lvl w:ilvl="8" w:tplc="0409001B" w:tentative="1">
+      <w:start w:val="1"/>
+      <w:numFmt w:val="lowerRoman"/>
+      <w:lvlText w:val="%9."/>
+      <w:lvlJc w:val="right"/>
+      <w:pPr>
+        <w:ind w:left="6480" w:hanging="180"/>
+      </w:pPr>
+    </w:lvl>
+  </w:abstractNum>
+  <w:abstractNum w:abstractNumId="20" w15:restartNumberingAfterBreak="0">
     <w:nsid w:val="62BD333D"/>
     <w:multiLevelType w:val="hybridMultilevel"/>
     <w:tmpl w:val="BD1A07D2"/>
@@ -6569,7 +7058,96 @@
       </w:pPr>
     </w:lvl>
   </w:abstractNum>
-  <w:abstractNum w:abstractNumId="19" w15:restartNumberingAfterBreak="0">
+  <w:abstractNum w:abstractNumId="21" w15:restartNumberingAfterBreak="0">
+    <w:nsid w:val="6584478F"/>
+    <w:multiLevelType w:val="hybridMultilevel"/>
+    <w:tmpl w:val="F6304F12"/>
+    <w:lvl w:ilvl="0" w:tplc="A1782816">
+      <w:start w:val="1"/>
+      <w:numFmt w:val="decimal"/>
+      <w:lvlText w:val="2.%1"/>
+      <w:lvlJc w:val="left"/>
+      <w:pPr>
+        <w:ind w:left="720" w:hanging="360"/>
+      </w:pPr>
+      <w:rPr>
+        <w:rFonts w:hint="default"/>
+      </w:rPr>
+    </w:lvl>
+    <w:lvl w:ilvl="1" w:tplc="04090019" w:tentative="1">
+      <w:start w:val="1"/>
+      <w:numFmt w:val="lowerLetter"/>
+      <w:lvlText w:val="%2."/>
+      <w:lvlJc w:val="left"/>
+      <w:pPr>
+        <w:ind w:left="1440" w:hanging="360"/>
+      </w:pPr>
+    </w:lvl>
+    <w:lvl w:ilvl="2" w:tplc="0409001B" w:tentative="1">
+      <w:start w:val="1"/>
+      <w:numFmt w:val="lowerRoman"/>
+      <w:lvlText w:val="%3."/>
+      <w:lvlJc w:val="right"/>
+      <w:pPr>
+        <w:ind w:left="2160" w:hanging="180"/>
+      </w:pPr>
+    </w:lvl>
+    <w:lvl w:ilvl="3" w:tplc="0409000F" w:tentative="1">
+      <w:start w:val="1"/>
+      <w:numFmt w:val="decimal"/>
+      <w:lvlText w:val="%4."/>
+      <w:lvlJc w:val="left"/>
+      <w:pPr>
+        <w:ind w:left="2880" w:hanging="360"/>
+      </w:pPr>
+    </w:lvl>
+    <w:lvl w:ilvl="4" w:tplc="04090019" w:tentative="1">
+      <w:start w:val="1"/>
+      <w:numFmt w:val="lowerLetter"/>
+      <w:lvlText w:val="%5."/>
+      <w:lvlJc w:val="left"/>
+      <w:pPr>
+        <w:ind w:left="3600" w:hanging="360"/>
+      </w:pPr>
+    </w:lvl>
+    <w:lvl w:ilvl="5" w:tplc="0409001B" w:tentative="1">
+      <w:start w:val="1"/>
+      <w:numFmt w:val="lowerRoman"/>
+      <w:lvlText w:val="%6."/>
+      <w:lvlJc w:val="right"/>
+      <w:pPr>
+        <w:ind w:left="4320" w:hanging="180"/>
+      </w:pPr>
+    </w:lvl>
+    <w:lvl w:ilvl="6" w:tplc="0409000F" w:tentative="1">
+      <w:start w:val="1"/>
+      <w:numFmt w:val="decimal"/>
+      <w:lvlText w:val="%7."/>
+      <w:lvlJc w:val="left"/>
+      <w:pPr>
+        <w:ind w:left="5040" w:hanging="360"/>
+      </w:pPr>
+    </w:lvl>
+    <w:lvl w:ilvl="7" w:tplc="04090019" w:tentative="1">
+      <w:start w:val="1"/>
+      <w:numFmt w:val="lowerLetter"/>
+      <w:lvlText w:val="%8."/>
+      <w:lvlJc w:val="left"/>
+      <w:pPr>
+        <w:ind w:left="5760" w:hanging="360"/>
+      </w:pPr>
+    </w:lvl>
+    <w:lvl w:ilvl="8" w:tplc="0409001B" w:tentative="1">
+      <w:start w:val="1"/>
+      <w:numFmt w:val="lowerRoman"/>
+      <w:lvlText w:val="%9."/>
+      <w:lvlJc w:val="right"/>
+      <w:pPr>
+        <w:ind w:left="6480" w:hanging="180"/>
+      </w:pPr>
+    </w:lvl>
+  </w:abstractNum>
+  <w:abstractNum w:abstractNumId="22" w15:restartNumberingAfterBreak="0">
     <w:nsid w:val="68B70247"/>
     <w:multiLevelType w:val="hybridMultilevel"/>
     <w:tmpl w:val="1910DCC8"/>
@@ -6658,7 +7236,7 @@
       </w:pPr>
     </w:lvl>
   </w:abstractNum>
-  <w:abstractNum w:abstractNumId="20" w15:restartNumberingAfterBreak="0">
+  <w:abstractNum w:abstractNumId="23" w15:restartNumberingAfterBreak="0">
     <w:nsid w:val="6A0E7424"/>
     <w:multiLevelType w:val="hybridMultilevel"/>
     <w:tmpl w:val="2C926970"/>
@@ -6747,7 +7325,7 @@
       </w:pPr>
     </w:lvl>
   </w:abstractNum>
-  <w:abstractNum w:abstractNumId="21" w15:restartNumberingAfterBreak="0">
+  <w:abstractNum w:abstractNumId="24" w15:restartNumberingAfterBreak="0">
     <w:nsid w:val="6FAE41C9"/>
     <w:multiLevelType w:val="multilevel"/>
     <w:tmpl w:val="E54AD4D0"/>
@@ -6860,7 +7438,7 @@
       </w:rPr>
     </w:lvl>
   </w:abstractNum>
-  <w:abstractNum w:abstractNumId="22" w15:restartNumberingAfterBreak="0">
+  <w:abstractNum w:abstractNumId="25" w15:restartNumberingAfterBreak="0">
     <w:nsid w:val="6FF01191"/>
     <w:multiLevelType w:val="hybridMultilevel"/>
     <w:tmpl w:val="2020D4FC"/>
@@ -6949,7 +7527,7 @@
       </w:pPr>
     </w:lvl>
   </w:abstractNum>
-  <w:abstractNum w:abstractNumId="23" w15:restartNumberingAfterBreak="0">
+  <w:abstractNum w:abstractNumId="26" w15:restartNumberingAfterBreak="0">
     <w:nsid w:val="72404559"/>
     <w:multiLevelType w:val="multilevel"/>
     <w:tmpl w:val="D8AE1EE2"/>
@@ -7038,7 +7616,7 @@
       </w:pPr>
     </w:lvl>
   </w:abstractNum>
-  <w:abstractNum w:abstractNumId="24" w15:restartNumberingAfterBreak="0">
+  <w:abstractNum w:abstractNumId="27" w15:restartNumberingAfterBreak="0">
     <w:nsid w:val="727E2DF9"/>
     <w:multiLevelType w:val="hybridMultilevel"/>
     <w:tmpl w:val="EFE60872"/>
@@ -7127,7 +7705,7 @@
       </w:pPr>
     </w:lvl>
   </w:abstractNum>
-  <w:abstractNum w:abstractNumId="25" w15:restartNumberingAfterBreak="0">
+  <w:abstractNum w:abstractNumId="28" w15:restartNumberingAfterBreak="0">
     <w:nsid w:val="74901908"/>
     <w:multiLevelType w:val="hybridMultilevel"/>
     <w:tmpl w:val="EA0C71B0"/>
@@ -7216,7 +7794,7 @@
       </w:pPr>
     </w:lvl>
   </w:abstractNum>
-  <w:abstractNum w:abstractNumId="26" w15:restartNumberingAfterBreak="0">
+  <w:abstractNum w:abstractNumId="29" w15:restartNumberingAfterBreak="0">
     <w:nsid w:val="77500AC5"/>
     <w:multiLevelType w:val="hybridMultilevel"/>
     <w:tmpl w:val="FC2E3392"/>
@@ -7319,82 +7897,91 @@
     <w:abstractNumId w:val="2"/>
   </w:num>
   <w:num w:numId="2">
-    <w:abstractNumId w:val="23"/>
+    <w:abstractNumId w:val="26"/>
   </w:num>
   <w:num w:numId="3">
-    <w:abstractNumId w:val="7"/>
+    <w:abstractNumId w:val="8"/>
   </w:num>
   <w:num w:numId="4">
-    <w:abstractNumId w:val="8"/>
+    <w:abstractNumId w:val="9"/>
   </w:num>
   <w:num w:numId="5">
-    <w:abstractNumId w:val="18"/>
+    <w:abstractNumId w:val="20"/>
   </w:num>
   <w:num w:numId="6">
     <w:abstractNumId w:val="4"/>
   </w:num>
   <w:num w:numId="7">
-    <w:abstractNumId w:val="14"/>
+    <w:abstractNumId w:val="15"/>
   </w:num>
   <w:num w:numId="8">
-    <w:abstractNumId w:val="24"/>
+    <w:abstractNumId w:val="27"/>
   </w:num>
   <w:num w:numId="9">
-    <w:abstractNumId w:val="9"/>
+    <w:abstractNumId w:val="10"/>
   </w:num>
   <w:num w:numId="10">
-    <w:abstractNumId w:val="19"/>
+    <w:abstractNumId w:val="22"/>
   </w:num>
   <w:num w:numId="11">
     <w:abstractNumId w:val="6"/>
   </w:num>
   <w:num w:numId="12">
-    <w:abstractNumId w:val="15"/>
+    <w:abstractNumId w:val="16"/>
   </w:num>
   <w:num w:numId="13">
     <w:abstractNumId w:val="5"/>
   </w:num>
   <w:num w:numId="14">
-    <w:abstractNumId w:val="16"/>
+    <w:abstractNumId w:val="17"/>
   </w:num>
   <w:num w:numId="15">
     <w:abstractNumId w:val="1"/>
   </w:num>
   <w:num w:numId="16">
-    <w:abstractNumId w:val="11"/>
+    <w:abstractNumId w:val="12"/>
   </w:num>
   <w:num w:numId="17">
-    <w:abstractNumId w:val="20"/>
+    <w:abstractNumId w:val="23"/>
   </w:num>
   <w:num w:numId="18">
-    <w:abstractNumId w:val="26"/>
+    <w:abstractNumId w:val="29"/>
   </w:num>
   <w:num w:numId="19">
-    <w:abstractNumId w:val="13"/>
+    <w:abstractNumId w:val="14"/>
   </w:num>
   <w:num w:numId="20">
     <w:abstractNumId w:val="0"/>
   </w:num>
   <w:num w:numId="21">
-    <w:abstractNumId w:val="21"/>
+    <w:abstractNumId w:val="24"/>
   </w:num>
   <w:num w:numId="22">
-    <w:abstractNumId w:val="10"/>
+    <w:abstractNumId w:val="11"/>
   </w:num>
   <w:num w:numId="23">
-    <w:abstractNumId w:val="12"/>
+    <w:abstractNumId w:val="13"/>
   </w:num>
   <w:num w:numId="24">
-    <w:abstractNumId w:val="22"/>
+    <w:abstractNumId w:val="25"/>
   </w:num>
   <w:num w:numId="25">
-    <w:abstractNumId w:val="25"/>
+    <w:abstractNumId w:val="28"/>
   </w:num>
   <w:num w:numId="26">
-    <w:abstractNumId w:val="17"/>
+    <w:abstractNumId w:val="18"/>
   </w:num>
   <w:num w:numId="27">
     <w:abstractNumId w:val="3"/>
+  </w:num>
+  <w:num w:numId="28">
+    <w:abstractNumId w:val="19"/>
+  </w:num>
+  <w:num w:numId="29">
+    <w:abstractNumId w:val="7"/>
+  </w:num>
+  <w:num w:numId="30">
+    <w:abstractNumId w:val="21"/>
   </w:num>
 </w:numbering>
 </file>
@@ -7848,6 +8435,7 @@
   <w:style w:type="character" w:default="1" w:styleId="DefaultParagraphFont">
     <w:name w:val="Default Paragraph Font"/>
     <w:uiPriority w:val="1"/>
+    <w:semiHidden/>
     <w:unhideWhenUsed/>
   </w:style>
   <w:style w:type="table" w:default="1" w:styleId="TableNormal">
@@ -7875,7 +8463,6 @@
     <w:name w:val="Normal (Web)"/>
     <w:basedOn w:val="Normal"/>
     <w:uiPriority w:val="99"/>
-    <w:semiHidden/>
     <w:unhideWhenUsed/>
     <w:rsid w:val="00850AD7"/>
     <w:pPr>

</xml_diff>

<commit_message>
Udah sampe BAB III 3.5 Sistem dan Prosedur Kerja
</commit_message>
<xml_diff>
--- a/Implementasi Design System V2 pada Perancangan Ulang Platform Reusely untuk Meningkatkan Konsistensi dan Efektivitas Prototipe.docx
+++ b/Implementasi Design System V2 pada Perancangan Ulang Platform Reusely untuk Meningkatkan Konsistensi dan Efektivitas Prototipe.docx
@@ -2042,7 +2042,7 @@
           <w:szCs w:val="24"/>
           <w:lang w:val="en-US"/>
         </w:rPr>
-        <w:instrText xml:space="preserve"> ADDIN ZOTERO_ITEM CSL_CITATION {"citationID":"FVkJClrj","properties":{"unsorted":false,"formattedCitation":"(Kurniawan, 2024)","plainCitation":"(Kurniawan, 2024)","noteIndex":0},"citationItems":[{"id":12,"uris":["http://zotero.org/users/local/Tywae54I/items/IVASVFB2"],"itemData":{"id":12,"type":"article-journal","abstract":"Kehadiran produk digital telah menjadi bagian integral dari kehidupan sehari-hari manusia. Antarmuka pengguna (UI) memiliki peran sentral dalam menentukan keberhasilan dan adopsi produk. Konsistensi dan koherensi dalam desain UI menjadi kunci untuk memastikan pengguna dapat dengan mudah memahami dan menggunakan produk secara efisien. Meskipun demikian, menciptakan UI yang konsisten, terutama untuk produk digital yang kompleks, merupakan tantangan yang tidak ringan. Oleh karena itu, Design System muncul sebagai solusi inovatif. Dari perspektif pengalaman pengguna, konsistensi dianggap sebagai faktor krusial yang mempengaruhi kemudahan pengguna dalam berinteraksi dengan desain. Penelitian ini bertujuan untuk mengkaji penerapan pendekatan atomic design dan A/B testing dalam pembuatan Design System dengan studi kasus pada perusahaan Asuransi Astra Buana. Diharapkan temuan penelitian ini dapat memberikan kontribusi teoritis dan praktis dalam pengembangan Design System yang efektif dan efisien.","container-title":"Jurnal Teknologi  Dan Sistem Informasi Bisnis","DOI":"10.47233/jteksis.v6i3.1346","ISSN":"2655-8238, 2964-2132","issue":"3","journalAbbreviation":"JTEKSIS","license":"http://creativecommons.org/licenses/by/4.0","page":"543-549","source":"DOI.org (Crossref)","title":"Pembuatan Design System Menggunakan Pendekatan Atomic Design dan A/B Testing","volume":"6","author":[{"family":"Kurniawan","given":"Reyhan Adinata"}],"issued":{"date-parts":[["2024",7,10]]}}}],"schema":"https://github.com/citation-style-language/schema/raw/master/csl-citation.json"} </w:instrText>
+        <w:instrText xml:space="preserve"> ADDIN ZOTERO_ITEM CSL_CITATION {"citationID":"FVkJClrj","properties":{"unsorted":false,"formattedCitation":"(Kurniawan, 2024a)","plainCitation":"(Kurniawan, 2024a)","noteIndex":0},"citationItems":[{"id":"5vO0IZiP/sNZilBNO","uris":["http://zotero.org/users/local/Tywae54I/items/IVASVFB2"],"itemData":{"id":12,"type":"article-journal","abstract":"Kehadiran produk digital telah menjadi bagian integral dari kehidupan sehari-hari manusia. Antarmuka pengguna (UI) memiliki peran sentral dalam menentukan keberhasilan dan adopsi produk. Konsistensi dan koherensi dalam desain UI menjadi kunci untuk memastikan pengguna dapat dengan mudah memahami dan menggunakan produk secara efisien. Meskipun demikian, menciptakan UI yang konsisten, terutama untuk produk digital yang kompleks, merupakan tantangan yang tidak ringan. Oleh karena itu, Design System muncul sebagai solusi inovatif. Dari perspektif pengalaman pengguna, konsistensi dianggap sebagai faktor krusial yang mempengaruhi kemudahan pengguna dalam berinteraksi dengan desain. Penelitian ini bertujuan untuk mengkaji penerapan pendekatan atomic design dan A/B testing dalam pembuatan Design System dengan studi kasus pada perusahaan Asuransi Astra Buana. Diharapkan temuan penelitian ini dapat memberikan kontribusi teoritis dan praktis dalam pengembangan Design System yang efektif dan efisien.","container-title":"Jurnal Teknologi  Dan Sistem Informasi Bisnis","DOI":"10.47233/jteksis.v6i3.1346","ISSN":"2655-8238, 2964-2132","issue":"3","journalAbbreviation":"JTEKSIS","license":"http://creativecommons.org/licenses/by/4.0","page":"543-549","source":"DOI.org (Crossref)","title":"Pembuatan Design System Menggunakan Pendekatan Atomic Design dan A/B Testing","volume":"6","author":[{"family":"Kurniawan","given":"Reyhan Adinata"}],"issued":{"date-parts":[["2024",7,10]]}}}],"schema":"https://github.com/citation-style-language/schema/raw/master/csl-citation.json"} </w:instrText>
       </w:r>
       <w:r>
         <w:rPr>
@@ -2056,7 +2056,7 @@
         <w:rPr>
           <w:rFonts w:cs="Times New Roman"/>
         </w:rPr>
-        <w:t>(Kurniawan, 2024)</w:t>
+        <w:t>(Kurniawan, 2024a)</w:t>
       </w:r>
       <w:r>
         <w:rPr>
@@ -3239,6 +3239,28 @@
     </w:p>
     <w:p>
       <w:pPr>
+        <w:spacing w:after="120"/>
+        <w:ind w:left="1080"/>
+        <w:rPr>
+          <w:rFonts w:cs="Times New Roman"/>
+          <w:szCs w:val="24"/>
+          <w:lang w:val="en-US"/>
+        </w:rPr>
+      </w:pPr>
+    </w:p>
+    <w:p>
+      <w:pPr>
+        <w:spacing w:after="120"/>
+        <w:ind w:left="1080"/>
+        <w:rPr>
+          <w:rFonts w:cs="Times New Roman"/>
+          <w:szCs w:val="24"/>
+          <w:lang w:val="en-US"/>
+        </w:rPr>
+      </w:pPr>
+    </w:p>
+    <w:p>
+      <w:pPr>
         <w:pStyle w:val="ListParagraph"/>
         <w:numPr>
           <w:ilvl w:val="1"/>
@@ -3262,6 +3284,7 @@
           <w:szCs w:val="24"/>
           <w:lang w:val="en-US"/>
         </w:rPr>
+        <w:lastRenderedPageBreak/>
         <w:t>Manfaat Kerja Praktik</w:t>
       </w:r>
     </w:p>
@@ -3310,7 +3333,6 @@
           <w:szCs w:val="24"/>
           <w:lang w:val="en-US"/>
         </w:rPr>
-        <w:lastRenderedPageBreak/>
         <w:t xml:space="preserve">Menghasilkan halaman-halaman yang telah terimplementasi dengan </w:t>
       </w:r>
       <w:r>
@@ -3846,54 +3868,13 @@
       <w:pPr>
         <w:pStyle w:val="ListParagraph"/>
         <w:spacing w:after="120"/>
-        <w:ind w:left="1800" w:hanging="1260"/>
-        <w:rPr>
-          <w:rFonts w:cs="Times New Roman"/>
-          <w:szCs w:val="24"/>
-          <w:lang w:val="en-US"/>
-        </w:rPr>
-      </w:pPr>
-      <w:r>
-        <w:rPr>
-          <w:rFonts w:cs="Times New Roman"/>
-          <w:b/>
-          <w:bCs/>
-          <w:szCs w:val="24"/>
-          <w:lang w:val="en-US"/>
-        </w:rPr>
-        <w:t xml:space="preserve">BAB III </w:t>
-      </w:r>
-      <w:r>
-        <w:rPr>
-          <w:rFonts w:cs="Times New Roman"/>
-          <w:b/>
-          <w:bCs/>
-          <w:szCs w:val="24"/>
-          <w:lang w:val="en-US"/>
-        </w:rPr>
-        <w:tab/>
-        <w:t>HASIL KEGIATAN KERJA PRAKT</w:t>
-      </w:r>
-      <w:r>
-        <w:rPr>
-          <w:rFonts w:cs="Times New Roman"/>
-          <w:b/>
-          <w:bCs/>
-          <w:szCs w:val="24"/>
-          <w:lang w:val="en-US"/>
-        </w:rPr>
-        <w:t>I</w:t>
-      </w:r>
-      <w:r>
-        <w:rPr>
-          <w:rFonts w:cs="Times New Roman"/>
-          <w:b/>
-          <w:bCs/>
-          <w:szCs w:val="24"/>
-          <w:lang w:val="en-US"/>
-        </w:rPr>
-        <w:t>K</w:t>
-      </w:r>
+        <w:ind w:left="1800"/>
+        <w:rPr>
+          <w:rFonts w:cs="Times New Roman"/>
+          <w:szCs w:val="24"/>
+          <w:lang w:val="en-US"/>
+        </w:rPr>
+      </w:pPr>
     </w:p>
     <w:p>
       <w:pPr>
@@ -3906,6 +3887,72 @@
           <w:lang w:val="en-US"/>
         </w:rPr>
       </w:pPr>
+    </w:p>
+    <w:p>
+      <w:pPr>
+        <w:pStyle w:val="ListParagraph"/>
+        <w:spacing w:after="120"/>
+        <w:ind w:left="1800" w:hanging="1260"/>
+        <w:rPr>
+          <w:rFonts w:cs="Times New Roman"/>
+          <w:szCs w:val="24"/>
+          <w:lang w:val="en-US"/>
+        </w:rPr>
+      </w:pPr>
+      <w:r>
+        <w:rPr>
+          <w:rFonts w:cs="Times New Roman"/>
+          <w:b/>
+          <w:bCs/>
+          <w:szCs w:val="24"/>
+          <w:lang w:val="en-US"/>
+        </w:rPr>
+        <w:lastRenderedPageBreak/>
+        <w:t xml:space="preserve">BAB III </w:t>
+      </w:r>
+      <w:r>
+        <w:rPr>
+          <w:rFonts w:cs="Times New Roman"/>
+          <w:b/>
+          <w:bCs/>
+          <w:szCs w:val="24"/>
+          <w:lang w:val="en-US"/>
+        </w:rPr>
+        <w:tab/>
+        <w:t>HASIL KEGIATAN KERJA PRAKT</w:t>
+      </w:r>
+      <w:r>
+        <w:rPr>
+          <w:rFonts w:cs="Times New Roman"/>
+          <w:b/>
+          <w:bCs/>
+          <w:szCs w:val="24"/>
+          <w:lang w:val="en-US"/>
+        </w:rPr>
+        <w:t>I</w:t>
+      </w:r>
+      <w:r>
+        <w:rPr>
+          <w:rFonts w:cs="Times New Roman"/>
+          <w:b/>
+          <w:bCs/>
+          <w:szCs w:val="24"/>
+          <w:lang w:val="en-US"/>
+        </w:rPr>
+        <w:t>K</w:t>
+      </w:r>
+    </w:p>
+    <w:p>
+      <w:pPr>
+        <w:pStyle w:val="ListParagraph"/>
+        <w:spacing w:after="120"/>
+        <w:ind w:left="1800"/>
+        <w:rPr>
+          <w:rFonts w:cs="Times New Roman"/>
+          <w:szCs w:val="24"/>
+          <w:lang w:val="en-US"/>
+        </w:rPr>
+      </w:pPr>
       <w:r>
         <w:rPr>
           <w:rFonts w:cs="Times New Roman"/>
@@ -4020,16 +4067,7 @@
           <w:szCs w:val="24"/>
           <w:lang w:val="en-US"/>
         </w:rPr>
-        <w:t xml:space="preserve">, </w:t>
-      </w:r>
-      <w:r>
-        <w:rPr>
-          <w:rFonts w:cs="Times New Roman"/>
-          <w:szCs w:val="24"/>
-          <w:lang w:val="en-US"/>
-        </w:rPr>
-        <w:lastRenderedPageBreak/>
-        <w:t xml:space="preserve">serta rincian Tugas dan Tanggung Jawab penulis dalam mengimplementasikan </w:t>
+        <w:t xml:space="preserve">, serta rincian Tugas dan Tanggung Jawab penulis dalam mengimplementasikan </w:t>
       </w:r>
       <w:r>
         <w:rPr>
@@ -4837,26 +4875,33 @@
     </w:p>
     <w:p>
       <w:pPr>
+        <w:pStyle w:val="NormalWeb"/>
+        <w:spacing w:line="360" w:lineRule="auto"/>
+        <w:ind w:left="1620"/>
+      </w:pPr>
+    </w:p>
+    <w:p>
+      <w:pPr>
         <w:pStyle w:val="Heading3"/>
       </w:pPr>
       <w:bookmarkStart w:id="0" w:name="_Toc229390562"/>
       <w:r>
-        <w:t>Tech Lead</w:t>
-      </w:r>
-      <w:bookmarkEnd w:id="0"/>
-    </w:p>
-    <w:p>
-      <w:pPr>
-        <w:ind w:left="540" w:firstLine="720"/>
-      </w:pPr>
-      <w:r>
-        <w:rPr>
-          <w:i/>
-          <w:iCs/>
-        </w:rPr>
         <w:lastRenderedPageBreak/>
         <w:t>Tech Lead</w:t>
       </w:r>
+      <w:bookmarkEnd w:id="0"/>
+    </w:p>
+    <w:p>
+      <w:pPr>
+        <w:ind w:left="540" w:firstLine="720"/>
+      </w:pPr>
+      <w:r>
+        <w:rPr>
+          <w:i/>
+          <w:iCs/>
+        </w:rPr>
+        <w:t>Tech Lead</w:t>
+      </w:r>
       <w:r>
         <w:t xml:space="preserve"> memiliki tanggung jawab dalam memimpin dan mengawasi proses pengembangan teknis sistem pada platform Reusely. Posisi ini berperan dalam memastikan proses development berjalan dengan baik serta mendukung pengembangan fitur dan layanan digital perusahaan. Dalam menjalankan tanggung jawab tersebut, </w:t>
       </w:r>
@@ -5048,22 +5093,30 @@
           <w:rFonts w:eastAsia="Times New Roman" w:cs="Times New Roman"/>
           <w:lang w:eastAsia="en-ID"/>
         </w:rPr>
-        <w:t xml:space="preserve"> memiliki tanggung jawab dalam mengelola serta mengembangkan produk digital perusahaan agar sesuai dengan kebutuhan pengguna dan tujuan bisnis perusahaan. Posisi ini berperan dalam mengatur proses pengembangan fitur pada platform Reusely agar berjalan secara terarah dan sesuai target perusahaan. Dalam menjalankan tanggung jawab tersebut, </w:t>
-      </w:r>
-      <w:r>
-        <w:rPr>
-          <w:rFonts w:eastAsia="Times New Roman" w:cs="Times New Roman"/>
-          <w:i/>
-          <w:iCs/>
-          <w:lang w:eastAsia="en-ID"/>
-        </w:rPr>
-        <w:t>Product Manager</w:t>
+        <w:t xml:space="preserve"> memiliki tanggung jawab dalam mengelola serta mengembangkan produk digital perusahaan agar sesuai dengan kebutuhan pengguna dan tujuan bisnis perusahaan. Posisi ini berperan dalam mengatur proses pengembangan fitur pada platform Reusely agar berjalan secara terarah </w:t>
       </w:r>
       <w:r>
         <w:rPr>
           <w:rFonts w:eastAsia="Times New Roman" w:cs="Times New Roman"/>
           <w:lang w:eastAsia="en-ID"/>
         </w:rPr>
+        <w:lastRenderedPageBreak/>
+        <w:t xml:space="preserve">dan sesuai target perusahaan. Dalam menjalankan tanggung jawab tersebut, </w:t>
+      </w:r>
+      <w:r>
+        <w:rPr>
+          <w:rFonts w:eastAsia="Times New Roman" w:cs="Times New Roman"/>
+          <w:i/>
+          <w:iCs/>
+          <w:lang w:eastAsia="en-ID"/>
+        </w:rPr>
+        <w:t>Product Manager</w:t>
+      </w:r>
+      <w:r>
+        <w:rPr>
+          <w:rFonts w:eastAsia="Times New Roman" w:cs="Times New Roman"/>
+          <w:lang w:eastAsia="en-ID"/>
+        </w:rPr>
         <w:t xml:space="preserve"> memiliki beberapa tugas sebagai berikut:</w:t>
       </w:r>
     </w:p>
@@ -5086,7 +5139,6 @@
           <w:rFonts w:eastAsia="Times New Roman" w:cs="Times New Roman"/>
           <w:lang w:eastAsia="en-ID"/>
         </w:rPr>
-        <w:lastRenderedPageBreak/>
         <w:t>Menyusun perencanaan pengembangan produk dan fitur pada platform Reusely.</w:t>
       </w:r>
     </w:p>
@@ -5310,6 +5362,7 @@
         <w:ind w:left="1620"/>
       </w:pPr>
       <w:r>
+        <w:lastRenderedPageBreak/>
         <w:t>Melakukan analisis pasar dan kebutuhan pengguna sebagai bahan pengembangan strategi marketing perusahaan.</w:t>
       </w:r>
     </w:p>
@@ -5338,7 +5391,6 @@
         <w:ind w:left="1620"/>
       </w:pPr>
       <w:r>
-        <w:lastRenderedPageBreak/>
         <w:t xml:space="preserve">Berkoordinasi dengan tim </w:t>
       </w:r>
       <w:r>
@@ -5542,6 +5594,7 @@
         <w:ind w:left="1620"/>
       </w:pPr>
       <w:r>
+        <w:lastRenderedPageBreak/>
         <w:t>Melakukan evaluasi terhadap tampilan dan pengalaman pengguna pada platform perusahaan.</w:t>
       </w:r>
     </w:p>
@@ -5570,7 +5623,6 @@
         <w:ind w:left="1620"/>
       </w:pPr>
       <w:r>
-        <w:lastRenderedPageBreak/>
         <w:t>Menyesuaikan desain aplikasi dengan kebutuhan fitur yang sedang dikembangkan.</w:t>
       </w:r>
     </w:p>
@@ -5747,6 +5799,7 @@
         <w:ind w:left="1620"/>
       </w:pPr>
       <w:r>
+        <w:lastRenderedPageBreak/>
         <w:t xml:space="preserve">Mengumpulkan </w:t>
       </w:r>
       <w:r>
@@ -5782,7 +5835,6 @@
           <w:i/>
           <w:iCs/>
         </w:rPr>
-        <w:lastRenderedPageBreak/>
         <w:t>Backend Lead</w:t>
       </w:r>
       <w:r>
@@ -5926,6 +5978,7 @@
         <w:pStyle w:val="Heading3"/>
       </w:pPr>
       <w:r>
+        <w:lastRenderedPageBreak/>
         <w:t>Frontend Lead</w:t>
       </w:r>
       <w:bookmarkEnd w:id="6"/>
@@ -5944,11 +5997,7 @@
         <w:t>Frontend Lead</w:t>
       </w:r>
       <w:r>
-        <w:t xml:space="preserve"> memiliki tanggung jawab dalam memimpin dan mengawasi pengembangan frontend pada platform Reusely. Posisi ini </w:t>
-      </w:r>
-      <w:r>
-        <w:lastRenderedPageBreak/>
-        <w:t xml:space="preserve">berperan dalam menentukan arah teknis frontend, teknologi, framework, serta metode pengembangan tampilan sistem perusahaan. Selain itu, </w:t>
+        <w:t xml:space="preserve"> memiliki tanggung jawab dalam memimpin dan mengawasi pengembangan frontend pada platform Reusely. Posisi ini berperan dalam menentukan arah teknis frontend, teknologi, framework, serta metode pengembangan tampilan sistem perusahaan. Selain itu, </w:t>
       </w:r>
       <w:r>
         <w:rPr>
@@ -6154,7 +6203,11 @@
         <w:t>Developer</w:t>
       </w:r>
       <w:r>
-        <w:t xml:space="preserve"> memiliki tanggung jawab dalam melakukan pengembangan dan implementasi backend sistem pada platform Reusely sesuai dengan kebutuhan perusahaan dan arahan dari Backend Lead. Posisi ini juga berperan dalam membantu mengatur jalannya proses development </w:t>
+        <w:t xml:space="preserve"> memiliki tanggung jawab dalam melakukan pengembangan dan implementasi backend sistem pada platform Reusely sesuai dengan kebutuhan perusahaan dan arahan dari Backend Lead. </w:t>
+      </w:r>
+      <w:r>
+        <w:lastRenderedPageBreak/>
+        <w:t xml:space="preserve">Posisi ini juga berperan dalam membantu mengatur jalannya proses development </w:t>
       </w:r>
       <w:r>
         <w:rPr>
@@ -6198,7 +6251,6 @@
         <w:ind w:left="1620"/>
       </w:pPr>
       <w:r>
-        <w:lastRenderedPageBreak/>
         <w:t xml:space="preserve">Mengembangkan dan mengimplementasikan fitur </w:t>
       </w:r>
       <w:r>
@@ -6483,7 +6535,11 @@
         <w:t>frontend</w:t>
       </w:r>
       <w:r>
-        <w:t xml:space="preserve"> serta memastikan tampilan sistem dapat berjalan dengan baik dan nyaman digunakan oleh pengguna. Dalam menjalankan tanggung jawab tersebut, Senior </w:t>
+        <w:t xml:space="preserve"> </w:t>
+      </w:r>
+      <w:r>
+        <w:lastRenderedPageBreak/>
+        <w:t xml:space="preserve">serta memastikan tampilan sistem dapat berjalan dengan baik dan nyaman digunakan oleh pengguna. Dalam menjalankan tanggung jawab tersebut, Senior </w:t>
       </w:r>
       <w:r>
         <w:rPr>
@@ -6507,7 +6563,6 @@
         <w:ind w:left="1620"/>
       </w:pPr>
       <w:r>
-        <w:lastRenderedPageBreak/>
         <w:t xml:space="preserve">Mengembangkan dan mengimplementasikan tampilan </w:t>
       </w:r>
       <w:r>
@@ -6769,7 +6824,11 @@
         <w:t>Product Quality Assurance</w:t>
       </w:r>
       <w:r>
-        <w:t xml:space="preserve"> memiliki tanggung jawab dalam memastikan kualitas fitur dan sistem pada platform Reusely sebelum digunakan oleh pengguna. Posisi ini berperan dalam melakukan pengujian terhadap fitur yang dikembangkan agar dapat berjalan sesuai kebutuhan perusahaan dan meminimalisir terjadinya bug maupun error pada sistem. Dalam menjalankan tanggung jawab tersebut, </w:t>
+        <w:t xml:space="preserve"> memiliki tanggung jawab dalam memastikan kualitas fitur dan sistem pada platform Reusely sebelum digunakan oleh pengguna. Posisi ini berperan dalam melakukan pengujian terhadap fitur yang dikembangkan agar dapat berjalan sesuai kebutuhan perusahaan dan meminimalisir terjadinya bug maupun error pada sistem. </w:t>
+      </w:r>
+      <w:r>
+        <w:lastRenderedPageBreak/>
+        <w:t xml:space="preserve">Dalam menjalankan tanggung jawab tersebut, </w:t>
       </w:r>
       <w:r>
         <w:rPr>
@@ -6793,7 +6852,6 @@
         <w:ind w:left="1620"/>
       </w:pPr>
       <w:r>
-        <w:lastRenderedPageBreak/>
         <w:t>Melakukan pengujian terhadap fitur website dan sistem pada platform Reusely sebelum dan sesudah dirilis kepada pengguna.</w:t>
       </w:r>
     </w:p>
@@ -7005,6 +7063,7 @@
         <w:ind w:left="1620"/>
       </w:pPr>
       <w:r>
+        <w:lastRenderedPageBreak/>
         <w:t>Melakukan pengujian manual terhadap fitur aplikasi dan website pada platform Reusely.</w:t>
       </w:r>
     </w:p>
@@ -7019,7 +7078,6 @@
         <w:ind w:left="1620"/>
       </w:pPr>
       <w:r>
-        <w:lastRenderedPageBreak/>
         <w:t>Melakukan pengujian API untuk memastikan integrasi sistem berjalan dengan baik dan sesuai kebutuhan perusahaan.</w:t>
       </w:r>
     </w:p>
@@ -7228,6 +7286,7 @@
         <w:ind w:left="1620"/>
       </w:pPr>
       <w:r>
+        <w:lastRenderedPageBreak/>
         <w:t>Membantu proses pengolahan dan pembaruan data pada sistem perusahaan.</w:t>
       </w:r>
     </w:p>
@@ -7242,7 +7301,6 @@
         <w:ind w:left="1620"/>
       </w:pPr>
       <w:r>
-        <w:lastRenderedPageBreak/>
         <w:t>Membantu penyusunan laporan dan dokumentasi data perusahaan sesuai kebutuhan operasional.</w:t>
       </w:r>
     </w:p>
@@ -7511,20 +7569,6 @@
       <w:r>
         <w:t>Logo merupakan gambar atau simbol yang digunakan sebagai identitas perusahaan. Logo biasanya digunakan pada website, dokumen, media promosi, serta berbagai kebutuhan perusahaan lainnya. Selain sebagai identitas, logo juga menjadi bentuk representasi dari perusahaan dalam menunjukkan citra dan karakter perusahaan. Berikut merupakan logo dari Reusely:</w:t>
       </w:r>
-    </w:p>
-    <w:p>
-      <w:pPr>
-        <w:pStyle w:val="NormalWeb"/>
-        <w:spacing w:line="360" w:lineRule="auto"/>
-        <w:ind w:firstLine="567"/>
-      </w:pPr>
-    </w:p>
-    <w:p>
-      <w:pPr>
-        <w:pStyle w:val="NormalWeb"/>
-        <w:spacing w:line="360" w:lineRule="auto"/>
-        <w:ind w:firstLine="567"/>
-      </w:pPr>
     </w:p>
     <w:p>
       <w:pPr>
@@ -7593,7 +7637,6 @@
         <w:ind w:left="1418" w:firstLine="720"/>
       </w:pPr>
       <w:r>
-        <w:lastRenderedPageBreak/>
         <w:t>(Sumber: Linkedln Reusely.com)</w:t>
       </w:r>
     </w:p>
@@ -7612,6 +7655,7 @@
         <w:pStyle w:val="Heading2"/>
       </w:pPr>
       <w:r>
+        <w:lastRenderedPageBreak/>
         <w:t>Visi dan Misi Perusahaan</w:t>
       </w:r>
     </w:p>
@@ -7917,8 +7961,6 @@
       <w:pPr>
         <w:ind w:firstLine="540"/>
         <w:rPr>
-          <w:rFonts w:cs="Times New Roman"/>
-          <w:szCs w:val="24"/>
           <w:lang w:val="en-US"/>
         </w:rPr>
       </w:pPr>
@@ -8076,15 +8118,1605 @@
     </w:p>
     <w:p>
       <w:pPr>
+        <w:pStyle w:val="Heading1"/>
+        <w:numPr>
+          <w:ilvl w:val="0"/>
+          <w:numId w:val="33"/>
+        </w:numPr>
+        <w:ind w:left="540" w:hanging="540"/>
+        <w:jc w:val="both"/>
+        <w:rPr>
+          <w:rFonts w:cs="Times New Roman"/>
+          <w:sz w:val="24"/>
+          <w:szCs w:val="24"/>
+        </w:rPr>
+      </w:pPr>
+      <w:r>
+        <w:rPr>
+          <w:sz w:val="24"/>
+          <w:szCs w:val="24"/>
+        </w:rPr>
+        <w:t>Tugas dan Tanggung Jawab</w:t>
+      </w:r>
+    </w:p>
+    <w:p>
+      <w:pPr>
         <w:ind w:firstLine="540"/>
-        <w:rPr>
-          <w:szCs w:val="24"/>
-        </w:rPr>
-      </w:pPr>
-      <w:r>
-        <w:rPr>
-          <w:szCs w:val="24"/>
-        </w:rPr>
+      </w:pPr>
+      <w:r>
+        <w:t xml:space="preserve">Selama melaksanakan kegiatan Kerja Praktik di Reusely sebagai </w:t>
+      </w:r>
+      <w:r>
+        <w:rPr>
+          <w:i/>
+          <w:iCs/>
+        </w:rPr>
+        <w:t>User Interface Designer Intern</w:t>
+      </w:r>
+      <w:r>
+        <w:t xml:space="preserve">, penulis ditempatkan di dalam </w:t>
+      </w:r>
+      <w:r>
+        <w:rPr>
+          <w:i/>
+          <w:iCs/>
+        </w:rPr>
+        <w:t>Product Team</w:t>
+      </w:r>
+      <w:r>
+        <w:t xml:space="preserve"> dan berkoordinasi secara langsung di bawah arahan </w:t>
+      </w:r>
+      <w:r>
+        <w:rPr>
+          <w:i/>
+          <w:iCs/>
+        </w:rPr>
+        <w:t>Product Designer</w:t>
+      </w:r>
+      <w:r>
+        <w:t xml:space="preserve"> senior. Peran teknis penulis di dalam tim ini dibatasi sebagai eksekutor dalam proses perancangan ulang (</w:t>
+      </w:r>
+      <w:r>
+        <w:rPr>
+          <w:i/>
+          <w:iCs/>
+        </w:rPr>
+        <w:t>redesign</w:t>
+      </w:r>
+      <w:r>
+        <w:t xml:space="preserve">) halaman-halaman platform Reusely. Tanggung jawab utama penulis berfokus pada migrasi elemen visual dengan mengimplementasikan komponen-komponen resmi dari </w:t>
+      </w:r>
+      <w:r>
+        <w:rPr>
+          <w:i/>
+          <w:iCs/>
+        </w:rPr>
+        <w:t>Design System V2</w:t>
+      </w:r>
+      <w:r>
+        <w:t xml:space="preserve"> yang telah disediakan oleh perusahaan. Melalui batasan kerja tersebut, penulis bertugas untuk memastikan setiap modul halaman yang dikerjakan ulang dapat bertransisi menggunakan bahasa komponen terbaru yang terstandarisasi.</w:t>
+      </w:r>
+    </w:p>
+    <w:p>
+      <w:pPr>
+        <w:ind w:firstLine="540"/>
+      </w:pPr>
+      <w:r>
+        <w:lastRenderedPageBreak/>
+        <w:t xml:space="preserve">Dalam pelaksanaan tugas harian, penulis bertanggung jawab untuk melakukan audit dan analisis visual awal terhadap halaman lama yang masih berbasis </w:t>
+      </w:r>
+      <w:r>
+        <w:rPr>
+          <w:i/>
+          <w:iCs/>
+        </w:rPr>
+        <w:t>Design System V1</w:t>
+      </w:r>
+      <w:r>
+        <w:t xml:space="preserve">. Proses identifikasi ini dilakukan secara cermat untuk memeriksa letak ketidakkonsistenan visual dari elemen antarmuka yang ada pada platform. Setelah </w:t>
+      </w:r>
+      <w:r>
+        <w:rPr>
+          <w:lang w:val="en-US"/>
+        </w:rPr>
+        <w:t>mengidentifikasi</w:t>
+      </w:r>
+      <w:r>
+        <w:t xml:space="preserve"> komponen lama yang perlu diganti, penulis melakukan perancangan ulang tata letak halaman tersebut di aplikasi Figma dengan mengoptimalkan fitur </w:t>
+      </w:r>
+      <w:r>
+        <w:rPr>
+          <w:i/>
+          <w:iCs/>
+        </w:rPr>
+        <w:t>Auto Layout</w:t>
+      </w:r>
+      <w:r>
+        <w:t xml:space="preserve"> dan </w:t>
+      </w:r>
+      <w:r>
+        <w:rPr>
+          <w:i/>
+          <w:iCs/>
+        </w:rPr>
+        <w:t>Component Sets</w:t>
+      </w:r>
+      <w:r>
+        <w:t xml:space="preserve">. Langkah penerapan ini bertujuan untuk menghasilkan susunan tata letak komponen </w:t>
+      </w:r>
+      <w:r>
+        <w:rPr>
+          <w:i/>
+          <w:iCs/>
+        </w:rPr>
+        <w:t>Design System V2</w:t>
+      </w:r>
+      <w:r>
+        <w:t xml:space="preserve"> yang konsisten, rapi, dan sesuai dengan standar panduan desain yang berlaku di perusahaan.</w:t>
+      </w:r>
+    </w:p>
+    <w:p>
+      <w:pPr>
+        <w:ind w:firstLine="540"/>
+      </w:pPr>
+      <w:r>
+        <w:t xml:space="preserve">Selain melakukan pembenahan pada aspek visual, penulis mengemban tugas untuk menyusun </w:t>
+      </w:r>
+      <w:r>
+        <w:rPr>
+          <w:i/>
+          <w:iCs/>
+        </w:rPr>
+        <w:t>high-fidelity prototype</w:t>
+      </w:r>
+      <w:r>
+        <w:t xml:space="preserve"> yang interaktif. Pembuatan prototipe ini dikerjakan secara spesifik per halaman untuk setiap modul tugas yang diberikan selama periode Kerja Praktik. Dalam menyusun interaksi per halaman tersebut, penulis memanfaatkan fitur </w:t>
+      </w:r>
+      <w:r>
+        <w:rPr>
+          <w:i/>
+          <w:iCs/>
+        </w:rPr>
+        <w:t>Variables</w:t>
+      </w:r>
+      <w:r>
+        <w:t xml:space="preserve"> </w:t>
+      </w:r>
+      <w:r>
+        <w:rPr>
+          <w:lang w:val="en-US"/>
+        </w:rPr>
+        <w:t>untuk</w:t>
+      </w:r>
+      <w:r>
+        <w:t xml:space="preserve"> mengikat nilai elemen warna maupun spasi agar lebih </w:t>
+      </w:r>
+      <w:r>
+        <w:rPr>
+          <w:lang w:val="en-US"/>
+        </w:rPr>
+        <w:t>konsisten</w:t>
+      </w:r>
+      <w:r>
+        <w:t>. Proses perancangan interaksi ini dibatasi pada simulasi fungsi mandiri di masing-masing halaman dan tidak mencakup jalinan alur menyeluruh antar-modul platform secara luas.</w:t>
+      </w:r>
+    </w:p>
+    <w:p>
+      <w:pPr>
+        <w:ind w:firstLine="540"/>
+      </w:pPr>
+      <w:r>
+        <w:t xml:space="preserve">Sebagai tahap akhir dari siklus kerja harian, penulis bertanggung jawab penuh dalam fase validasi internal bersama tim produk. Penulis secara berkala mengikuti sesi asistensi dan </w:t>
+      </w:r>
+      <w:r>
+        <w:rPr>
+          <w:i/>
+          <w:iCs/>
+        </w:rPr>
+        <w:t>design review</w:t>
+      </w:r>
+      <w:r>
+        <w:t xml:space="preserve"> langsung dengan </w:t>
+      </w:r>
+      <w:r>
+        <w:rPr>
+          <w:i/>
+          <w:iCs/>
+        </w:rPr>
+        <w:t>Product Designer</w:t>
+      </w:r>
+      <w:r>
+        <w:t xml:space="preserve"> senior untuk memaparkan hasil implementasi komponen </w:t>
+      </w:r>
+      <w:r>
+        <w:rPr>
+          <w:i/>
+          <w:iCs/>
+        </w:rPr>
+        <w:t>Design System V2</w:t>
+      </w:r>
+      <w:r>
+        <w:t xml:space="preserve"> pada halaman yang telah selesai dirancang. Melalui evaluasi tersebut, penulis berkewajiban untuk menerima masukan teknis dan segera melakukan perbaikan desain sesuai dengan </w:t>
+      </w:r>
+      <w:r>
+        <w:rPr>
+          <w:i/>
+          <w:iCs/>
+        </w:rPr>
+        <w:t>feedback</w:t>
+      </w:r>
+      <w:r>
+        <w:t xml:space="preserve"> yang diberikan oleh pembimbing lapangan. Setelah rancangan halaman tersebut mendapatkan persetujuan (</w:t>
+      </w:r>
+      <w:r>
+        <w:rPr>
+          <w:i/>
+          <w:iCs/>
+        </w:rPr>
+        <w:t>approval</w:t>
+      </w:r>
+      <w:r>
+        <w:t>) dari desainer senior, maka seluruh rangkaian tugas penulis untuk halaman tersebut dinyatakan selesai.</w:t>
+      </w:r>
+    </w:p>
+    <w:p>
+      <w:pPr>
+        <w:pStyle w:val="Heading1"/>
+        <w:numPr>
+          <w:ilvl w:val="0"/>
+          <w:numId w:val="33"/>
+        </w:numPr>
+        <w:ind w:left="540" w:hanging="540"/>
+        <w:jc w:val="both"/>
+        <w:rPr>
+          <w:szCs w:val="24"/>
+        </w:rPr>
+      </w:pPr>
+      <w:r>
+        <w:rPr>
+          <w:sz w:val="24"/>
+          <w:szCs w:val="28"/>
+        </w:rPr>
+        <w:t>Landasan Teori</w:t>
+      </w:r>
+    </w:p>
+    <w:p>
+      <w:pPr>
+        <w:pStyle w:val="anaksub-bab"/>
+        <w:numPr>
+          <w:ilvl w:val="0"/>
+          <w:numId w:val="36"/>
+        </w:numPr>
+        <w:ind w:hanging="720"/>
+        <w:rPr>
+          <w:i/>
+          <w:iCs/>
+        </w:rPr>
+      </w:pPr>
+      <w:r>
+        <w:rPr>
+          <w:i/>
+          <w:iCs/>
+        </w:rPr>
+        <w:t>User Interface</w:t>
+      </w:r>
+    </w:p>
+    <w:p>
+      <w:pPr>
+        <w:pStyle w:val="isianaksub-bab"/>
+        <w:rPr>
+          <w:lang w:val="en-US"/>
+        </w:rPr>
+      </w:pPr>
+      <w:r>
+        <w:rPr>
+          <w:i/>
+          <w:iCs w:val="0"/>
+        </w:rPr>
+        <w:lastRenderedPageBreak/>
+        <w:t>User Interface</w:t>
+      </w:r>
+      <w:r>
+        <w:t xml:space="preserve"> (</w:t>
+      </w:r>
+      <w:r>
+        <w:rPr>
+          <w:i/>
+          <w:iCs w:val="0"/>
+        </w:rPr>
+        <w:t>UI</w:t>
+      </w:r>
+      <w:r>
+        <w:t xml:space="preserve">) merupakan aspek yang sangat penting dalam pengembangan sistem digital, aplikasi </w:t>
+      </w:r>
+      <w:r>
+        <w:rPr>
+          <w:i/>
+          <w:iCs w:val="0"/>
+        </w:rPr>
+        <w:t>mobile</w:t>
+      </w:r>
+      <w:r>
+        <w:t xml:space="preserve">, perangkat lunak </w:t>
+      </w:r>
+      <w:r>
+        <w:rPr>
+          <w:i/>
+          <w:iCs w:val="0"/>
+        </w:rPr>
+        <w:t>desktop</w:t>
+      </w:r>
+      <w:r>
+        <w:t xml:space="preserve">, maupun platform </w:t>
+      </w:r>
+      <w:r>
+        <w:rPr>
+          <w:lang w:val="en-US"/>
+        </w:rPr>
+        <w:t>website</w:t>
+      </w:r>
+      <w:r>
+        <w:t xml:space="preserve">. </w:t>
+      </w:r>
+      <w:r>
+        <w:rPr>
+          <w:i/>
+          <w:iCs w:val="0"/>
+        </w:rPr>
+        <w:t>UI</w:t>
+      </w:r>
+      <w:r>
+        <w:t xml:space="preserve"> berperan sebagai jembatan utama antara </w:t>
+      </w:r>
+      <w:r>
+        <w:rPr>
+          <w:i/>
+          <w:iCs w:val="0"/>
+          <w:lang w:val="en-US"/>
+        </w:rPr>
+        <w:t>user</w:t>
+      </w:r>
+      <w:r>
+        <w:t xml:space="preserve"> dengan</w:t>
+      </w:r>
+      <w:r>
+        <w:rPr>
+          <w:lang w:val="en-US"/>
+        </w:rPr>
+        <w:t xml:space="preserve"> </w:t>
+      </w:r>
+      <w:r>
+        <w:t xml:space="preserve">perangkat lunak. </w:t>
+      </w:r>
+      <w:r>
+        <w:rPr>
+          <w:i/>
+          <w:iCs w:val="0"/>
+        </w:rPr>
+        <w:t>User Interface</w:t>
+      </w:r>
+      <w:r>
+        <w:t xml:space="preserve"> adalah ilmu yang mempelajari tentang tata letak desain grafis pada tampilan sebuah </w:t>
+      </w:r>
+      <w:r>
+        <w:rPr>
+          <w:lang w:val="en-US"/>
+        </w:rPr>
+        <w:t>website</w:t>
+      </w:r>
+      <w:r>
+        <w:t xml:space="preserve"> atau aplikasi</w:t>
+      </w:r>
+      <w:r>
+        <w:rPr>
+          <w:lang w:val="en-US"/>
+        </w:rPr>
+        <w:t xml:space="preserve"> </w:t>
+      </w:r>
+      <w:r>
+        <w:rPr>
+          <w:lang w:val="en-US"/>
+        </w:rPr>
+        <w:fldChar w:fldCharType="begin"/>
+      </w:r>
+      <w:r>
+        <w:rPr>
+          <w:lang w:val="en-US"/>
+        </w:rPr>
+        <w:instrText xml:space="preserve"> ADDIN ZOTERO_ITEM CSL_CITATION {"citationID":"7mIwLRep","properties":{"unsorted":false,"formattedCitation":"(Jamilah &amp; Padmasari, 2022)","plainCitation":"(Jamilah &amp; Padmasari, 2022)","noteIndex":0},"citationItems":[{"id":67,"uris":["http://zotero.org/users/local/Tywae54I/items/P85AQUUT"],"itemData":{"id":67,"type":"article-journal","abstract":"Mental health has a very important influence in human life. If someone has a mental health disorder, then his life will also be disrupted. The rise of mental health cases that occur today is a problem that must be overcome. Say.co is a mental health application that can help people with mental health disorders to get direct treatment from experts. In this application, there are several features that can be useful for people with mental health, including consultations, chat bots, activity recommendations, song recommendations, food recommendations, mood boards, and information about mental health. The method used in designing this application is a literature study and pays attention to important aspects that must exist in the user interface and user experience. This design is useful for providing information about the features and appearance of the say.co application.","language":"id","source":"Zotero","title":"PERANCANGAN USER INTERFACE DAN USER EXPERIENCE APLIKASI SAY.CO","volume":"9","author":[{"family":"Jamilah","given":"Yulianti Siti"},{"family":"Padmasari","given":"Ayung Candra"}],"issued":{"date-parts":[["2022"]]}}}],"schema":"https://github.com/citation-style-language/schema/raw/master/csl-citation.json"} </w:instrText>
+      </w:r>
+      <w:r>
+        <w:rPr>
+          <w:lang w:val="en-US"/>
+        </w:rPr>
+        <w:fldChar w:fldCharType="separate"/>
+      </w:r>
+      <w:r>
+        <w:rPr>
+          <w:rFonts w:cs="Times New Roman"/>
+        </w:rPr>
+        <w:t>(Jamilah &amp; Padmasari, 2022)</w:t>
+      </w:r>
+      <w:r>
+        <w:rPr>
+          <w:lang w:val="en-US"/>
+        </w:rPr>
+        <w:fldChar w:fldCharType="end"/>
+      </w:r>
+      <w:r>
+        <w:t xml:space="preserve">. </w:t>
+      </w:r>
+      <w:r>
+        <w:rPr>
+          <w:i/>
+          <w:iCs w:val="0"/>
+        </w:rPr>
+        <w:t>UI</w:t>
+      </w:r>
+      <w:r>
+        <w:t xml:space="preserve"> lebih berfokus pada keindahan tampilan, </w:t>
+      </w:r>
+      <w:r>
+        <w:t>ni mencakup semua aspek grafis, mulai dari tata letak (</w:t>
+      </w:r>
+      <w:r>
+        <w:rPr>
+          <w:i/>
+          <w:iCs w:val="0"/>
+        </w:rPr>
+        <w:t>layout</w:t>
+      </w:r>
+      <w:r>
+        <w:t>), skema warna, tipografi, ikon, tombol, hingga animasi dan transisi antar  halaman</w:t>
+      </w:r>
+      <w:r>
+        <w:rPr>
+          <w:lang w:val="en-US"/>
+        </w:rPr>
+        <w:t xml:space="preserve"> </w:t>
+      </w:r>
+      <w:r>
+        <w:rPr>
+          <w:lang w:val="en-US"/>
+        </w:rPr>
+        <w:fldChar w:fldCharType="begin"/>
+      </w:r>
+      <w:r>
+        <w:rPr>
+          <w:lang w:val="en-US"/>
+        </w:rPr>
+        <w:instrText xml:space="preserve"> ADDIN ZOTERO_ITEM CSL_CITATION {"citationID":"T4ecob9E","properties":{"unsorted":false,"formattedCitation":"(Ayada &amp; Hammad, 2023)","plainCitation":"(Ayada &amp; Hammad, 2023)","noteIndex":0},"citationItems":[{"id":75,"uris":["http://zotero.org/users/local/Tywae54I/items/RXKRZ5PR"],"itemData":{"id":75,"type":"article-journal","container-title":"International Design Journal","DOI":"10.21608/idj.2023.305364","ISSN":"2090-9640","issue":"4","journalAbbreviation":"International Design Journal","language":"en","page":"339-354","source":"DOI.org (Crossref)","title":"Design Quality Criteria for Smartphone Applications Interface and its Impact on User Experience and Usability","volume":"13","author":[{"family":"Ayada","given":"Wesam"},{"family":"Hammad","given":"Maram"}],"issued":{"date-parts":[["2023",7,1]]}}}],"schema":"https://github.com/citation-style-language/schema/raw/master/csl-citation.json"} </w:instrText>
+      </w:r>
+      <w:r>
+        <w:rPr>
+          <w:lang w:val="en-US"/>
+        </w:rPr>
+        <w:fldChar w:fldCharType="separate"/>
+      </w:r>
+      <w:r>
+        <w:rPr>
+          <w:rFonts w:cs="Times New Roman"/>
+        </w:rPr>
+        <w:t>(Ayada &amp; Hammad, 2023)</w:t>
+      </w:r>
+      <w:r>
+        <w:rPr>
+          <w:lang w:val="en-US"/>
+        </w:rPr>
+        <w:fldChar w:fldCharType="end"/>
+      </w:r>
+      <w:r>
+        <w:rPr>
+          <w:lang w:val="en-US"/>
+        </w:rPr>
+        <w:t>.</w:t>
+      </w:r>
+    </w:p>
+    <w:p>
+      <w:pPr>
+        <w:pStyle w:val="anaksub-bab"/>
+        <w:numPr>
+          <w:ilvl w:val="0"/>
+          <w:numId w:val="36"/>
+        </w:numPr>
+        <w:ind w:hanging="720"/>
+        <w:rPr>
+          <w:i/>
+          <w:iCs/>
+        </w:rPr>
+      </w:pPr>
+      <w:r>
+        <w:rPr>
+          <w:i/>
+          <w:iCs/>
+        </w:rPr>
+        <w:t>Design System</w:t>
+      </w:r>
+    </w:p>
+    <w:p>
+      <w:pPr>
+        <w:pStyle w:val="isianaksub-bab"/>
+      </w:pPr>
+      <w:r>
+        <w:rPr>
+          <w:i/>
+        </w:rPr>
+        <w:t>Design system</w:t>
+      </w:r>
+      <w:r>
+        <w:t xml:space="preserve"> merupakan sebuah infrastruktur pengembangan produk digital yang mengintegrasikan sekumpulan standar, panduan gaya (</w:t>
+      </w:r>
+      <w:r>
+        <w:rPr>
+          <w:i/>
+        </w:rPr>
+        <w:t>style guides</w:t>
+      </w:r>
+      <w:r>
+        <w:t xml:space="preserve">), serta komponen </w:t>
+      </w:r>
+      <w:r>
+        <w:rPr>
+          <w:i/>
+        </w:rPr>
+        <w:t>User Interface</w:t>
+      </w:r>
+      <w:r>
+        <w:t xml:space="preserve"> (</w:t>
+      </w:r>
+      <w:r>
+        <w:rPr>
+          <w:i/>
+          <w:iCs w:val="0"/>
+        </w:rPr>
+        <w:t>UI</w:t>
+      </w:r>
+      <w:r>
+        <w:t xml:space="preserve">) </w:t>
+      </w:r>
+      <w:r>
+        <w:rPr>
+          <w:i/>
+        </w:rPr>
+        <w:t>reusable</w:t>
+      </w:r>
+      <w:r>
+        <w:t xml:space="preserve"> yang terperinci ke dalam satu dokumentasi terpusat. </w:t>
+      </w:r>
+      <w:r>
+        <w:rPr>
+          <w:i/>
+          <w:iCs w:val="0"/>
+          <w:lang w:val="en-US"/>
+        </w:rPr>
+        <w:t>D</w:t>
+      </w:r>
+      <w:r>
+        <w:rPr>
+          <w:i/>
+        </w:rPr>
+        <w:t>esign system</w:t>
+      </w:r>
+      <w:r>
+        <w:t xml:space="preserve"> bertindak sebagai sekumpulan pola teratur yang saling berhubungan untuk mempercepat dan mempermudah proses kolaborasi produk digital</w:t>
+      </w:r>
+      <w:r>
+        <w:rPr>
+          <w:lang w:val="en-US"/>
+        </w:rPr>
+        <w:t xml:space="preserve"> </w:t>
+      </w:r>
+      <w:r>
+        <w:rPr>
+          <w:lang w:val="en-US"/>
+        </w:rPr>
+        <w:fldChar w:fldCharType="begin"/>
+      </w:r>
+      <w:r>
+        <w:rPr>
+          <w:lang w:val="en-US"/>
+        </w:rPr>
+        <w:instrText xml:space="preserve"> ADDIN ZOTERO_ITEM CSL_CITATION {"citationID":"Bz0N6cvv","properties":{"unsorted":false,"formattedCitation":"(Kurniawan, 2024b)","plainCitation":"(Kurniawan, 2024b)","noteIndex":0},"citationItems":[{"id":5,"uris":["http://zotero.org/users/local/Tywae54I/items/6HNZEHRM"],"itemData":{"id":5,"type":"article-journal","abstract":"Kehadiran produk digital telah menjadi bagian integral dari kehidupan sehari-hari manusia. Antarmuka pengguna (UI) memiliki peran sentral dalam menentukan keberhasilan dan adopsi produk. Konsistensi dan koherensi dalam desain UI menjadi kunci untuk memastikan pengguna dapat dengan mudah memahami dan menggunakan produk secara efisien. Meskipun demikian, menciptakan UI yang konsisten, terutama untuk produk digital yang kompleks, merupakan tantangan yang tidak ringan. Oleh karena itu, Design System muncul sebagai solusi inovatif. Dari perspektif pengalaman pengguna, konsistensi dianggap sebagai faktor krusial yang mempengaruhi kemudahan pengguna dalam berinteraksi dengan desain. Penelitian ini bertujuan untuk mengkaji penerapan pendekatan atomic design dan A/B testing dalam pembuatan Design System dengan studi kasus pada perusahaan Asuransi Astra Buana. Diharapkan temuan penelitian ini dapat memberikan kontribusi teoritis dan praktis dalam pengembangan Design System yang efektif dan efisien.","container-title":"Jurnal Teknologi  Dan Sistem Informasi Bisnis","DOI":"10.47233/jteksis.v6i3.1346","ISSN":"2655-8238, 2964-2132","issue":"3","journalAbbreviation":"JTEKSIS","license":"http://creativecommons.org/licenses/by/4.0","page":"543-549","source":"DOI.org (Crossref)","title":"Pembuatan Design System Menggunakan Pendekatan Atomic Design dan A/B Testing","volume":"6","author":[{"family":"Kurniawan","given":"Reyhan Adinata"}],"issued":{"date-parts":[["2024",7,10]]}}}],"schema":"https://github.com/citation-style-language/schema/raw/master/csl-citation.json"} </w:instrText>
+      </w:r>
+      <w:r>
+        <w:rPr>
+          <w:lang w:val="en-US"/>
+        </w:rPr>
+        <w:fldChar w:fldCharType="separate"/>
+      </w:r>
+      <w:r>
+        <w:rPr>
+          <w:rFonts w:cs="Times New Roman"/>
+        </w:rPr>
+        <w:t>(Kurniawan, 2024b)</w:t>
+      </w:r>
+      <w:r>
+        <w:rPr>
+          <w:lang w:val="en-US"/>
+        </w:rPr>
+        <w:fldChar w:fldCharType="end"/>
+      </w:r>
+      <w:r>
+        <w:t xml:space="preserve">. Kehadiran </w:t>
+      </w:r>
+      <w:r>
+        <w:rPr>
+          <w:i/>
+        </w:rPr>
+        <w:t>design system</w:t>
+      </w:r>
+      <w:r>
+        <w:t xml:space="preserve"> ini krusial dalam memotong waktu pengerjaan visual antarmuka karena aset desain yang bersifat berulang dapat langsung digunakan kembali</w:t>
+      </w:r>
+      <w:r>
+        <w:rPr>
+          <w:lang w:val="en-US"/>
+        </w:rPr>
+        <w:t xml:space="preserve"> </w:t>
+      </w:r>
+      <w:r>
+        <w:rPr>
+          <w:lang w:val="en-US"/>
+        </w:rPr>
+        <w:fldChar w:fldCharType="begin"/>
+      </w:r>
+      <w:r>
+        <w:rPr>
+          <w:lang w:val="en-US"/>
+        </w:rPr>
+        <w:instrText xml:space="preserve"> ADDIN ZOTERO_ITEM CSL_CITATION {"citationID":"qKJhXlQl","properties":{"unsorted":false,"formattedCitation":"(Setiawan dkk., 2023)","plainCitation":"(Setiawan dkk., 2023)","noteIndex":0},"citationItems":[{"id":58,"uris":["http://zotero.org/users/local/Tywae54I/items/PPF7WAZ2"],"itemData":{"id":58,"type":"article-journal","abstract":"Dalam mengembangkan sistem perangkat lunak, selama ini belum ada aturan tentang pola standar interface pada perangkat lunak berbasis web. Masalah inkonsistensi pada gaya desain antar perangkat lunak dan waktu yang dibutuhkan dalam pengembangan desain interface cenderung menghabiskan waktu. Penelitian ini bertujuan untuk menghasilkan kerangka kerja desain bernama Akses Digital Design System. Pendekatan metode perancangan desain sistem yang digunakan dalam penelitian ini adalah Atomic Design. Pada penelitian ini design system yang dibangun dibatasi berupa elemen product yang terdiri dari functional pattern dan perceptual pattern. Adapun hasil atau artefak keluaran menghasilkan design system yang terdiri perceptual pattern dan functional pattern dalam bentuk pattern library, style guide dan code library. Dari hasil penelitian, design system dapat meningkatkan produktivitas dalam mendesain antarmuka pengguna sehingga waktu yang diperlukan dapat dikurangi. Hal ini dikarenakan adanya dokumentasi sebagai panduan terkait komponen-komponen yang akan digunakan sebagai elemen dasar standar. Selain itu, desain user interface yang dihasilkan lebih menyatu dan konsisten.","container-title":"Jurnal Teknologi Terpadu","DOI":"10.54914/jtt.v9i1.619","ISSN":"2460-7908, 2477-0043","issue":"1","journalAbbreviation":"j. teknologi terpadu","license":"https://creativecommons.org/licenses/by-nc-sa/4.0","page":"56-64","source":"DOI.org (Crossref)","title":"Design System pada Perancangan Antarmuka Perangkat Lunak Sistem Akses Digital","volume":"9","author":[{"family":"Setiawan","given":"Apriansyah Rizqi"},{"family":"Asfi","given":"Marsani"},{"family":"Sevtiana","given":"Agus"},{"family":"Pranata","given":"Sudadi"},{"family":"Septian","given":"Willy Eka"}],"issued":{"date-parts":[["2023",7,4]]}}}],"schema":"https://github.com/citation-style-language/schema/raw/master/csl-citation.json"} </w:instrText>
+      </w:r>
+      <w:r>
+        <w:rPr>
+          <w:lang w:val="en-US"/>
+        </w:rPr>
+        <w:fldChar w:fldCharType="separate"/>
+      </w:r>
+      <w:r>
+        <w:rPr>
+          <w:rFonts w:cs="Times New Roman"/>
+        </w:rPr>
+        <w:t>(Setiawan dkk., 2023)</w:t>
+      </w:r>
+      <w:r>
+        <w:rPr>
+          <w:lang w:val="en-US"/>
+        </w:rPr>
+        <w:fldChar w:fldCharType="end"/>
+      </w:r>
+      <w:r>
+        <w:t xml:space="preserve">. Dalam skala industri, penerapan </w:t>
+      </w:r>
+      <w:r>
+        <w:rPr>
+          <w:i/>
+        </w:rPr>
+        <w:t>design system</w:t>
+      </w:r>
+      <w:r>
+        <w:t xml:space="preserve"> yang konsisten terbukti efektif menjaga keseragaman elemen visual di seluruh halaman aplikasi sekaligus meningkatkan produktivitas antara tim desainer dan tim pengembang</w:t>
+      </w:r>
+      <w:r>
+        <w:rPr>
+          <w:lang w:val="en-US"/>
+        </w:rPr>
+        <w:t xml:space="preserve"> </w:t>
+      </w:r>
+      <w:r>
+        <w:rPr>
+          <w:lang w:val="en-US"/>
+        </w:rPr>
+        <w:fldChar w:fldCharType="begin"/>
+      </w:r>
+      <w:r>
+        <w:rPr>
+          <w:lang w:val="en-US"/>
+        </w:rPr>
+        <w:instrText xml:space="preserve"> ADDIN ZOTERO_ITEM CSL_CITATION {"citationID":"MGdRVV8e","properties":{"unsorted":false,"formattedCitation":"(Setiawan dkk., 2023)","plainCitation":"(Setiawan dkk., 2023)","noteIndex":0},"citationItems":[{"id":58,"uris":["http://zotero.org/users/local/Tywae54I/items/PPF7WAZ2"],"itemData":{"id":58,"type":"article-journal","abstract":"Dalam mengembangkan sistem perangkat lunak, selama ini belum ada aturan tentang pola standar interface pada perangkat lunak berbasis web. Masalah inkonsistensi pada gaya desain antar perangkat lunak dan waktu yang dibutuhkan dalam pengembangan desain interface cenderung menghabiskan waktu. Penelitian ini bertujuan untuk menghasilkan kerangka kerja desain bernama Akses Digital Design System. Pendekatan metode perancangan desain sistem yang digunakan dalam penelitian ini adalah Atomic Design. Pada penelitian ini design system yang dibangun dibatasi berupa elemen product yang terdiri dari functional pattern dan perceptual pattern. Adapun hasil atau artefak keluaran menghasilkan design system yang terdiri perceptual pattern dan functional pattern dalam bentuk pattern library, style guide dan code library. Dari hasil penelitian, design system dapat meningkatkan produktivitas dalam mendesain antarmuka pengguna sehingga waktu yang diperlukan dapat dikurangi. Hal ini dikarenakan adanya dokumentasi sebagai panduan terkait komponen-komponen yang akan digunakan sebagai elemen dasar standar. Selain itu, desain user interface yang dihasilkan lebih menyatu dan konsisten.","container-title":"Jurnal Teknologi Terpadu","DOI":"10.54914/jtt.v9i1.619","ISSN":"2460-7908, 2477-0043","issue":"1","journalAbbreviation":"j. teknologi terpadu","license":"https://creativecommons.org/licenses/by-nc-sa/4.0","page":"56-64","source":"DOI.org (Crossref)","title":"Design System pada Perancangan Antarmuka Perangkat Lunak Sistem Akses Digital","volume":"9","author":[{"family":"Setiawan","given":"Apriansyah Rizqi"},{"family":"Asfi","given":"Marsani"},{"family":"Sevtiana","given":"Agus"},{"family":"Pranata","given":"Sudadi"},{"family":"Septian","given":"Willy Eka"}],"issued":{"date-parts":[["2023",7,4]]}}}],"schema":"https://github.com/citation-style-language/schema/raw/master/csl-citation.json"} </w:instrText>
+      </w:r>
+      <w:r>
+        <w:rPr>
+          <w:lang w:val="en-US"/>
+        </w:rPr>
+        <w:fldChar w:fldCharType="separate"/>
+      </w:r>
+      <w:r>
+        <w:rPr>
+          <w:rFonts w:cs="Times New Roman"/>
+        </w:rPr>
+        <w:t>(Setiawan dkk., 2023)</w:t>
+      </w:r>
+      <w:r>
+        <w:rPr>
+          <w:lang w:val="en-US"/>
+        </w:rPr>
+        <w:fldChar w:fldCharType="end"/>
+      </w:r>
+      <w:r>
+        <w:t>.</w:t>
+      </w:r>
+    </w:p>
+    <w:p>
+      <w:pPr>
+        <w:pStyle w:val="anaksub-bab"/>
+        <w:numPr>
+          <w:ilvl w:val="0"/>
+          <w:numId w:val="36"/>
+        </w:numPr>
+        <w:ind w:hanging="720"/>
+      </w:pPr>
+      <w:r>
+        <w:rPr>
+          <w:iCs/>
+        </w:rPr>
+        <w:t>Figma</w:t>
+      </w:r>
+    </w:p>
+    <w:p>
+      <w:pPr>
+        <w:pStyle w:val="isianaksub-bab"/>
+      </w:pPr>
+      <w:r>
+        <w:t xml:space="preserve">Figma adalah sebuah perangkat lunak berbasis </w:t>
+      </w:r>
+      <w:r>
+        <w:rPr>
+          <w:i/>
+        </w:rPr>
+        <w:t>cloud</w:t>
+      </w:r>
+      <w:r>
+        <w:t xml:space="preserve"> yang digunakan untuk perancangan </w:t>
+      </w:r>
+      <w:r>
+        <w:rPr>
+          <w:i/>
+        </w:rPr>
+        <w:t>User Interface</w:t>
+      </w:r>
+      <w:r>
+        <w:t xml:space="preserve"> dan </w:t>
+      </w:r>
+      <w:r>
+        <w:rPr>
+          <w:i/>
+        </w:rPr>
+        <w:t>User Experience</w:t>
+      </w:r>
+      <w:r>
+        <w:t xml:space="preserve"> secara kolaboratif. Aplikasi ini mendukung ekosistem pembuatan produk berskala industri karena memungkinkan </w:t>
+      </w:r>
+      <w:r>
+        <w:rPr>
+          <w:i/>
+          <w:iCs w:val="0"/>
+        </w:rPr>
+        <w:t>UI/UX</w:t>
+      </w:r>
+      <w:r>
+        <w:rPr>
+          <w:i/>
+          <w:iCs w:val="0"/>
+          <w:lang w:val="en-US"/>
+        </w:rPr>
+        <w:t xml:space="preserve"> designer</w:t>
+      </w:r>
+      <w:r>
+        <w:t xml:space="preserve"> untuk bekerja di dalam satu </w:t>
+      </w:r>
+      <w:r>
+        <w:rPr>
+          <w:i/>
+        </w:rPr>
+        <w:t>file</w:t>
+      </w:r>
+      <w:r>
+        <w:t xml:space="preserve"> atau </w:t>
+      </w:r>
+      <w:r>
+        <w:rPr>
+          <w:i/>
+        </w:rPr>
+        <w:t>library</w:t>
+      </w:r>
+      <w:r>
+        <w:t xml:space="preserve"> komponen yang sama secara </w:t>
+      </w:r>
+      <w:r>
+        <w:rPr>
+          <w:i/>
+        </w:rPr>
+        <w:t>real-time</w:t>
+      </w:r>
+      <w:r>
+        <w:t>.</w:t>
+      </w:r>
+      <w:r>
+        <w:rPr>
+          <w:lang w:val="en-US"/>
+        </w:rPr>
+        <w:t xml:space="preserve"> </w:t>
+      </w:r>
+      <w:r>
+        <w:t xml:space="preserve">Figma memfasilitasi komunikasi yang adaptif dan sukses antar-anggota tim produk selama fase </w:t>
+      </w:r>
+      <w:r>
+        <w:lastRenderedPageBreak/>
+        <w:t>perancangan antarmuka</w:t>
+      </w:r>
+      <w:r>
+        <w:rPr>
+          <w:lang w:val="en-US"/>
+        </w:rPr>
+        <w:t xml:space="preserve"> </w:t>
+      </w:r>
+      <w:r>
+        <w:rPr>
+          <w:lang w:val="en-US"/>
+        </w:rPr>
+        <w:fldChar w:fldCharType="begin"/>
+      </w:r>
+      <w:r>
+        <w:rPr>
+          <w:lang w:val="en-US"/>
+        </w:rPr>
+        <w:instrText xml:space="preserve"> ADDIN ZOTERO_ITEM CSL_CITATION {"citationID":"eN6KoN31","properties":{"unsorted":false,"formattedCitation":"(Wijaya &amp; Testiana, 2026)","plainCitation":"(Wijaya &amp; Testiana, 2026)","noteIndex":0},"citationItems":[{"id":60,"uris":["http://zotero.org/users/local/Tywae54I/items/PMF66SPT"],"itemData":{"id":60,"type":"article-journal","abstract":"Perkembangan teknologi digital yang semakin pesat menuntut institusi pendidikan untuk menyediakan website yang informatif, mudah digunakan, dan memiliki tampilan visual yang menarik. Website Politeknik Pariwisata Palembang sebagai media utama penyampaian informasi dinilai belum sepenuhnya memenuhi prinsip User Interface (UI) dan User Experience (UX), khususnya pada aspek konsistensi visual, struktur navigasi, responsivitas, serta kenyamanan interaksi pengguna. Permasalahan tersebut berpotensi menghambat efektivitas penyampaian informasi dan menurunkan tingkat kepuasan pengguna. Penelitian ini bertujuan untuk merancang ulang UI/UX website Politeknik Pariwisata Palembang menggunakan aplikasi Figma dengan pendekatan user-centered design. Metode penelitian yang digunakan adalah Research and Development (R&amp;D) dengan model prototyping yang meliputi analisis kebutuhan pengguna, perancangan wireframe, pembuatan mockup, pengembangan prototipe interaktif, serta evaluasi desain berdasarkan umpan balik pengguna. Pengumpulan data dilakukan melalui observasi, wawancara, dan studi literatur guna memastikan desain yang dihasilkan sesuai dengan kebutuhan dan karakteristik pengguna. Hasil penelitian menunjukkan bahwa perancangan ulang UI/UX menghasilkan website yang lebih modern, responsif, dan terstruktur dengan baik. Peningkatan terlihat pada hierarki visual, kejelasan navigasi, keterbacaan konten, serta kenyamanan interaksi pengguna. Selain itu, desain baru mendukung konsistensi identitas visual institusi dan meningkatkan kemudahan akses informasi bagi mahasiswa, dosen, staf, maupun calon pengguna. Desain akhir diharapkan mampu meningkatkan pengalaman pengguna, memperkuat citra digital Politeknik Pariwisata Palembang sebagai institusi pendidikan pariwisata yang profesional, inovatif, dan adaptif terhadap perkembangan teknologi digital, serta dapat menjadi acuan bagi pengembangan website institusi pendidikan lainnya.","container-title":"RIGGS: Journal of Artificial Intelligence and Digital Business","DOI":"10.31004/riggs.v4i4.4737","ISSN":"2963-914X, 2963-9298","issue":"4","journalAbbreviation":"RIGGS","license":"https://creativecommons.org/licenses/by/4.0","page":"9981-9992","source":"DOI.org (Crossref)","title":"Perancangan UI/UX Website Menggunakan Figma di Politeknik Pariwisata Palembang","volume":"4","author":[{"family":"Wijaya","given":"Anton Sukma"},{"family":"Testiana","given":"Gusmelia"}],"issued":{"date-parts":[["2026",1,9]]}}}],"schema":"https://github.com/citation-style-language/schema/raw/master/csl-citation.json"} </w:instrText>
+      </w:r>
+      <w:r>
+        <w:rPr>
+          <w:lang w:val="en-US"/>
+        </w:rPr>
+        <w:fldChar w:fldCharType="separate"/>
+      </w:r>
+      <w:r>
+        <w:rPr>
+          <w:rFonts w:cs="Times New Roman"/>
+        </w:rPr>
+        <w:t>(Wijaya &amp; Testiana, 2026)</w:t>
+      </w:r>
+      <w:r>
+        <w:rPr>
+          <w:lang w:val="en-US"/>
+        </w:rPr>
+        <w:fldChar w:fldCharType="end"/>
+      </w:r>
+      <w:r>
+        <w:t xml:space="preserve">. Keunggulan kolaborasi </w:t>
+      </w:r>
+      <w:r>
+        <w:rPr>
+          <w:i/>
+        </w:rPr>
+        <w:t>real-time</w:t>
+      </w:r>
+      <w:r>
+        <w:t xml:space="preserve"> ini membuat Figma menjadi pilihan utama industri digital untuk mengelola aset-aset visual yang dinamis.</w:t>
+      </w:r>
+    </w:p>
+    <w:p>
+      <w:pPr>
+        <w:pStyle w:val="anaksub-bab"/>
+        <w:numPr>
+          <w:ilvl w:val="0"/>
+          <w:numId w:val="36"/>
+        </w:numPr>
+        <w:ind w:hanging="720"/>
+        <w:rPr>
+          <w:i/>
+        </w:rPr>
+      </w:pPr>
+      <w:r>
+        <w:rPr>
+          <w:i/>
+        </w:rPr>
+        <w:t>Auto Layout</w:t>
+      </w:r>
+    </w:p>
+    <w:p>
+      <w:pPr>
+        <w:pStyle w:val="isianaksub-bab"/>
+      </w:pPr>
+      <w:r>
+        <w:t>Fitur pengatur tata letak otomatis yang menyusun struktur komponen antarmuka secara responsif, di mana jarak antar-elemen dan ukuran bingkai (</w:t>
+      </w:r>
+      <w:r>
+        <w:rPr>
+          <w:i/>
+          <w:iCs w:val="0"/>
+        </w:rPr>
+        <w:t>frame</w:t>
+      </w:r>
+      <w:r>
+        <w:t xml:space="preserve">) akan menyesuaikan secara otomatis mengikuti konten di dalamnya. </w:t>
+      </w:r>
+      <w:r>
+        <w:rPr>
+          <w:lang w:val="en-US"/>
+        </w:rPr>
+        <w:t>P</w:t>
+      </w:r>
+      <w:r>
+        <w:t xml:space="preserve">enggunaan fitur </w:t>
+      </w:r>
+      <w:r>
+        <w:rPr>
+          <w:i/>
+          <w:iCs w:val="0"/>
+        </w:rPr>
+        <w:t>Auto Layout</w:t>
+      </w:r>
+      <w:r>
+        <w:t xml:space="preserve"> pada Figma sangat penting untuk membuat struktur desain halaman web menjadi lebih konsisten, fleksibel, serta adaptif terhadap perubahan konten.</w:t>
+      </w:r>
+    </w:p>
+    <w:p>
+      <w:pPr>
+        <w:pStyle w:val="anaksub-bab"/>
+        <w:numPr>
+          <w:ilvl w:val="0"/>
+          <w:numId w:val="36"/>
+        </w:numPr>
+        <w:ind w:hanging="720"/>
+        <w:rPr>
+          <w:i/>
+        </w:rPr>
+      </w:pPr>
+      <w:r>
+        <w:rPr>
+          <w:i/>
+        </w:rPr>
+        <w:t>Component Sets</w:t>
+      </w:r>
+    </w:p>
+    <w:p>
+      <w:pPr>
+        <w:pStyle w:val="isianaksub-bab"/>
+      </w:pPr>
+      <w:r>
+        <w:t xml:space="preserve">Fitur manajemen komponen yang berfungsi mengelompokkan variasi status dari satu komponen sejenis seperti status tombol </w:t>
+      </w:r>
+      <w:r>
+        <w:rPr>
+          <w:i/>
+          <w:iCs w:val="0"/>
+        </w:rPr>
+        <w:t>default, hover,</w:t>
+      </w:r>
+      <w:r>
+        <w:t xml:space="preserve"> dan </w:t>
+      </w:r>
+      <w:r>
+        <w:rPr>
+          <w:i/>
+          <w:iCs w:val="0"/>
+        </w:rPr>
+        <w:t>disabled</w:t>
+      </w:r>
+      <w:r>
+        <w:t xml:space="preserve"> ke dalam satu aset tunggal. </w:t>
+      </w:r>
+      <w:r>
+        <w:rPr>
+          <w:lang w:val="en-US"/>
+        </w:rPr>
+        <w:t>P</w:t>
+      </w:r>
+      <w:r>
+        <w:t>engelompokan komponen melalui aset terpadu di Figma terbukti mempermudah tim desainer dalam mengorganisasi aset visual secara rapi sehingga meminimalisir pengerjaan ulang (</w:t>
+      </w:r>
+      <w:r>
+        <w:rPr>
+          <w:i/>
+          <w:iCs w:val="0"/>
+        </w:rPr>
+        <w:t>rework</w:t>
+      </w:r>
+      <w:r>
+        <w:t>) yang tidak efisien.</w:t>
+      </w:r>
+    </w:p>
+    <w:p>
+      <w:pPr>
+        <w:pStyle w:val="anaksub-bab"/>
+        <w:numPr>
+          <w:ilvl w:val="0"/>
+          <w:numId w:val="36"/>
+        </w:numPr>
+        <w:ind w:hanging="720"/>
+        <w:rPr>
+          <w:i/>
+        </w:rPr>
+      </w:pPr>
+      <w:r>
+        <w:rPr>
+          <w:i/>
+        </w:rPr>
+        <w:t>Variables</w:t>
+      </w:r>
+      <w:r>
+        <w:rPr>
+          <w:iCs/>
+        </w:rPr>
+        <w:t>/</w:t>
+      </w:r>
+      <w:r>
+        <w:rPr>
+          <w:i/>
+        </w:rPr>
+        <w:t>Design Tokens</w:t>
+      </w:r>
+    </w:p>
+    <w:p>
+      <w:pPr>
+        <w:pStyle w:val="isianaksub-bab"/>
+      </w:pPr>
+      <w:r>
+        <w:t xml:space="preserve">Fitur penyimpanan nilai-nilai spesifik dari elemen desain seperti kode warna, ukuran spasi, atau teks ke dalam bentuk variabel terpusat. </w:t>
+      </w:r>
+      <w:r>
+        <w:rPr>
+          <w:lang w:val="en-US"/>
+        </w:rPr>
+        <w:t>P</w:t>
+      </w:r>
+      <w:r>
+        <w:t>enerapan variabel desain (</w:t>
+      </w:r>
+      <w:r>
+        <w:rPr>
+          <w:i/>
+          <w:iCs w:val="0"/>
+        </w:rPr>
+        <w:t>design tokens</w:t>
+      </w:r>
+      <w:r>
+        <w:t>) sangat krusial dalam mempercepat proses pembaruan tema visual secara terpusat, menghemat waktu produksi, serta menjaga konsistensi nilai visual sistem desain secara jangka panjang.</w:t>
+      </w:r>
+    </w:p>
+    <w:p>
+      <w:pPr>
+        <w:pStyle w:val="anaksub-bab"/>
+        <w:numPr>
+          <w:ilvl w:val="0"/>
+          <w:numId w:val="36"/>
+        </w:numPr>
+        <w:ind w:hanging="720"/>
+        <w:rPr>
+          <w:i/>
+          <w:iCs/>
+        </w:rPr>
+      </w:pPr>
+      <w:r>
+        <w:rPr>
+          <w:i/>
+          <w:iCs/>
+        </w:rPr>
+        <w:t>High-Fidelity Prototype</w:t>
+      </w:r>
+    </w:p>
+    <w:p>
+      <w:pPr>
+        <w:pStyle w:val="isianaksub-bab"/>
+      </w:pPr>
+      <w:r>
+        <w:rPr>
+          <w:i/>
+          <w:iCs w:val="0"/>
+        </w:rPr>
+        <w:t>High-fidelity prototype</w:t>
+      </w:r>
+      <w:r>
+        <w:t xml:space="preserve"> </w:t>
+      </w:r>
+      <w:r>
+        <w:t>adalah purwarupa dari rancangan awal tampilan yang akan dikembangkan</w:t>
+      </w:r>
+      <w:r>
+        <w:rPr>
+          <w:lang w:val="en-US"/>
+        </w:rPr>
+        <w:t xml:space="preserve"> </w:t>
+      </w:r>
+      <w:r>
+        <w:rPr>
+          <w:lang w:val="en-US"/>
+        </w:rPr>
+        <w:fldChar w:fldCharType="begin"/>
+      </w:r>
+      <w:r>
+        <w:rPr>
+          <w:lang w:val="en-US"/>
+        </w:rPr>
+        <w:instrText xml:space="preserve"> ADDIN ZOTERO_ITEM CSL_CITATION {"citationID":"Jh23hHfc","properties":{"unsorted":false,"formattedCitation":"(Arisa dkk., 2023)","plainCitation":"(Arisa dkk., 2023)","noteIndex":0},"citationItems":[{"id":76,"uris":["http://zotero.org/users/local/Tywae54I/items/KPSQG8T9"],"itemData":{"id":76,"type":"article-journal","abstract":"Berkembangnya teknologi di era digital saat ini sangat mempengaruhi berbagai sektor industri. Industri yang berdampak atas perkembangan teknologi informasi adalah sektor industri di bidang keuangan atau fintech (Financial Techology). CROWDE merupakan perusahaan yang bergerak di bidang usaha financial technology menghubungkan petani dan pengusaha tani dengan pemodal. Permasalahan yang sedang dihadapi oleh perusahaan CROWDE yakni target pasar yang dijangkau saat ini oleh website CROWDE hanya menjangkau 1 target saja yakni petani. Hal tersebut yang membuat CROWDE ingin merancang ulang tampilan antarmuka dan pengalaman pengguna terhadap website CROWDE. Adapun tujuan penelitian dilakukan untuk menjawab permasalahan yang sedang dihadapi oleh website CROWDE, menghasilkan rekomendasi berupa hasil solusi desain dan menghasilkan hasil analisis evaluasi terhadap solusi desain atau redesign website yang telah dibuat dari segi aspek kemudahan. Fokus penelitian ini yaitu melakukan perancangan ulang Platform Website CROWDE dari segi tampilan antar muka (User Interface) dan pengalaman pengguna (User Experience) dengan menggunakan metode desaign thinking. Tahapan penelitian yang dilakukan menggunakan pendekatan design thinking yang terdapat 5 tahapan seperti empathize, define, ideate, prototype, dan test. Hasil penelitian yang didapatkan yaitu kategori permasalahan website saat ini mulai dari segi copywriting, customer service, dan alur sistem. Kemudian untuk hasil solusi desain atau mockup yang dihasilkan sebanyak 12 menu. Tahapan pengujian terhadap 8 task dinyatakan berhasil dari segi aspek kemudahan terhadap solusi desain yang telah dibuat dengan nilai rata-rata lebih dari 5,5 untuk setiap task yang dikerjakan telah dikerjakan responden.","container-title":"Teknika","DOI":"10.34148/teknika.v12i1.549","ISSN":"2549-8045, 2549-8037","issue":"1","journalAbbreviation":"teknika","license":"https://creativecommons.org/licenses/by-sa/4.0","page":"18-26","source":"DOI.org (Crossref)","title":"Perancangan Prototipe UI/UX Website CROWDE Menggunakan Metode Design Thinking","volume":"12","author":[{"family":"Arisa","given":"Nursanti Novi"},{"family":"Fahri","given":"Muhammad"},{"family":"Putera","given":"M. Ihsan Alfani"},{"family":"Putra","given":"M. Gilvy Langgawan"}],"issued":{"date-parts":[["2023",2,16]]}}}],"schema":"https://github.com/citation-style-language/schema/raw/master/csl-citation.json"} </w:instrText>
+      </w:r>
+      <w:r>
+        <w:rPr>
+          <w:lang w:val="en-US"/>
+        </w:rPr>
+        <w:fldChar w:fldCharType="separate"/>
+      </w:r>
+      <w:r>
+        <w:rPr>
+          <w:rFonts w:cs="Times New Roman"/>
+        </w:rPr>
+        <w:t>(Arisa dkk., 2023)</w:t>
+      </w:r>
+      <w:r>
+        <w:rPr>
+          <w:lang w:val="en-US"/>
+        </w:rPr>
+        <w:fldChar w:fldCharType="end"/>
+      </w:r>
+      <w:r>
+        <w:rPr>
+          <w:lang w:val="en-US"/>
+        </w:rPr>
+        <w:t>.</w:t>
+      </w:r>
+      <w:r>
+        <w:t xml:space="preserve"> </w:t>
+      </w:r>
+      <w:r>
+        <w:rPr>
+          <w:lang w:val="en-US"/>
+        </w:rPr>
+        <w:t xml:space="preserve">Prototype merupakan </w:t>
+      </w:r>
+      <w:r>
+        <w:t xml:space="preserve">model simulasi interaktif dari produk digital yang memiliki tingkat presisi dan kemiripan sangat tinggi dengan produk aslinya, baik dari segi visual, tata </w:t>
+      </w:r>
+      <w:r>
+        <w:lastRenderedPageBreak/>
+        <w:t xml:space="preserve">letak, warna, tipografi, maupun detail interaksi antarmuka. </w:t>
+      </w:r>
+      <w:r>
+        <w:rPr>
+          <w:lang w:val="en-US"/>
+        </w:rPr>
+        <w:t>P</w:t>
+      </w:r>
+      <w:r>
+        <w:t xml:space="preserve">embuatan </w:t>
+      </w:r>
+      <w:r>
+        <w:rPr>
+          <w:i/>
+          <w:iCs w:val="0"/>
+        </w:rPr>
+        <w:t>high-fidelity prototype</w:t>
+      </w:r>
+      <w:r>
+        <w:t xml:space="preserve"> merupakan tahapan penting untuk mematangkan konsep antarmuka sebelum diserahkan kepada tim pengembang. Di dalam Figma, pembuatan </w:t>
+      </w:r>
+      <w:r>
+        <w:rPr>
+          <w:i/>
+          <w:iCs w:val="0"/>
+        </w:rPr>
+        <w:t>high-fidelity prototype</w:t>
+      </w:r>
+      <w:r>
+        <w:t xml:space="preserve"> dilakukan dengan menghubungkan </w:t>
+      </w:r>
+      <w:r>
+        <w:rPr>
+          <w:i/>
+          <w:iCs w:val="0"/>
+        </w:rPr>
+        <w:t>state</w:t>
+      </w:r>
+      <w:r>
+        <w:t xml:space="preserve"> atau interaksi spesifik pada komponen per halaman untuk menyimulasikan alur operasional aplikasi sebelum masuk ke tahap pengkodean, sehingga meminimalkan beban kognitif pengguna saat melakukan pengujian fungsional.</w:t>
+      </w:r>
+    </w:p>
+    <w:p>
+      <w:pPr>
+        <w:pStyle w:val="Heading1"/>
+        <w:numPr>
+          <w:ilvl w:val="0"/>
+          <w:numId w:val="33"/>
+        </w:numPr>
+        <w:ind w:left="540" w:hanging="540"/>
+        <w:jc w:val="both"/>
+        <w:rPr>
+          <w:sz w:val="24"/>
+          <w:szCs w:val="24"/>
+        </w:rPr>
+      </w:pPr>
+      <w:r>
+        <w:rPr>
+          <w:sz w:val="24"/>
+          <w:szCs w:val="24"/>
+        </w:rPr>
+        <w:t>Sistem dan Prosedur Kerja</w:t>
+      </w:r>
+    </w:p>
+    <w:p>
+      <w:pPr>
+        <w:pStyle w:val="isianaksub-bab"/>
+        <w:ind w:left="0" w:firstLine="540"/>
+      </w:pPr>
+      <w:r>
+        <w:t>Dalam</w:t>
+      </w:r>
+      <w:r>
+        <w:t xml:space="preserve"> melaksanakan perancangan ulang halaman platform Reusely, penulis mengikuti alur prosedur kerja (</w:t>
+      </w:r>
+      <w:r>
+        <w:rPr>
+          <w:i/>
+          <w:iCs w:val="0"/>
+        </w:rPr>
+        <w:t>workflow</w:t>
+      </w:r>
+      <w:r>
+        <w:t xml:space="preserve">) </w:t>
+      </w:r>
+      <w:r>
+        <w:rPr>
+          <w:i/>
+          <w:iCs w:val="0"/>
+        </w:rPr>
+        <w:t>Product Team</w:t>
+      </w:r>
+      <w:r>
+        <w:t xml:space="preserve"> Reusely. Sistem kerja ini dirancang untuk memastikan bahwa setiap elemen visual yang bermigrasi dari </w:t>
+      </w:r>
+      <w:r>
+        <w:rPr>
+          <w:i/>
+          <w:iCs w:val="0"/>
+        </w:rPr>
+        <w:t>Design System V1</w:t>
+      </w:r>
+      <w:r>
+        <w:t xml:space="preserve"> ke </w:t>
+      </w:r>
+      <w:r>
+        <w:rPr>
+          <w:i/>
+          <w:iCs w:val="0"/>
+        </w:rPr>
+        <w:t>Design System V2</w:t>
+      </w:r>
+      <w:r>
+        <w:t xml:space="preserve"> telah melalui tahap validasi yang terukur sebelum diserahkan kepada tim pengembang (</w:t>
+      </w:r>
+      <w:r>
+        <w:rPr>
+          <w:i/>
+          <w:iCs w:val="0"/>
+        </w:rPr>
+        <w:t>frontend developer</w:t>
+      </w:r>
+      <w:r>
+        <w:t>). Prosedur kerja harian penulis terbagi ke dalam empat tahapan utama sebagai berikut:</w:t>
+      </w:r>
+    </w:p>
+    <w:p>
+      <w:pPr>
+        <w:pStyle w:val="anaksub-bab"/>
+        <w:numPr>
+          <w:ilvl w:val="0"/>
+          <w:numId w:val="38"/>
+        </w:numPr>
+        <w:ind w:left="1260" w:hanging="720"/>
+      </w:pPr>
+      <w:r>
+        <w:t xml:space="preserve">Tahap Menerima </w:t>
+      </w:r>
+      <w:r>
+        <w:rPr>
+          <w:i/>
+          <w:iCs/>
+        </w:rPr>
+        <w:t>Brief</w:t>
+      </w:r>
+      <w:r>
+        <w:t xml:space="preserve"> dan Modul Tugas</w:t>
+      </w:r>
+    </w:p>
+    <w:p>
+      <w:pPr>
+        <w:pStyle w:val="isianaksub-bab"/>
+      </w:pPr>
+      <w:r>
+        <w:t xml:space="preserve">Penulis menerima penugasan modul halaman spesifik yang perlu dirancang ulang langsung dari </w:t>
+      </w:r>
+      <w:r>
+        <w:rPr>
+          <w:i/>
+          <w:iCs w:val="0"/>
+        </w:rPr>
+        <w:t>Product Designer</w:t>
+      </w:r>
+      <w:r>
+        <w:t xml:space="preserve"> senior atau melalui koordinasi di bawah </w:t>
+      </w:r>
+      <w:r>
+        <w:rPr>
+          <w:i/>
+          <w:iCs w:val="0"/>
+        </w:rPr>
+        <w:t>Product Manager</w:t>
+      </w:r>
+      <w:r>
+        <w:t>. Pada tahap ini, penulis mempelajari fungsi dari modul yang akan dikerjakan agar tidak mengubah esensi bisnis dari platform Reusely.</w:t>
+      </w:r>
+    </w:p>
+    <w:p>
+      <w:pPr>
+        <w:pStyle w:val="anaksub-bab"/>
+        <w:numPr>
+          <w:ilvl w:val="0"/>
+          <w:numId w:val="38"/>
+        </w:numPr>
+        <w:ind w:left="1260" w:hanging="720"/>
+      </w:pPr>
+      <w:r>
+        <w:t>Tahap Audit Komponen Lama (</w:t>
+      </w:r>
+      <w:r>
+        <w:rPr>
+          <w:i/>
+          <w:iCs/>
+        </w:rPr>
+        <w:t>UI Audit</w:t>
+      </w:r>
+      <w:r>
+        <w:t>)</w:t>
+      </w:r>
+    </w:p>
+    <w:p>
+      <w:pPr>
+        <w:pStyle w:val="isianaksub-bab"/>
+      </w:pPr>
+      <w:r>
+        <w:t xml:space="preserve">Penulis melakukan penelusuran terhadap halaman lama Reusely yang masih menggunakan komponen </w:t>
+      </w:r>
+      <w:r>
+        <w:rPr>
+          <w:i/>
+          <w:iCs w:val="0"/>
+        </w:rPr>
+        <w:t>Design System V1</w:t>
+      </w:r>
+      <w:r>
+        <w:t>. Penulis mengidentifikasi letak ketidakkonsistenan visual pada elemen seperti tombol, kolom input, ataupun tata letak spasi, lalu mencatat aset apa saja yang perlu diganti dengan</w:t>
+      </w:r>
+      <w:r>
+        <w:rPr>
+          <w:lang w:val="en-US"/>
+        </w:rPr>
+        <w:t xml:space="preserve"> </w:t>
+      </w:r>
+      <w:r>
+        <w:t xml:space="preserve">komponen </w:t>
+      </w:r>
+      <w:r>
+        <w:rPr>
+          <w:i/>
+          <w:iCs w:val="0"/>
+        </w:rPr>
+        <w:t>Design System V2</w:t>
+      </w:r>
+      <w:r>
+        <w:t>.</w:t>
+      </w:r>
+    </w:p>
+    <w:p>
+      <w:pPr>
+        <w:pStyle w:val="anaksub-bab"/>
+        <w:numPr>
+          <w:ilvl w:val="0"/>
+          <w:numId w:val="38"/>
+        </w:numPr>
+        <w:ind w:left="1260" w:hanging="720"/>
+      </w:pPr>
+      <w:r>
+        <w:t xml:space="preserve">Tahap Perancangan Ulang dan </w:t>
+      </w:r>
+      <w:r>
+        <w:rPr>
+          <w:i/>
+          <w:iCs/>
+        </w:rPr>
+        <w:t>Prototyping</w:t>
+      </w:r>
+    </w:p>
+    <w:p>
+      <w:pPr>
+        <w:pStyle w:val="isianaksub-bab"/>
+      </w:pPr>
+      <w:r>
+        <w:lastRenderedPageBreak/>
+        <w:t>Proses eksekusi dilakukan sepenuhnya menggunakan aplikasi Figma. Penulis menyusun kembali tata letak halaman dengan mengambil komponen resmi yang bersumber dari pustaka (</w:t>
+      </w:r>
+      <w:r>
+        <w:rPr>
+          <w:i/>
+          <w:iCs w:val="0"/>
+        </w:rPr>
+        <w:t>library</w:t>
+      </w:r>
+      <w:r>
+        <w:t xml:space="preserve">) </w:t>
+      </w:r>
+      <w:r>
+        <w:rPr>
+          <w:i/>
+          <w:iCs w:val="0"/>
+        </w:rPr>
+        <w:t>Design System V2</w:t>
+      </w:r>
+      <w:r>
+        <w:t xml:space="preserve"> perusahaan dengan mengoptimalkan fitur </w:t>
+      </w:r>
+      <w:r>
+        <w:rPr>
+          <w:i/>
+          <w:iCs w:val="0"/>
+        </w:rPr>
+        <w:t>Auto Layout</w:t>
+      </w:r>
+      <w:r>
+        <w:t xml:space="preserve"> dan </w:t>
+      </w:r>
+      <w:r>
+        <w:rPr>
+          <w:i/>
+          <w:iCs w:val="0"/>
+        </w:rPr>
+        <w:t>Component Sets</w:t>
+      </w:r>
+      <w:r>
+        <w:t xml:space="preserve">. Setelah visual halaman selesai, penulis menyusun interaksi per halaman menggunakan fitur </w:t>
+      </w:r>
+      <w:r>
+        <w:rPr>
+          <w:i/>
+          <w:iCs w:val="0"/>
+        </w:rPr>
+        <w:t>Variables</w:t>
+      </w:r>
+      <w:r>
+        <w:t xml:space="preserve"> untuk membentuk </w:t>
+      </w:r>
+      <w:r>
+        <w:rPr>
+          <w:i/>
+          <w:iCs w:val="0"/>
+        </w:rPr>
+        <w:t>high-fidelity prototype</w:t>
+      </w:r>
+      <w:r>
+        <w:t xml:space="preserve"> yang modular.</w:t>
+      </w:r>
+    </w:p>
+    <w:p>
+      <w:pPr>
+        <w:pStyle w:val="anaksub-bab"/>
+        <w:numPr>
+          <w:ilvl w:val="0"/>
+          <w:numId w:val="38"/>
+        </w:numPr>
+        <w:ind w:left="1260" w:hanging="720"/>
+      </w:pPr>
+      <w:r>
+        <w:t>Tahap Evaluasi dan Persetujuan (</w:t>
+      </w:r>
+      <w:r>
+        <w:rPr>
+          <w:i/>
+          <w:iCs/>
+        </w:rPr>
+        <w:t>Design Review &amp; Approval</w:t>
+      </w:r>
+      <w:r>
+        <w:t>)</w:t>
+      </w:r>
+    </w:p>
+    <w:p>
+      <w:pPr>
+        <w:pStyle w:val="isianaksub-bab"/>
+      </w:pPr>
+      <w:r>
+        <w:t xml:space="preserve">Hasil rancangan halaman dan </w:t>
+      </w:r>
+      <w:r>
+        <w:rPr>
+          <w:i/>
+          <w:iCs w:val="0"/>
+          <w:lang w:val="en-US"/>
+        </w:rPr>
+        <w:t>prototype</w:t>
+      </w:r>
+      <w:r>
+        <w:t xml:space="preserve"> interaktif </w:t>
+      </w:r>
+      <w:r>
+        <w:rPr>
+          <w:lang w:val="en-US"/>
+        </w:rPr>
+        <w:t xml:space="preserve">dilakukan </w:t>
+      </w:r>
+      <w:r>
+        <w:rPr>
+          <w:i/>
+          <w:iCs w:val="0"/>
+          <w:lang w:val="en-US"/>
+        </w:rPr>
+        <w:t>review</w:t>
+      </w:r>
+      <w:r>
+        <w:rPr>
+          <w:lang w:val="en-US"/>
+        </w:rPr>
+        <w:t xml:space="preserve"> </w:t>
+      </w:r>
+      <w:r>
+        <w:t xml:space="preserve">secara berkala kepada </w:t>
+      </w:r>
+      <w:r>
+        <w:rPr>
+          <w:i/>
+          <w:iCs w:val="0"/>
+        </w:rPr>
+        <w:t>Product Designer</w:t>
+      </w:r>
+      <w:r>
+        <w:t xml:space="preserve"> senior dalam sesi </w:t>
+      </w:r>
+      <w:r>
+        <w:rPr>
+          <w:i/>
+          <w:iCs w:val="0"/>
+        </w:rPr>
+        <w:t>design review</w:t>
+      </w:r>
+      <w:r>
+        <w:t xml:space="preserve"> internal. Penulis melakukan perbaikan atau revisi secara instan berdasarkan masukan (</w:t>
+      </w:r>
+      <w:r>
+        <w:rPr>
+          <w:i/>
+          <w:iCs w:val="0"/>
+        </w:rPr>
+        <w:t>feedback</w:t>
+      </w:r>
+      <w:r>
+        <w:t>) teknis yang diberikan. Setelah desain dinyatakan sesuai standar dan mendapat persetujuan (</w:t>
+      </w:r>
+      <w:r>
+        <w:rPr>
+          <w:i/>
+          <w:iCs w:val="0"/>
+        </w:rPr>
+        <w:t>approval</w:t>
+      </w:r>
+      <w:r>
+        <w:t xml:space="preserve">), </w:t>
+      </w:r>
+      <w:r>
+        <w:rPr>
+          <w:lang w:val="en-US"/>
+        </w:rPr>
+        <w:t>desain</w:t>
+      </w:r>
+      <w:r>
+        <w:t xml:space="preserve"> tersebut dinyatakan selesai dan siap masuk ke dalam antrean </w:t>
+      </w:r>
+      <w:r>
+        <w:rPr>
+          <w:i/>
+          <w:iCs w:val="0"/>
+        </w:rPr>
+        <w:t>handoff</w:t>
+      </w:r>
+      <w:r>
+        <w:t xml:space="preserve"> oleh desainer senior.</w:t>
+      </w:r>
+      <w:r>
         <w:br w:type="page"/>
       </w:r>
     </w:p>
@@ -8100,10 +9732,6 @@
     <w:p>
       <w:pPr>
         <w:pStyle w:val="Bibliography"/>
-        <w:rPr>
-          <w:rFonts w:cs="Times New Roman"/>
-          <w:szCs w:val="24"/>
-        </w:rPr>
       </w:pPr>
       <w:r>
         <w:rPr>
@@ -8128,90 +9756,166 @@
         <w:fldChar w:fldCharType="separate"/>
       </w:r>
       <w:r>
-        <w:rPr>
-          <w:rFonts w:cs="Times New Roman"/>
-          <w:szCs w:val="24"/>
-        </w:rPr>
-        <w:t xml:space="preserve">Kurniawan, R. A. (2024). Pembuatan Design System Menggunakan Pendekatan Atomic Design dan A/B Testing. </w:t>
-      </w:r>
-      <w:r>
-        <w:rPr>
-          <w:rFonts w:cs="Times New Roman"/>
-          <w:i/>
-          <w:iCs/>
-          <w:szCs w:val="24"/>
+        <w:t xml:space="preserve">Arisa, N. N., Fahri, M., Putera, M. I. A., &amp; Putra, M. G. L. (2023). Perancangan Prototipe UI/UX Website CROWDE Menggunakan Metode Design Thinking. </w:t>
+      </w:r>
+      <w:r>
+        <w:rPr>
+          <w:i/>
+          <w:iCs/>
+        </w:rPr>
+        <w:t>Teknika</w:t>
+      </w:r>
+      <w:r>
+        <w:t xml:space="preserve">, </w:t>
+      </w:r>
+      <w:r>
+        <w:rPr>
+          <w:i/>
+          <w:iCs/>
+        </w:rPr>
+        <w:t>12</w:t>
+      </w:r>
+      <w:r>
+        <w:t>(1), 18–26. https://doi.org/10.34148/teknika.v12i1.549</w:t>
+      </w:r>
+    </w:p>
+    <w:p>
+      <w:pPr>
+        <w:pStyle w:val="Bibliography"/>
+      </w:pPr>
+      <w:r>
+        <w:t xml:space="preserve">Ayada, W., &amp; Hammad, M. (2023). Design Quality Criteria for Smartphone Applications Interface and its Impact on User Experience and Usability. </w:t>
+      </w:r>
+      <w:r>
+        <w:rPr>
+          <w:i/>
+          <w:iCs/>
+        </w:rPr>
+        <w:t>International Design Journal</w:t>
+      </w:r>
+      <w:r>
+        <w:t xml:space="preserve">, </w:t>
+      </w:r>
+      <w:r>
+        <w:rPr>
+          <w:i/>
+          <w:iCs/>
+        </w:rPr>
+        <w:t>13</w:t>
+      </w:r>
+      <w:r>
+        <w:t>(4), 339–354. https://doi.org/10.21608/idj.2023.305364</w:t>
+      </w:r>
+    </w:p>
+    <w:p>
+      <w:pPr>
+        <w:pStyle w:val="Bibliography"/>
+      </w:pPr>
+      <w:r>
+        <w:t xml:space="preserve">Jamilah, Y. S., &amp; Padmasari, A. C. (2022). </w:t>
+      </w:r>
+      <w:r>
+        <w:rPr>
+          <w:i/>
+          <w:iCs/>
+        </w:rPr>
+        <w:t>PERANCANGAN USER INTERFACE DAN USER EXPERIENCE APLIKASI SAY.CO</w:t>
+      </w:r>
+      <w:r>
+        <w:t xml:space="preserve">. </w:t>
+      </w:r>
+      <w:r>
+        <w:rPr>
+          <w:i/>
+          <w:iCs/>
+        </w:rPr>
+        <w:t>9</w:t>
+      </w:r>
+      <w:r>
+        <w:t>.</w:t>
+      </w:r>
+    </w:p>
+    <w:p>
+      <w:pPr>
+        <w:pStyle w:val="Bibliography"/>
+      </w:pPr>
+      <w:r>
+        <w:t xml:space="preserve">Kurniawan, R. A. (2024a). Pembuatan Design System Menggunakan Pendekatan Atomic Design dan A/B Testing. </w:t>
+      </w:r>
+      <w:r>
+        <w:rPr>
+          <w:i/>
+          <w:iCs/>
         </w:rPr>
         <w:t>Jurnal Teknologi  Dan Sistem Informasi Bisnis</w:t>
       </w:r>
       <w:r>
-        <w:rPr>
-          <w:rFonts w:cs="Times New Roman"/>
-          <w:szCs w:val="24"/>
-        </w:rPr>
         <w:t xml:space="preserve">, </w:t>
       </w:r>
       <w:r>
         <w:rPr>
-          <w:rFonts w:cs="Times New Roman"/>
-          <w:i/>
-          <w:iCs/>
-          <w:szCs w:val="24"/>
+          <w:i/>
+          <w:iCs/>
         </w:rPr>
         <w:t>6</w:t>
       </w:r>
       <w:r>
-        <w:rPr>
-          <w:rFonts w:cs="Times New Roman"/>
-          <w:szCs w:val="24"/>
-        </w:rPr>
         <w:t>(3), 543–549. https://doi.org/10.47233/jteksis.v6i3.1346</w:t>
       </w:r>
     </w:p>
     <w:p>
       <w:pPr>
         <w:pStyle w:val="Bibliography"/>
-        <w:rPr>
-          <w:rFonts w:cs="Times New Roman"/>
-          <w:szCs w:val="24"/>
-        </w:rPr>
-      </w:pPr>
-      <w:r>
-        <w:rPr>
-          <w:rFonts w:cs="Times New Roman"/>
-          <w:szCs w:val="24"/>
-        </w:rPr>
+      </w:pPr>
+      <w:r>
+        <w:t xml:space="preserve">Kurniawan, R. A. (2024b). Pembuatan Design System Menggunakan Pendekatan Atomic Design dan A/B Testing. </w:t>
+      </w:r>
+      <w:r>
+        <w:rPr>
+          <w:i/>
+          <w:iCs/>
+        </w:rPr>
+        <w:t>Jurnal Teknologi  Dan Sistem Informasi Bisnis</w:t>
+      </w:r>
+      <w:r>
+        <w:t xml:space="preserve">, </w:t>
+      </w:r>
+      <w:r>
+        <w:rPr>
+          <w:i/>
+          <w:iCs/>
+        </w:rPr>
+        <w:t>6</w:t>
+      </w:r>
+      <w:r>
+        <w:t>(3), 543–549. https://doi.org/10.47233/jteksis.v6i3.1346</w:t>
+      </w:r>
+    </w:p>
+    <w:p>
+      <w:pPr>
+        <w:pStyle w:val="Bibliography"/>
+      </w:pPr>
+      <w:r>
         <w:t xml:space="preserve">Matra, M. Y., Kusumasari, T. F., &amp; Al-Anshary, F. M. (2023). REDESIGN USER INTERFACE WEBSITE PORTAL MENGGUNAKAN METODE ATOMIC DESIGN (STUDI KASUS: BADAN PENGAWAS OBAT DAN MAKANAN). </w:t>
       </w:r>
       <w:r>
         <w:rPr>
-          <w:rFonts w:cs="Times New Roman"/>
-          <w:i/>
-          <w:iCs/>
-          <w:szCs w:val="24"/>
+          <w:i/>
+          <w:iCs/>
         </w:rPr>
         <w:t>JIPI (Jurnal Ilmiah Penelitian dan Pembelajaran Informatika)</w:t>
       </w:r>
       <w:r>
-        <w:rPr>
-          <w:rFonts w:cs="Times New Roman"/>
-          <w:szCs w:val="24"/>
-        </w:rPr>
         <w:t xml:space="preserve">, </w:t>
       </w:r>
       <w:r>
         <w:rPr>
-          <w:rFonts w:cs="Times New Roman"/>
-          <w:i/>
-          <w:iCs/>
-          <w:szCs w:val="24"/>
+          <w:i/>
+          <w:iCs/>
         </w:rPr>
         <w:t>8</w:t>
       </w:r>
       <w:r>
-        <w:rPr>
-          <w:rFonts w:cs="Times New Roman"/>
-          <w:szCs w:val="24"/>
-        </w:rPr>
         <w:t>(2), 500–513. https://doi.org/10.29100/jipi.v8i2.3502</w:t>
       </w:r>
     </w:p>
@@ -8220,26 +9924,73 @@
         <w:pStyle w:val="Bibliography"/>
       </w:pPr>
       <w:r>
-        <w:rPr>
-          <w:rFonts w:cs="Times New Roman"/>
-          <w:szCs w:val="24"/>
-        </w:rPr>
+        <w:lastRenderedPageBreak/>
+        <w:t xml:space="preserve">Setiawan, A. R., Asfi, M., Sevtiana, A., Pranata, S., &amp; Septian, W. E. (2023). Design System pada Perancangan Antarmuka Perangkat Lunak Sistem Akses Digital. </w:t>
+      </w:r>
+      <w:r>
+        <w:rPr>
+          <w:i/>
+          <w:iCs/>
+        </w:rPr>
+        <w:t>Jurnal Teknologi Terpadu</w:t>
+      </w:r>
+      <w:r>
+        <w:t xml:space="preserve">, </w:t>
+      </w:r>
+      <w:r>
+        <w:rPr>
+          <w:i/>
+          <w:iCs/>
+        </w:rPr>
+        <w:t>9</w:t>
+      </w:r>
+      <w:r>
+        <w:t>(1), 56–64. https://doi.org/10.54914/jtt.v9i1.619</w:t>
+      </w:r>
+    </w:p>
+    <w:p>
+      <w:pPr>
+        <w:pStyle w:val="Bibliography"/>
+      </w:pPr>
+      <w:r>
+        <w:t xml:space="preserve">Wijaya, A. S., &amp; Testiana, G. (2026). Perancangan UI/UX Website Menggunakan Figma di Politeknik Pariwisata Palembang. </w:t>
+      </w:r>
+      <w:r>
+        <w:rPr>
+          <w:i/>
+          <w:iCs/>
+        </w:rPr>
+        <w:t>RIGGS: Journal of Artificial Intelligence and Digital Business</w:t>
+      </w:r>
+      <w:r>
+        <w:t xml:space="preserve">, </w:t>
+      </w:r>
+      <w:r>
+        <w:rPr>
+          <w:i/>
+          <w:iCs/>
+        </w:rPr>
+        <w:t>4</w:t>
+      </w:r>
+      <w:r>
+        <w:t>(4), 9981–9992. https://doi.org/10.31004/riggs.v4i4.4737</w:t>
+      </w:r>
+    </w:p>
+    <w:p>
+      <w:pPr>
+        <w:pStyle w:val="Bibliography"/>
+      </w:pPr>
+      <w:r>
         <w:t xml:space="preserve">Yablonski, J. (2020). </w:t>
       </w:r>
       <w:r>
         <w:rPr>
-          <w:rFonts w:cs="Times New Roman"/>
-          <w:i/>
-          <w:iCs/>
-          <w:szCs w:val="24"/>
+          <w:i/>
+          <w:iCs/>
         </w:rPr>
         <w:t>Laws of UX: Using psychology to design better products &amp; services</w:t>
       </w:r>
       <w:r>
-        <w:rPr>
-          <w:rFonts w:cs="Times New Roman"/>
-          <w:szCs w:val="24"/>
-        </w:rPr>
         <w:t>. O´Reilly.</w:t>
       </w:r>
     </w:p>
@@ -8364,6 +10115,97 @@
     </w:lvl>
   </w:abstractNum>
   <w:abstractNum w:abstractNumId="1" w15:restartNumberingAfterBreak="0">
+    <w:nsid w:val="01664914"/>
+    <w:multiLevelType w:val="hybridMultilevel"/>
+    <w:tmpl w:val="8A4ABAEE"/>
+    <w:lvl w:ilvl="0" w:tplc="B782ABC6">
+      <w:start w:val="1"/>
+      <w:numFmt w:val="decimal"/>
+      <w:lvlText w:val="3.4.%1"/>
+      <w:lvlJc w:val="left"/>
+      <w:pPr>
+        <w:ind w:left="1260" w:hanging="360"/>
+      </w:pPr>
+      <w:rPr>
+        <w:rFonts w:hint="default"/>
+        <w:i w:val="0"/>
+        <w:iCs w:val="0"/>
+      </w:rPr>
+    </w:lvl>
+    <w:lvl w:ilvl="1" w:tplc="04090019" w:tentative="1">
+      <w:start w:val="1"/>
+      <w:numFmt w:val="lowerLetter"/>
+      <w:lvlText w:val="%2."/>
+      <w:lvlJc w:val="left"/>
+      <w:pPr>
+        <w:ind w:left="1980" w:hanging="360"/>
+      </w:pPr>
+    </w:lvl>
+    <w:lvl w:ilvl="2" w:tplc="0409001B" w:tentative="1">
+      <w:start w:val="1"/>
+      <w:numFmt w:val="lowerRoman"/>
+      <w:lvlText w:val="%3."/>
+      <w:lvlJc w:val="right"/>
+      <w:pPr>
+        <w:ind w:left="2700" w:hanging="180"/>
+      </w:pPr>
+    </w:lvl>
+    <w:lvl w:ilvl="3" w:tplc="0409000F" w:tentative="1">
+      <w:start w:val="1"/>
+      <w:numFmt w:val="decimal"/>
+      <w:lvlText w:val="%4."/>
+      <w:lvlJc w:val="left"/>
+      <w:pPr>
+        <w:ind w:left="3420" w:hanging="360"/>
+      </w:pPr>
+    </w:lvl>
+    <w:lvl w:ilvl="4" w:tplc="04090019" w:tentative="1">
+      <w:start w:val="1"/>
+      <w:numFmt w:val="lowerLetter"/>
+      <w:lvlText w:val="%5."/>
+      <w:lvlJc w:val="left"/>
+      <w:pPr>
+        <w:ind w:left="4140" w:hanging="360"/>
+      </w:pPr>
+    </w:lvl>
+    <w:lvl w:ilvl="5" w:tplc="0409001B" w:tentative="1">
+      <w:start w:val="1"/>
+      <w:numFmt w:val="lowerRoman"/>
+      <w:lvlText w:val="%6."/>
+      <w:lvlJc w:val="right"/>
+      <w:pPr>
+        <w:ind w:left="4860" w:hanging="180"/>
+      </w:pPr>
+    </w:lvl>
+    <w:lvl w:ilvl="6" w:tplc="0409000F" w:tentative="1">
+      <w:start w:val="1"/>
+      <w:numFmt w:val="decimal"/>
+      <w:lvlText w:val="%7."/>
+      <w:lvlJc w:val="left"/>
+      <w:pPr>
+        <w:ind w:left="5580" w:hanging="360"/>
+      </w:pPr>
+    </w:lvl>
+    <w:lvl w:ilvl="7" w:tplc="04090019" w:tentative="1">
+      <w:start w:val="1"/>
+      <w:numFmt w:val="lowerLetter"/>
+      <w:lvlText w:val="%8."/>
+      <w:lvlJc w:val="left"/>
+      <w:pPr>
+        <w:ind w:left="6300" w:hanging="360"/>
+      </w:pPr>
+    </w:lvl>
+    <w:lvl w:ilvl="8" w:tplc="0409001B" w:tentative="1">
+      <w:start w:val="1"/>
+      <w:numFmt w:val="lowerRoman"/>
+      <w:lvlText w:val="%9."/>
+      <w:lvlJc w:val="right"/>
+      <w:pPr>
+        <w:ind w:left="7020" w:hanging="180"/>
+      </w:pPr>
+    </w:lvl>
+  </w:abstractNum>
+  <w:abstractNum w:abstractNumId="2" w15:restartNumberingAfterBreak="0">
     <w:nsid w:val="01AA14C9"/>
     <w:multiLevelType w:val="hybridMultilevel"/>
     <w:tmpl w:val="F0A8ECE0"/>
@@ -8452,7 +10294,7 @@
       </w:pPr>
     </w:lvl>
   </w:abstractNum>
-  <w:abstractNum w:abstractNumId="2" w15:restartNumberingAfterBreak="0">
+  <w:abstractNum w:abstractNumId="3" w15:restartNumberingAfterBreak="0">
     <w:nsid w:val="088D47BB"/>
     <w:multiLevelType w:val="hybridMultilevel"/>
     <w:tmpl w:val="454C0880"/>
@@ -8543,7 +10385,7 @@
       </w:pPr>
     </w:lvl>
   </w:abstractNum>
-  <w:abstractNum w:abstractNumId="3" w15:restartNumberingAfterBreak="0">
+  <w:abstractNum w:abstractNumId="4" w15:restartNumberingAfterBreak="0">
     <w:nsid w:val="08BD5B71"/>
     <w:multiLevelType w:val="hybridMultilevel"/>
     <w:tmpl w:val="AF6AF92A"/>
@@ -8629,7 +10471,96 @@
       </w:pPr>
     </w:lvl>
   </w:abstractNum>
-  <w:abstractNum w:abstractNumId="4" w15:restartNumberingAfterBreak="0">
+  <w:abstractNum w:abstractNumId="5" w15:restartNumberingAfterBreak="0">
+    <w:nsid w:val="0BFA3016"/>
+    <w:multiLevelType w:val="hybridMultilevel"/>
+    <w:tmpl w:val="F6C6B6DE"/>
+    <w:lvl w:ilvl="0" w:tplc="418ABE32">
+      <w:start w:val="1"/>
+      <w:numFmt w:val="decimal"/>
+      <w:lvlText w:val="3.5.%1"/>
+      <w:lvlJc w:val="left"/>
+      <w:pPr>
+        <w:ind w:left="720" w:hanging="360"/>
+      </w:pPr>
+      <w:rPr>
+        <w:rFonts w:hint="default"/>
+      </w:rPr>
+    </w:lvl>
+    <w:lvl w:ilvl="1" w:tplc="04090019" w:tentative="1">
+      <w:start w:val="1"/>
+      <w:numFmt w:val="lowerLetter"/>
+      <w:lvlText w:val="%2."/>
+      <w:lvlJc w:val="left"/>
+      <w:pPr>
+        <w:ind w:left="1440" w:hanging="360"/>
+      </w:pPr>
+    </w:lvl>
+    <w:lvl w:ilvl="2" w:tplc="0409001B" w:tentative="1">
+      <w:start w:val="1"/>
+      <w:numFmt w:val="lowerRoman"/>
+      <w:lvlText w:val="%3."/>
+      <w:lvlJc w:val="right"/>
+      <w:pPr>
+        <w:ind w:left="2160" w:hanging="180"/>
+      </w:pPr>
+    </w:lvl>
+    <w:lvl w:ilvl="3" w:tplc="0409000F" w:tentative="1">
+      <w:start w:val="1"/>
+      <w:numFmt w:val="decimal"/>
+      <w:lvlText w:val="%4."/>
+      <w:lvlJc w:val="left"/>
+      <w:pPr>
+        <w:ind w:left="2880" w:hanging="360"/>
+      </w:pPr>
+    </w:lvl>
+    <w:lvl w:ilvl="4" w:tplc="04090019" w:tentative="1">
+      <w:start w:val="1"/>
+      <w:numFmt w:val="lowerLetter"/>
+      <w:lvlText w:val="%5."/>
+      <w:lvlJc w:val="left"/>
+      <w:pPr>
+        <w:ind w:left="3600" w:hanging="360"/>
+      </w:pPr>
+    </w:lvl>
+    <w:lvl w:ilvl="5" w:tplc="0409001B" w:tentative="1">
+      <w:start w:val="1"/>
+      <w:numFmt w:val="lowerRoman"/>
+      <w:lvlText w:val="%6."/>
+      <w:lvlJc w:val="right"/>
+      <w:pPr>
+        <w:ind w:left="4320" w:hanging="180"/>
+      </w:pPr>
+    </w:lvl>
+    <w:lvl w:ilvl="6" w:tplc="0409000F" w:tentative="1">
+      <w:start w:val="1"/>
+      <w:numFmt w:val="decimal"/>
+      <w:lvlText w:val="%7."/>
+      <w:lvlJc w:val="left"/>
+      <w:pPr>
+        <w:ind w:left="5040" w:hanging="360"/>
+      </w:pPr>
+    </w:lvl>
+    <w:lvl w:ilvl="7" w:tplc="04090019" w:tentative="1">
+      <w:start w:val="1"/>
+      <w:numFmt w:val="lowerLetter"/>
+      <w:lvlText w:val="%8."/>
+      <w:lvlJc w:val="left"/>
+      <w:pPr>
+        <w:ind w:left="5760" w:hanging="360"/>
+      </w:pPr>
+    </w:lvl>
+    <w:lvl w:ilvl="8" w:tplc="0409001B" w:tentative="1">
+      <w:start w:val="1"/>
+      <w:numFmt w:val="lowerRoman"/>
+      <w:lvlText w:val="%9."/>
+      <w:lvlJc w:val="right"/>
+      <w:pPr>
+        <w:ind w:left="6480" w:hanging="180"/>
+      </w:pPr>
+    </w:lvl>
+  </w:abstractNum>
+  <w:abstractNum w:abstractNumId="6" w15:restartNumberingAfterBreak="0">
     <w:nsid w:val="0ECD105C"/>
     <w:multiLevelType w:val="hybridMultilevel"/>
     <w:tmpl w:val="144C2C7C"/>
@@ -8720,7 +10651,7 @@
       </w:pPr>
     </w:lvl>
   </w:abstractNum>
-  <w:abstractNum w:abstractNumId="5" w15:restartNumberingAfterBreak="0">
+  <w:abstractNum w:abstractNumId="7" w15:restartNumberingAfterBreak="0">
     <w:nsid w:val="1112021A"/>
     <w:multiLevelType w:val="hybridMultilevel"/>
     <w:tmpl w:val="8990BA74"/>
@@ -8806,7 +10737,7 @@
       </w:pPr>
     </w:lvl>
   </w:abstractNum>
-  <w:abstractNum w:abstractNumId="6" w15:restartNumberingAfterBreak="0">
+  <w:abstractNum w:abstractNumId="8" w15:restartNumberingAfterBreak="0">
     <w:nsid w:val="149A0B3C"/>
     <w:multiLevelType w:val="hybridMultilevel"/>
     <w:tmpl w:val="660C58D2"/>
@@ -8895,7 +10826,7 @@
       </w:pPr>
     </w:lvl>
   </w:abstractNum>
-  <w:abstractNum w:abstractNumId="7" w15:restartNumberingAfterBreak="0">
+  <w:abstractNum w:abstractNumId="9" w15:restartNumberingAfterBreak="0">
     <w:nsid w:val="172F1A4F"/>
     <w:multiLevelType w:val="hybridMultilevel"/>
     <w:tmpl w:val="344A72B8"/>
@@ -8985,7 +10916,7 @@
       </w:pPr>
     </w:lvl>
   </w:abstractNum>
-  <w:abstractNum w:abstractNumId="8" w15:restartNumberingAfterBreak="0">
+  <w:abstractNum w:abstractNumId="10" w15:restartNumberingAfterBreak="0">
     <w:nsid w:val="1B374B5C"/>
     <w:multiLevelType w:val="hybridMultilevel"/>
     <w:tmpl w:val="8BA26894"/>
@@ -9071,7 +11002,7 @@
       </w:pPr>
     </w:lvl>
   </w:abstractNum>
-  <w:abstractNum w:abstractNumId="9" w15:restartNumberingAfterBreak="0">
+  <w:abstractNum w:abstractNumId="11" w15:restartNumberingAfterBreak="0">
     <w:nsid w:val="1E381388"/>
     <w:multiLevelType w:val="hybridMultilevel"/>
     <w:tmpl w:val="EF926450"/>
@@ -9157,7 +11088,7 @@
       </w:pPr>
     </w:lvl>
   </w:abstractNum>
-  <w:abstractNum w:abstractNumId="10" w15:restartNumberingAfterBreak="0">
+  <w:abstractNum w:abstractNumId="12" w15:restartNumberingAfterBreak="0">
     <w:nsid w:val="211B4523"/>
     <w:multiLevelType w:val="hybridMultilevel"/>
     <w:tmpl w:val="233C19C0"/>
@@ -9246,7 +11177,7 @@
       </w:pPr>
     </w:lvl>
   </w:abstractNum>
-  <w:abstractNum w:abstractNumId="11" w15:restartNumberingAfterBreak="0">
+  <w:abstractNum w:abstractNumId="13" w15:restartNumberingAfterBreak="0">
     <w:nsid w:val="222C3BC4"/>
     <w:multiLevelType w:val="hybridMultilevel"/>
     <w:tmpl w:val="077EDB4C"/>
@@ -9337,7 +11268,7 @@
       </w:pPr>
     </w:lvl>
   </w:abstractNum>
-  <w:abstractNum w:abstractNumId="12" w15:restartNumberingAfterBreak="0">
+  <w:abstractNum w:abstractNumId="14" w15:restartNumberingAfterBreak="0">
     <w:nsid w:val="25486A79"/>
     <w:multiLevelType w:val="hybridMultilevel"/>
     <w:tmpl w:val="CB3C68D0"/>
@@ -9426,7 +11357,7 @@
       </w:pPr>
     </w:lvl>
   </w:abstractNum>
-  <w:abstractNum w:abstractNumId="13" w15:restartNumberingAfterBreak="0">
+  <w:abstractNum w:abstractNumId="15" w15:restartNumberingAfterBreak="0">
     <w:nsid w:val="258E79A0"/>
     <w:multiLevelType w:val="hybridMultilevel"/>
     <w:tmpl w:val="64BA99A4"/>
@@ -9512,7 +11443,7 @@
       </w:pPr>
     </w:lvl>
   </w:abstractNum>
-  <w:abstractNum w:abstractNumId="14" w15:restartNumberingAfterBreak="0">
+  <w:abstractNum w:abstractNumId="16" w15:restartNumberingAfterBreak="0">
     <w:nsid w:val="2995748F"/>
     <w:multiLevelType w:val="hybridMultilevel"/>
     <w:tmpl w:val="CE926724"/>
@@ -9601,7 +11532,7 @@
       </w:pPr>
     </w:lvl>
   </w:abstractNum>
-  <w:abstractNum w:abstractNumId="15" w15:restartNumberingAfterBreak="0">
+  <w:abstractNum w:abstractNumId="17" w15:restartNumberingAfterBreak="0">
     <w:nsid w:val="2A5A063C"/>
     <w:multiLevelType w:val="hybridMultilevel"/>
     <w:tmpl w:val="D014092C"/>
@@ -9690,7 +11621,7 @@
       </w:pPr>
     </w:lvl>
   </w:abstractNum>
-  <w:abstractNum w:abstractNumId="16" w15:restartNumberingAfterBreak="0">
+  <w:abstractNum w:abstractNumId="18" w15:restartNumberingAfterBreak="0">
     <w:nsid w:val="30EF7A66"/>
     <w:multiLevelType w:val="hybridMultilevel"/>
     <w:tmpl w:val="FD82109E"/>
@@ -9776,7 +11707,7 @@
       </w:pPr>
     </w:lvl>
   </w:abstractNum>
-  <w:abstractNum w:abstractNumId="17" w15:restartNumberingAfterBreak="0">
+  <w:abstractNum w:abstractNumId="19" w15:restartNumberingAfterBreak="0">
     <w:nsid w:val="38403F92"/>
     <w:multiLevelType w:val="hybridMultilevel"/>
     <w:tmpl w:val="DBF29710"/>
@@ -9866,7 +11797,7 @@
       </w:pPr>
     </w:lvl>
   </w:abstractNum>
-  <w:abstractNum w:abstractNumId="18" w15:restartNumberingAfterBreak="0">
+  <w:abstractNum w:abstractNumId="20" w15:restartNumberingAfterBreak="0">
     <w:nsid w:val="384B55EF"/>
     <w:multiLevelType w:val="hybridMultilevel"/>
     <w:tmpl w:val="ED2688D4"/>
@@ -9952,7 +11883,7 @@
       </w:pPr>
     </w:lvl>
   </w:abstractNum>
-  <w:abstractNum w:abstractNumId="19" w15:restartNumberingAfterBreak="0">
+  <w:abstractNum w:abstractNumId="21" w15:restartNumberingAfterBreak="0">
     <w:nsid w:val="38750F9A"/>
     <w:multiLevelType w:val="hybridMultilevel"/>
     <w:tmpl w:val="408477A6"/>
@@ -10041,7 +11972,7 @@
       </w:pPr>
     </w:lvl>
   </w:abstractNum>
-  <w:abstractNum w:abstractNumId="20" w15:restartNumberingAfterBreak="0">
+  <w:abstractNum w:abstractNumId="22" w15:restartNumberingAfterBreak="0">
     <w:nsid w:val="38E7224C"/>
     <w:multiLevelType w:val="hybridMultilevel"/>
     <w:tmpl w:val="03345B8C"/>
@@ -10130,7 +12061,7 @@
       </w:pPr>
     </w:lvl>
   </w:abstractNum>
-  <w:abstractNum w:abstractNumId="21" w15:restartNumberingAfterBreak="0">
+  <w:abstractNum w:abstractNumId="23" w15:restartNumberingAfterBreak="0">
     <w:nsid w:val="395647F2"/>
     <w:multiLevelType w:val="hybridMultilevel"/>
     <w:tmpl w:val="4886A96E"/>
@@ -10220,7 +12151,7 @@
       </w:pPr>
     </w:lvl>
   </w:abstractNum>
-  <w:abstractNum w:abstractNumId="22" w15:restartNumberingAfterBreak="0">
+  <w:abstractNum w:abstractNumId="24" w15:restartNumberingAfterBreak="0">
     <w:nsid w:val="428104BE"/>
     <w:multiLevelType w:val="hybridMultilevel"/>
     <w:tmpl w:val="1BB2F25E"/>
@@ -10306,7 +12237,7 @@
       </w:pPr>
     </w:lvl>
   </w:abstractNum>
-  <w:abstractNum w:abstractNumId="23" w15:restartNumberingAfterBreak="0">
+  <w:abstractNum w:abstractNumId="25" w15:restartNumberingAfterBreak="0">
     <w:nsid w:val="46236B73"/>
     <w:multiLevelType w:val="hybridMultilevel"/>
     <w:tmpl w:val="06B822A0"/>
@@ -10420,7 +12351,7 @@
       </w:rPr>
     </w:lvl>
   </w:abstractNum>
-  <w:abstractNum w:abstractNumId="24" w15:restartNumberingAfterBreak="0">
+  <w:abstractNum w:abstractNumId="26" w15:restartNumberingAfterBreak="0">
     <w:nsid w:val="47525A5A"/>
     <w:multiLevelType w:val="hybridMultilevel"/>
     <w:tmpl w:val="13A6480A"/>
@@ -10506,7 +12437,7 @@
       </w:pPr>
     </w:lvl>
   </w:abstractNum>
-  <w:abstractNum w:abstractNumId="25" w15:restartNumberingAfterBreak="0">
+  <w:abstractNum w:abstractNumId="27" w15:restartNumberingAfterBreak="0">
     <w:nsid w:val="4A130A51"/>
     <w:multiLevelType w:val="hybridMultilevel"/>
     <w:tmpl w:val="682AAAE2"/>
@@ -10597,7 +12528,7 @@
       </w:pPr>
     </w:lvl>
   </w:abstractNum>
-  <w:abstractNum w:abstractNumId="26" w15:restartNumberingAfterBreak="0">
+  <w:abstractNum w:abstractNumId="28" w15:restartNumberingAfterBreak="0">
     <w:nsid w:val="52ED1777"/>
     <w:multiLevelType w:val="hybridMultilevel"/>
     <w:tmpl w:val="B5E4677A"/>
@@ -10683,14 +12614,14 @@
       </w:pPr>
     </w:lvl>
   </w:abstractNum>
-  <w:abstractNum w:abstractNumId="27" w15:restartNumberingAfterBreak="0">
+  <w:abstractNum w:abstractNumId="29" w15:restartNumberingAfterBreak="0">
     <w:nsid w:val="60904BA0"/>
     <w:multiLevelType w:val="hybridMultilevel"/>
-    <w:tmpl w:val="DAFC6F6E"/>
-    <w:lvl w:ilvl="0" w:tplc="D4984C30">
+    <w:tmpl w:val="6E9E3BE4"/>
+    <w:lvl w:ilvl="0" w:tplc="C4A0D55A">
       <w:start w:val="1"/>
       <w:numFmt w:val="decimal"/>
-      <w:lvlText w:val="2.4.%1"/>
+      <w:lvlText w:val="3.4.%1"/>
       <w:lvlJc w:val="left"/>
       <w:pPr>
         <w:ind w:left="1260" w:hanging="360"/>
@@ -10772,7 +12703,7 @@
       </w:pPr>
     </w:lvl>
   </w:abstractNum>
-  <w:abstractNum w:abstractNumId="28" w15:restartNumberingAfterBreak="0">
+  <w:abstractNum w:abstractNumId="30" w15:restartNumberingAfterBreak="0">
     <w:nsid w:val="617A430E"/>
     <w:multiLevelType w:val="hybridMultilevel"/>
     <w:tmpl w:val="8502047E"/>
@@ -10885,7 +12816,7 @@
       </w:rPr>
     </w:lvl>
   </w:abstractNum>
-  <w:abstractNum w:abstractNumId="29" w15:restartNumberingAfterBreak="0">
+  <w:abstractNum w:abstractNumId="31" w15:restartNumberingAfterBreak="0">
     <w:nsid w:val="636B3C75"/>
     <w:multiLevelType w:val="hybridMultilevel"/>
     <w:tmpl w:val="C5585D58"/>
@@ -10971,7 +12902,7 @@
       </w:pPr>
     </w:lvl>
   </w:abstractNum>
-  <w:abstractNum w:abstractNumId="30" w15:restartNumberingAfterBreak="0">
+  <w:abstractNum w:abstractNumId="32" w15:restartNumberingAfterBreak="0">
     <w:nsid w:val="642072F1"/>
     <w:multiLevelType w:val="hybridMultilevel"/>
     <w:tmpl w:val="2E8E56C8"/>
@@ -11057,7 +12988,7 @@
       </w:pPr>
     </w:lvl>
   </w:abstractNum>
-  <w:abstractNum w:abstractNumId="31" w15:restartNumberingAfterBreak="0">
+  <w:abstractNum w:abstractNumId="33" w15:restartNumberingAfterBreak="0">
     <w:nsid w:val="6BFB3F79"/>
     <w:multiLevelType w:val="hybridMultilevel"/>
     <w:tmpl w:val="8B522A5C"/>
@@ -11143,7 +13074,7 @@
       </w:pPr>
     </w:lvl>
   </w:abstractNum>
-  <w:abstractNum w:abstractNumId="32" w15:restartNumberingAfterBreak="0">
+  <w:abstractNum w:abstractNumId="34" w15:restartNumberingAfterBreak="0">
     <w:nsid w:val="73821DC0"/>
     <w:multiLevelType w:val="hybridMultilevel"/>
     <w:tmpl w:val="93B63712"/>
@@ -11229,7 +13160,7 @@
       </w:pPr>
     </w:lvl>
   </w:abstractNum>
-  <w:abstractNum w:abstractNumId="33" w15:restartNumberingAfterBreak="0">
+  <w:abstractNum w:abstractNumId="35" w15:restartNumberingAfterBreak="0">
     <w:nsid w:val="77500AC5"/>
     <w:multiLevelType w:val="hybridMultilevel"/>
     <w:tmpl w:val="FC2E3392"/>
@@ -11328,7 +13259,7 @@
       </w:pPr>
     </w:lvl>
   </w:abstractNum>
-  <w:abstractNum w:abstractNumId="34" w15:restartNumberingAfterBreak="0">
+  <w:abstractNum w:abstractNumId="36" w15:restartNumberingAfterBreak="0">
     <w:nsid w:val="7E0D0855"/>
     <w:multiLevelType w:val="hybridMultilevel"/>
     <w:tmpl w:val="BF1C3876"/>
@@ -11415,43 +13346,43 @@
     </w:lvl>
   </w:abstractNum>
   <w:num w:numId="1">
-    <w:abstractNumId w:val="4"/>
+    <w:abstractNumId w:val="6"/>
   </w:num>
   <w:num w:numId="2">
+    <w:abstractNumId w:val="21"/>
+  </w:num>
+  <w:num w:numId="3">
+    <w:abstractNumId w:val="27"/>
+  </w:num>
+  <w:num w:numId="4">
+    <w:abstractNumId w:val="8"/>
+  </w:num>
+  <w:num w:numId="5">
+    <w:abstractNumId w:val="3"/>
+  </w:num>
+  <w:num w:numId="6">
+    <w:abstractNumId w:val="35"/>
+  </w:num>
+  <w:num w:numId="7">
     <w:abstractNumId w:val="19"/>
   </w:num>
-  <w:num w:numId="3">
-    <w:abstractNumId w:val="25"/>
-  </w:num>
-  <w:num w:numId="4">
-    <w:abstractNumId w:val="6"/>
-  </w:num>
-  <w:num w:numId="5">
+  <w:num w:numId="8">
     <w:abstractNumId w:val="2"/>
   </w:num>
-  <w:num w:numId="6">
-    <w:abstractNumId w:val="33"/>
-  </w:num>
-  <w:num w:numId="7">
+  <w:num w:numId="9">
     <w:abstractNumId w:val="17"/>
   </w:num>
-  <w:num w:numId="8">
-    <w:abstractNumId w:val="1"/>
-  </w:num>
-  <w:num w:numId="9">
-    <w:abstractNumId w:val="15"/>
-  </w:num>
   <w:num w:numId="10">
-    <w:abstractNumId w:val="7"/>
+    <w:abstractNumId w:val="9"/>
   </w:num>
   <w:num w:numId="11">
-    <w:abstractNumId w:val="21"/>
+    <w:abstractNumId w:val="23"/>
   </w:num>
   <w:num w:numId="12">
     <w:abstractNumId w:val="0"/>
   </w:num>
   <w:num w:numId="13">
-    <w:abstractNumId w:val="8"/>
+    <w:abstractNumId w:val="10"/>
     <w:lvlOverride w:ilvl="0">
       <w:startOverride w:val="1"/>
     </w:lvlOverride>
@@ -11481,6 +13412,66 @@
     </w:lvlOverride>
   </w:num>
   <w:num w:numId="14">
+    <w:abstractNumId w:val="33"/>
+    <w:lvlOverride w:ilvl="0">
+      <w:startOverride w:val="1"/>
+    </w:lvlOverride>
+    <w:lvlOverride w:ilvl="1">
+      <w:startOverride w:val="1"/>
+    </w:lvlOverride>
+    <w:lvlOverride w:ilvl="2">
+      <w:startOverride w:val="1"/>
+    </w:lvlOverride>
+    <w:lvlOverride w:ilvl="3">
+      <w:startOverride w:val="1"/>
+    </w:lvlOverride>
+    <w:lvlOverride w:ilvl="4">
+      <w:startOverride w:val="1"/>
+    </w:lvlOverride>
+    <w:lvlOverride w:ilvl="5">
+      <w:startOverride w:val="1"/>
+    </w:lvlOverride>
+    <w:lvlOverride w:ilvl="6">
+      <w:startOverride w:val="1"/>
+    </w:lvlOverride>
+    <w:lvlOverride w:ilvl="7">
+      <w:startOverride w:val="1"/>
+    </w:lvlOverride>
+    <w:lvlOverride w:ilvl="8">
+      <w:startOverride w:val="1"/>
+    </w:lvlOverride>
+  </w:num>
+  <w:num w:numId="15">
+    <w:abstractNumId w:val="34"/>
+    <w:lvlOverride w:ilvl="0">
+      <w:startOverride w:val="1"/>
+    </w:lvlOverride>
+    <w:lvlOverride w:ilvl="1">
+      <w:startOverride w:val="1"/>
+    </w:lvlOverride>
+    <w:lvlOverride w:ilvl="2">
+      <w:startOverride w:val="1"/>
+    </w:lvlOverride>
+    <w:lvlOverride w:ilvl="3">
+      <w:startOverride w:val="1"/>
+    </w:lvlOverride>
+    <w:lvlOverride w:ilvl="4">
+      <w:startOverride w:val="1"/>
+    </w:lvlOverride>
+    <w:lvlOverride w:ilvl="5">
+      <w:startOverride w:val="1"/>
+    </w:lvlOverride>
+    <w:lvlOverride w:ilvl="6">
+      <w:startOverride w:val="1"/>
+    </w:lvlOverride>
+    <w:lvlOverride w:ilvl="7">
+      <w:startOverride w:val="1"/>
+    </w:lvlOverride>
+    <w:lvlOverride w:ilvl="8">
+      <w:startOverride w:val="1"/>
+    </w:lvlOverride>
+  </w:num>
+  <w:num w:numId="16">
     <w:abstractNumId w:val="31"/>
     <w:lvlOverride w:ilvl="0">
       <w:startOverride w:val="1"/>
@@ -11510,7 +13501,7 @@
       <w:startOverride w:val="1"/>
     </w:lvlOverride>
   </w:num>
-  <w:num w:numId="15">
+  <w:num w:numId="17">
     <w:abstractNumId w:val="32"/>
     <w:lvlOverride w:ilvl="0">
       <w:startOverride w:val="1"/>
@@ -11540,68 +13531,8 @@
       <w:startOverride w:val="1"/>
     </w:lvlOverride>
   </w:num>
-  <w:num w:numId="16">
-    <w:abstractNumId w:val="29"/>
-    <w:lvlOverride w:ilvl="0">
-      <w:startOverride w:val="1"/>
-    </w:lvlOverride>
-    <w:lvlOverride w:ilvl="1">
-      <w:startOverride w:val="1"/>
-    </w:lvlOverride>
-    <w:lvlOverride w:ilvl="2">
-      <w:startOverride w:val="1"/>
-    </w:lvlOverride>
-    <w:lvlOverride w:ilvl="3">
-      <w:startOverride w:val="1"/>
-    </w:lvlOverride>
-    <w:lvlOverride w:ilvl="4">
-      <w:startOverride w:val="1"/>
-    </w:lvlOverride>
-    <w:lvlOverride w:ilvl="5">
-      <w:startOverride w:val="1"/>
-    </w:lvlOverride>
-    <w:lvlOverride w:ilvl="6">
-      <w:startOverride w:val="1"/>
-    </w:lvlOverride>
-    <w:lvlOverride w:ilvl="7">
-      <w:startOverride w:val="1"/>
-    </w:lvlOverride>
-    <w:lvlOverride w:ilvl="8">
-      <w:startOverride w:val="1"/>
-    </w:lvlOverride>
-  </w:num>
-  <w:num w:numId="17">
-    <w:abstractNumId w:val="30"/>
-    <w:lvlOverride w:ilvl="0">
-      <w:startOverride w:val="1"/>
-    </w:lvlOverride>
-    <w:lvlOverride w:ilvl="1">
-      <w:startOverride w:val="1"/>
-    </w:lvlOverride>
-    <w:lvlOverride w:ilvl="2">
-      <w:startOverride w:val="1"/>
-    </w:lvlOverride>
-    <w:lvlOverride w:ilvl="3">
-      <w:startOverride w:val="1"/>
-    </w:lvlOverride>
-    <w:lvlOverride w:ilvl="4">
-      <w:startOverride w:val="1"/>
-    </w:lvlOverride>
-    <w:lvlOverride w:ilvl="5">
-      <w:startOverride w:val="1"/>
-    </w:lvlOverride>
-    <w:lvlOverride w:ilvl="6">
-      <w:startOverride w:val="1"/>
-    </w:lvlOverride>
-    <w:lvlOverride w:ilvl="7">
-      <w:startOverride w:val="1"/>
-    </w:lvlOverride>
-    <w:lvlOverride w:ilvl="8">
-      <w:startOverride w:val="1"/>
-    </w:lvlOverride>
-  </w:num>
   <w:num w:numId="18">
-    <w:abstractNumId w:val="16"/>
+    <w:abstractNumId w:val="18"/>
     <w:lvlOverride w:ilvl="0">
       <w:startOverride w:val="1"/>
     </w:lvlOverride>
@@ -11631,6 +13562,126 @@
     </w:lvlOverride>
   </w:num>
   <w:num w:numId="19">
+    <w:abstractNumId w:val="26"/>
+    <w:lvlOverride w:ilvl="0">
+      <w:startOverride w:val="1"/>
+    </w:lvlOverride>
+    <w:lvlOverride w:ilvl="1">
+      <w:startOverride w:val="1"/>
+    </w:lvlOverride>
+    <w:lvlOverride w:ilvl="2">
+      <w:startOverride w:val="1"/>
+    </w:lvlOverride>
+    <w:lvlOverride w:ilvl="3">
+      <w:startOverride w:val="1"/>
+    </w:lvlOverride>
+    <w:lvlOverride w:ilvl="4">
+      <w:startOverride w:val="1"/>
+    </w:lvlOverride>
+    <w:lvlOverride w:ilvl="5">
+      <w:startOverride w:val="1"/>
+    </w:lvlOverride>
+    <w:lvlOverride w:ilvl="6">
+      <w:startOverride w:val="1"/>
+    </w:lvlOverride>
+    <w:lvlOverride w:ilvl="7">
+      <w:startOverride w:val="1"/>
+    </w:lvlOverride>
+    <w:lvlOverride w:ilvl="8">
+      <w:startOverride w:val="1"/>
+    </w:lvlOverride>
+  </w:num>
+  <w:num w:numId="20">
+    <w:abstractNumId w:val="11"/>
+    <w:lvlOverride w:ilvl="0">
+      <w:startOverride w:val="1"/>
+    </w:lvlOverride>
+    <w:lvlOverride w:ilvl="1">
+      <w:startOverride w:val="1"/>
+    </w:lvlOverride>
+    <w:lvlOverride w:ilvl="2">
+      <w:startOverride w:val="1"/>
+    </w:lvlOverride>
+    <w:lvlOverride w:ilvl="3">
+      <w:startOverride w:val="1"/>
+    </w:lvlOverride>
+    <w:lvlOverride w:ilvl="4">
+      <w:startOverride w:val="1"/>
+    </w:lvlOverride>
+    <w:lvlOverride w:ilvl="5">
+      <w:startOverride w:val="1"/>
+    </w:lvlOverride>
+    <w:lvlOverride w:ilvl="6">
+      <w:startOverride w:val="1"/>
+    </w:lvlOverride>
+    <w:lvlOverride w:ilvl="7">
+      <w:startOverride w:val="1"/>
+    </w:lvlOverride>
+    <w:lvlOverride w:ilvl="8">
+      <w:startOverride w:val="1"/>
+    </w:lvlOverride>
+  </w:num>
+  <w:num w:numId="21">
+    <w:abstractNumId w:val="7"/>
+    <w:lvlOverride w:ilvl="0">
+      <w:startOverride w:val="1"/>
+    </w:lvlOverride>
+    <w:lvlOverride w:ilvl="1">
+      <w:startOverride w:val="1"/>
+    </w:lvlOverride>
+    <w:lvlOverride w:ilvl="2">
+      <w:startOverride w:val="1"/>
+    </w:lvlOverride>
+    <w:lvlOverride w:ilvl="3">
+      <w:startOverride w:val="1"/>
+    </w:lvlOverride>
+    <w:lvlOverride w:ilvl="4">
+      <w:startOverride w:val="1"/>
+    </w:lvlOverride>
+    <w:lvlOverride w:ilvl="5">
+      <w:startOverride w:val="1"/>
+    </w:lvlOverride>
+    <w:lvlOverride w:ilvl="6">
+      <w:startOverride w:val="1"/>
+    </w:lvlOverride>
+    <w:lvlOverride w:ilvl="7">
+      <w:startOverride w:val="1"/>
+    </w:lvlOverride>
+    <w:lvlOverride w:ilvl="8">
+      <w:startOverride w:val="1"/>
+    </w:lvlOverride>
+  </w:num>
+  <w:num w:numId="22">
+    <w:abstractNumId w:val="15"/>
+    <w:lvlOverride w:ilvl="0">
+      <w:startOverride w:val="1"/>
+    </w:lvlOverride>
+    <w:lvlOverride w:ilvl="1">
+      <w:startOverride w:val="1"/>
+    </w:lvlOverride>
+    <w:lvlOverride w:ilvl="2">
+      <w:startOverride w:val="1"/>
+    </w:lvlOverride>
+    <w:lvlOverride w:ilvl="3">
+      <w:startOverride w:val="1"/>
+    </w:lvlOverride>
+    <w:lvlOverride w:ilvl="4">
+      <w:startOverride w:val="1"/>
+    </w:lvlOverride>
+    <w:lvlOverride w:ilvl="5">
+      <w:startOverride w:val="1"/>
+    </w:lvlOverride>
+    <w:lvlOverride w:ilvl="6">
+      <w:startOverride w:val="1"/>
+    </w:lvlOverride>
+    <w:lvlOverride w:ilvl="7">
+      <w:startOverride w:val="1"/>
+    </w:lvlOverride>
+    <w:lvlOverride w:ilvl="8">
+      <w:startOverride w:val="1"/>
+    </w:lvlOverride>
+  </w:num>
+  <w:num w:numId="23">
     <w:abstractNumId w:val="24"/>
     <w:lvlOverride w:ilvl="0">
       <w:startOverride w:val="1"/>
@@ -11660,128 +13711,8 @@
       <w:startOverride w:val="1"/>
     </w:lvlOverride>
   </w:num>
-  <w:num w:numId="20">
-    <w:abstractNumId w:val="9"/>
-    <w:lvlOverride w:ilvl="0">
-      <w:startOverride w:val="1"/>
-    </w:lvlOverride>
-    <w:lvlOverride w:ilvl="1">
-      <w:startOverride w:val="1"/>
-    </w:lvlOverride>
-    <w:lvlOverride w:ilvl="2">
-      <w:startOverride w:val="1"/>
-    </w:lvlOverride>
-    <w:lvlOverride w:ilvl="3">
-      <w:startOverride w:val="1"/>
-    </w:lvlOverride>
-    <w:lvlOverride w:ilvl="4">
-      <w:startOverride w:val="1"/>
-    </w:lvlOverride>
-    <w:lvlOverride w:ilvl="5">
-      <w:startOverride w:val="1"/>
-    </w:lvlOverride>
-    <w:lvlOverride w:ilvl="6">
-      <w:startOverride w:val="1"/>
-    </w:lvlOverride>
-    <w:lvlOverride w:ilvl="7">
-      <w:startOverride w:val="1"/>
-    </w:lvlOverride>
-    <w:lvlOverride w:ilvl="8">
-      <w:startOverride w:val="1"/>
-    </w:lvlOverride>
-  </w:num>
-  <w:num w:numId="21">
-    <w:abstractNumId w:val="5"/>
-    <w:lvlOverride w:ilvl="0">
-      <w:startOverride w:val="1"/>
-    </w:lvlOverride>
-    <w:lvlOverride w:ilvl="1">
-      <w:startOverride w:val="1"/>
-    </w:lvlOverride>
-    <w:lvlOverride w:ilvl="2">
-      <w:startOverride w:val="1"/>
-    </w:lvlOverride>
-    <w:lvlOverride w:ilvl="3">
-      <w:startOverride w:val="1"/>
-    </w:lvlOverride>
-    <w:lvlOverride w:ilvl="4">
-      <w:startOverride w:val="1"/>
-    </w:lvlOverride>
-    <w:lvlOverride w:ilvl="5">
-      <w:startOverride w:val="1"/>
-    </w:lvlOverride>
-    <w:lvlOverride w:ilvl="6">
-      <w:startOverride w:val="1"/>
-    </w:lvlOverride>
-    <w:lvlOverride w:ilvl="7">
-      <w:startOverride w:val="1"/>
-    </w:lvlOverride>
-    <w:lvlOverride w:ilvl="8">
-      <w:startOverride w:val="1"/>
-    </w:lvlOverride>
-  </w:num>
-  <w:num w:numId="22">
-    <w:abstractNumId w:val="13"/>
-    <w:lvlOverride w:ilvl="0">
-      <w:startOverride w:val="1"/>
-    </w:lvlOverride>
-    <w:lvlOverride w:ilvl="1">
-      <w:startOverride w:val="1"/>
-    </w:lvlOverride>
-    <w:lvlOverride w:ilvl="2">
-      <w:startOverride w:val="1"/>
-    </w:lvlOverride>
-    <w:lvlOverride w:ilvl="3">
-      <w:startOverride w:val="1"/>
-    </w:lvlOverride>
-    <w:lvlOverride w:ilvl="4">
-      <w:startOverride w:val="1"/>
-    </w:lvlOverride>
-    <w:lvlOverride w:ilvl="5">
-      <w:startOverride w:val="1"/>
-    </w:lvlOverride>
-    <w:lvlOverride w:ilvl="6">
-      <w:startOverride w:val="1"/>
-    </w:lvlOverride>
-    <w:lvlOverride w:ilvl="7">
-      <w:startOverride w:val="1"/>
-    </w:lvlOverride>
-    <w:lvlOverride w:ilvl="8">
-      <w:startOverride w:val="1"/>
-    </w:lvlOverride>
-  </w:num>
-  <w:num w:numId="23">
-    <w:abstractNumId w:val="22"/>
-    <w:lvlOverride w:ilvl="0">
-      <w:startOverride w:val="1"/>
-    </w:lvlOverride>
-    <w:lvlOverride w:ilvl="1">
-      <w:startOverride w:val="1"/>
-    </w:lvlOverride>
-    <w:lvlOverride w:ilvl="2">
-      <w:startOverride w:val="1"/>
-    </w:lvlOverride>
-    <w:lvlOverride w:ilvl="3">
-      <w:startOverride w:val="1"/>
-    </w:lvlOverride>
-    <w:lvlOverride w:ilvl="4">
-      <w:startOverride w:val="1"/>
-    </w:lvlOverride>
-    <w:lvlOverride w:ilvl="5">
-      <w:startOverride w:val="1"/>
-    </w:lvlOverride>
-    <w:lvlOverride w:ilvl="6">
-      <w:startOverride w:val="1"/>
-    </w:lvlOverride>
-    <w:lvlOverride w:ilvl="7">
-      <w:startOverride w:val="1"/>
-    </w:lvlOverride>
-    <w:lvlOverride w:ilvl="8">
-      <w:startOverride w:val="1"/>
-    </w:lvlOverride>
-  </w:num>
   <w:num w:numId="24">
-    <w:abstractNumId w:val="18"/>
+    <w:abstractNumId w:val="20"/>
     <w:lvlOverride w:ilvl="0">
       <w:startOverride w:val="1"/>
     </w:lvlOverride>
@@ -11811,7 +13742,7 @@
     </w:lvlOverride>
   </w:num>
   <w:num w:numId="25">
-    <w:abstractNumId w:val="34"/>
+    <w:abstractNumId w:val="36"/>
     <w:lvlOverride w:ilvl="0">
       <w:startOverride w:val="1"/>
     </w:lvlOverride>
@@ -11841,7 +13772,7 @@
     </w:lvlOverride>
   </w:num>
   <w:num w:numId="26">
-    <w:abstractNumId w:val="3"/>
+    <w:abstractNumId w:val="4"/>
     <w:lvlOverride w:ilvl="0">
       <w:startOverride w:val="1"/>
     </w:lvlOverride>
@@ -11871,7 +13802,7 @@
     </w:lvlOverride>
   </w:num>
   <w:num w:numId="27">
-    <w:abstractNumId w:val="26"/>
+    <w:abstractNumId w:val="28"/>
     <w:lvlOverride w:ilvl="0">
       <w:startOverride w:val="1"/>
     </w:lvlOverride>
@@ -11901,28 +13832,37 @@
     </w:lvlOverride>
   </w:num>
   <w:num w:numId="28">
-    <w:abstractNumId w:val="27"/>
+    <w:abstractNumId w:val="29"/>
   </w:num>
   <w:num w:numId="29">
-    <w:abstractNumId w:val="28"/>
+    <w:abstractNumId w:val="30"/>
   </w:num>
   <w:num w:numId="30">
-    <w:abstractNumId w:val="23"/>
+    <w:abstractNumId w:val="25"/>
   </w:num>
   <w:num w:numId="31">
+    <w:abstractNumId w:val="16"/>
+  </w:num>
+  <w:num w:numId="32">
+    <w:abstractNumId w:val="22"/>
+  </w:num>
+  <w:num w:numId="33">
+    <w:abstractNumId w:val="13"/>
+  </w:num>
+  <w:num w:numId="34">
+    <w:abstractNumId w:val="12"/>
+  </w:num>
+  <w:num w:numId="35">
     <w:abstractNumId w:val="14"/>
   </w:num>
-  <w:num w:numId="32">
-    <w:abstractNumId w:val="20"/>
+  <w:num w:numId="36">
+    <w:abstractNumId w:val="1"/>
   </w:num>
-  <w:num w:numId="33">
-    <w:abstractNumId w:val="11"/>
+  <w:num w:numId="37">
+    <w:abstractNumId w:val="4"/>
   </w:num>
-  <w:num w:numId="34">
-    <w:abstractNumId w:val="10"/>
-  </w:num>
-  <w:num w:numId="35">
-    <w:abstractNumId w:val="12"/>
+  <w:num w:numId="38">
+    <w:abstractNumId w:val="5"/>
   </w:num>
   <w:numIdMacAtCleanup w:val="30"/>
 </w:numbering>
@@ -12412,7 +14352,6 @@
   <w:style w:type="character" w:default="1" w:styleId="DefaultParagraphFont">
     <w:name w:val="Default Paragraph Font"/>
     <w:uiPriority w:val="1"/>
-    <w:semiHidden/>
     <w:unhideWhenUsed/>
   </w:style>
   <w:style w:type="table" w:default="1" w:styleId="TableNormal">
@@ -12633,6 +14572,31 @@
       <w:b/>
       <w:sz w:val="24"/>
       <w:szCs w:val="26"/>
+      <w:lang w:val="id-ID"/>
+    </w:rPr>
+  </w:style>
+  <w:style w:type="paragraph" w:customStyle="1" w:styleId="isianaksub-bab">
+    <w:name w:val="isi anak sub-bab"/>
+    <w:basedOn w:val="Normal"/>
+    <w:link w:val="isianaksub-babChar"/>
+    <w:qFormat/>
+    <w:rsid w:val="00290F7A"/>
+    <w:pPr>
+      <w:ind w:left="540" w:firstLine="720"/>
+    </w:pPr>
+    <w:rPr>
+      <w:iCs/>
+    </w:rPr>
+  </w:style>
+  <w:style w:type="character" w:customStyle="1" w:styleId="isianaksub-babChar">
+    <w:name w:val="isi anak sub-bab Char"/>
+    <w:basedOn w:val="DefaultParagraphFont"/>
+    <w:link w:val="isianaksub-bab"/>
+    <w:rsid w:val="00290F7A"/>
+    <w:rPr>
+      <w:rFonts w:ascii="Times New Roman" w:hAnsi="Times New Roman"/>
+      <w:iCs/>
+      <w:sz w:val="24"/>
       <w:lang w:val="id-ID"/>
     </w:rPr>
   </w:style>

</xml_diff>

<commit_message>
Finalisasi sebelum bimbingan terakhir.
</commit_message>
<xml_diff>
--- a/Implementasi Design System V2 pada Perancangan Ulang Platform Reusely untuk Meningkatkan Konsistensi dan Efektivitas Prototipe.docx
+++ b/Implementasi Design System V2 pada Perancangan Ulang Platform Reusely untuk Meningkatkan Konsistensi dan Efektivitas Prototipe.docx
@@ -1324,6 +1324,22 @@
               </w:rPr>
               <w:t>NIDN:</w:t>
             </w:r>
+            <w:r>
+              <w:rPr>
+                <w:rFonts w:eastAsia="Times New Roman" w:cs="Times New Roman"/>
+                <w:szCs w:val="24"/>
+                <w:lang w:val="en-US"/>
+              </w:rPr>
+              <w:t xml:space="preserve"> </w:t>
+            </w:r>
+            <w:r>
+              <w:rPr>
+                <w:rFonts w:eastAsia="Times New Roman" w:cs="Times New Roman"/>
+                <w:szCs w:val="24"/>
+                <w:lang w:val="en-US"/>
+              </w:rPr>
+              <w:t>04 220477 03</w:t>
+            </w:r>
           </w:p>
         </w:tc>
         <w:tc>
@@ -1365,6 +1381,22 @@
               </w:rPr>
               <w:t>NIDN:</w:t>
             </w:r>
+            <w:r>
+              <w:rPr>
+                <w:rFonts w:eastAsia="Times New Roman" w:cs="Times New Roman"/>
+                <w:szCs w:val="24"/>
+                <w:lang w:val="en-US"/>
+              </w:rPr>
+              <w:t xml:space="preserve"> </w:t>
+            </w:r>
+            <w:r>
+              <w:rPr>
+                <w:rFonts w:eastAsia="Times New Roman" w:cs="Times New Roman"/>
+                <w:szCs w:val="24"/>
+                <w:lang w:val="en-US"/>
+              </w:rPr>
+              <w:t>04 220477 03</w:t>
+            </w:r>
           </w:p>
         </w:tc>
       </w:tr>
@@ -6884,21 +6916,7 @@
             <w:rStyle w:val="Hyperlink"/>
             <w:noProof/>
           </w:rPr>
-          <w:t xml:space="preserve"> Hala</w:t>
-        </w:r>
-        <w:r>
-          <w:rPr>
-            <w:rStyle w:val="Hyperlink"/>
-            <w:noProof/>
-          </w:rPr>
-          <w:t>m</w:t>
-        </w:r>
-        <w:r>
-          <w:rPr>
-            <w:rStyle w:val="Hyperlink"/>
-            <w:noProof/>
-          </w:rPr>
-          <w:t xml:space="preserve">an </w:t>
+          <w:t xml:space="preserve"> Halaman </w:t>
         </w:r>
         <w:r>
           <w:rPr>
@@ -17683,7 +17701,16 @@
         <w:t>User Interface</w:t>
       </w:r>
       <w:r>
-        <w:t xml:space="preserve"> merupakan aspek yang sangat penting dalam pengembangan sistem digital, aplikasi </w:t>
+        <w:t xml:space="preserve"> merupakan aspek yang sangat penting dalam pengembangan sistem digital,</w:t>
+      </w:r>
+      <w:r>
+        <w:rPr>
+          <w:lang w:val="en-US"/>
+        </w:rPr>
+        <w:t xml:space="preserve"> </w:t>
+      </w:r>
+      <w:r>
+        <w:t xml:space="preserve">aplikasi </w:t>
       </w:r>
       <w:r>
         <w:rPr>
@@ -17703,7 +17730,16 @@
         <w:t>desktop</w:t>
       </w:r>
       <w:r>
-        <w:t xml:space="preserve">, maupun platform </w:t>
+        <w:t>,</w:t>
+      </w:r>
+      <w:r>
+        <w:rPr>
+          <w:lang w:val="en-US"/>
+        </w:rPr>
+        <w:t xml:space="preserve"> </w:t>
+      </w:r>
+      <w:r>
+        <w:t xml:space="preserve">maupun platform </w:t>
       </w:r>
       <w:r>
         <w:rPr>
@@ -18744,9 +18780,17 @@
       </w:r>
       <w:r>
         <w:rPr>
-          <w:lang w:val="en-US"/>
-        </w:rPr>
-        <w:t xml:space="preserve">Prototype merupakan </w:t>
+          <w:i/>
+          <w:iCs w:val="0"/>
+          <w:lang w:val="en-US"/>
+        </w:rPr>
+        <w:t>Prototype</w:t>
+      </w:r>
+      <w:r>
+        <w:rPr>
+          <w:lang w:val="en-US"/>
+        </w:rPr>
+        <w:t xml:space="preserve"> merupakan </w:t>
       </w:r>
       <w:r>
         <w:t xml:space="preserve">model simulasi interaktif dari produk digital yang memiliki tingkat presisi dan kemiripan sangat tinggi dengan produk aslinya, baik dari segi visual, tata letak, warna, tipografi, maupun detail interaksi </w:t>
@@ -23727,6 +23771,8 @@
       </w:r>
       <w:r>
         <w:rPr>
+          <w:i/>
+          <w:iCs w:val="0"/>
           <w:lang w:val="en-US"/>
         </w:rPr>
         <w:t>user interface</w:t>
@@ -26860,10 +26906,642 @@
         <w:fldChar w:fldCharType="end"/>
       </w:r>
     </w:p>
+    <w:p>
+      <w:pPr>
+        <w:spacing w:line="259" w:lineRule="auto"/>
+        <w:jc w:val="left"/>
+        <w:rPr>
+          <w:rFonts w:cs="Times New Roman"/>
+          <w:szCs w:val="24"/>
+          <w:lang w:val="en-US"/>
+        </w:rPr>
+      </w:pPr>
+      <w:r>
+        <w:rPr>
+          <w:rFonts w:cs="Times New Roman"/>
+          <w:szCs w:val="24"/>
+          <w:lang w:val="en-US"/>
+        </w:rPr>
+        <w:br w:type="page"/>
+      </w:r>
+    </w:p>
+    <w:p>
+      <w:pPr>
+        <w:ind w:left="540" w:hanging="540"/>
+        <w:jc w:val="center"/>
+        <w:rPr>
+          <w:rFonts w:cs="Times New Roman"/>
+          <w:b/>
+          <w:bCs/>
+          <w:sz w:val="28"/>
+          <w:szCs w:val="28"/>
+          <w:lang w:val="en-US"/>
+        </w:rPr>
+        <w:sectPr>
+          <w:headerReference w:type="default" r:id="rId35"/>
+          <w:footerReference w:type="default" r:id="rId36"/>
+          <w:headerReference w:type="first" r:id="rId37"/>
+          <w:pgSz w:w="11906" w:h="16838" w:code="9"/>
+          <w:pgMar w:top="2268" w:right="1701" w:bottom="1701" w:left="2268" w:header="720" w:footer="720" w:gutter="0"/>
+          <w:cols w:space="720"/>
+          <w:titlePg/>
+          <w:docGrid w:linePitch="360"/>
+        </w:sectPr>
+      </w:pPr>
+    </w:p>
+    <w:p>
+      <w:pPr>
+        <w:ind w:left="540" w:hanging="540"/>
+        <w:jc w:val="center"/>
+        <w:rPr>
+          <w:rFonts w:cs="Times New Roman"/>
+          <w:b/>
+          <w:bCs/>
+          <w:sz w:val="28"/>
+          <w:szCs w:val="28"/>
+          <w:lang w:val="en-US"/>
+        </w:rPr>
+      </w:pPr>
+      <w:r>
+        <w:rPr>
+          <w:rFonts w:cs="Times New Roman"/>
+          <w:b/>
+          <w:bCs/>
+          <w:sz w:val="28"/>
+          <w:szCs w:val="28"/>
+          <w:lang w:val="en-US"/>
+        </w:rPr>
+        <w:lastRenderedPageBreak/>
+        <w:t>LAMPIRAN</w:t>
+      </w:r>
+    </w:p>
+    <w:p>
+      <w:pPr>
+        <w:ind w:left="540" w:hanging="540"/>
+        <w:rPr>
+          <w:rFonts w:cs="Times New Roman"/>
+          <w:b/>
+          <w:bCs/>
+          <w:szCs w:val="24"/>
+          <w:lang w:val="en-US"/>
+        </w:rPr>
+      </w:pPr>
+      <w:r>
+        <w:rPr>
+          <w:rFonts w:cs="Times New Roman"/>
+          <w:b/>
+          <w:bCs/>
+          <w:noProof/>
+          <w:szCs w:val="24"/>
+          <w:lang w:val="en-US"/>
+        </w:rPr>
+        <w:drawing>
+          <wp:inline distT="0" distB="0" distL="0" distR="0" wp14:anchorId="7FDA57B7" wp14:editId="205C0595">
+            <wp:extent cx="5039995" cy="6720205"/>
+            <wp:effectExtent l="0" t="0" r="8255" b="4445"/>
+            <wp:docPr id="18" name="Picture 18"/>
+            <wp:cNvGraphicFramePr>
+              <a:graphicFrameLocks xmlns:a="http://schemas.openxmlformats.org/drawingml/2006/main" noChangeAspect="1"/>
+            </wp:cNvGraphicFramePr>
+            <a:graphic xmlns:a="http://schemas.openxmlformats.org/drawingml/2006/main">
+              <a:graphicData uri="http://schemas.openxmlformats.org/drawingml/2006/picture">
+                <pic:pic xmlns:pic="http://schemas.openxmlformats.org/drawingml/2006/picture">
+                  <pic:nvPicPr>
+                    <pic:cNvPr id="18" name="Picture 18"/>
+                    <pic:cNvPicPr/>
+                  </pic:nvPicPr>
+                  <pic:blipFill>
+                    <a:blip r:embed="rId38">
+                      <a:extLst>
+                        <a:ext uri="{28A0092B-C50C-407E-A947-70E740481C1C}">
+                          <a14:useLocalDpi xmlns:a14="http://schemas.microsoft.com/office/drawing/2010/main" val="0"/>
+                        </a:ext>
+                      </a:extLst>
+                    </a:blip>
+                    <a:stretch>
+                      <a:fillRect/>
+                    </a:stretch>
+                  </pic:blipFill>
+                  <pic:spPr>
+                    <a:xfrm>
+                      <a:off x="0" y="0"/>
+                      <a:ext cx="5039995" cy="6720205"/>
+                    </a:xfrm>
+                    <a:prstGeom prst="rect">
+                      <a:avLst/>
+                    </a:prstGeom>
+                  </pic:spPr>
+                </pic:pic>
+              </a:graphicData>
+            </a:graphic>
+          </wp:inline>
+        </w:drawing>
+      </w:r>
+    </w:p>
+    <w:p>
+      <w:pPr>
+        <w:ind w:left="540" w:hanging="540"/>
+        <w:rPr>
+          <w:rFonts w:cs="Times New Roman"/>
+          <w:b/>
+          <w:bCs/>
+          <w:szCs w:val="24"/>
+          <w:lang w:val="en-US"/>
+        </w:rPr>
+      </w:pPr>
+      <w:r>
+        <w:rPr>
+          <w:rFonts w:cs="Times New Roman"/>
+          <w:b/>
+          <w:bCs/>
+          <w:noProof/>
+          <w:szCs w:val="24"/>
+          <w:lang w:val="en-US"/>
+        </w:rPr>
+        <w:lastRenderedPageBreak/>
+        <w:drawing>
+          <wp:inline distT="0" distB="0" distL="0" distR="0" wp14:anchorId="0742AAF4" wp14:editId="370F4F0E">
+            <wp:extent cx="5039995" cy="7219315"/>
+            <wp:effectExtent l="0" t="0" r="8255" b="635"/>
+            <wp:docPr id="19" name="Picture 19"/>
+            <wp:cNvGraphicFramePr>
+              <a:graphicFrameLocks xmlns:a="http://schemas.openxmlformats.org/drawingml/2006/main" noChangeAspect="1"/>
+            </wp:cNvGraphicFramePr>
+            <a:graphic xmlns:a="http://schemas.openxmlformats.org/drawingml/2006/main">
+              <a:graphicData uri="http://schemas.openxmlformats.org/drawingml/2006/picture">
+                <pic:pic xmlns:pic="http://schemas.openxmlformats.org/drawingml/2006/picture">
+                  <pic:nvPicPr>
+                    <pic:cNvPr id="19" name="Picture 19"/>
+                    <pic:cNvPicPr/>
+                  </pic:nvPicPr>
+                  <pic:blipFill>
+                    <a:blip r:embed="rId39">
+                      <a:extLst>
+                        <a:ext uri="{28A0092B-C50C-407E-A947-70E740481C1C}">
+                          <a14:useLocalDpi xmlns:a14="http://schemas.microsoft.com/office/drawing/2010/main" val="0"/>
+                        </a:ext>
+                      </a:extLst>
+                    </a:blip>
+                    <a:stretch>
+                      <a:fillRect/>
+                    </a:stretch>
+                  </pic:blipFill>
+                  <pic:spPr>
+                    <a:xfrm>
+                      <a:off x="0" y="0"/>
+                      <a:ext cx="5039995" cy="7219315"/>
+                    </a:xfrm>
+                    <a:prstGeom prst="rect">
+                      <a:avLst/>
+                    </a:prstGeom>
+                  </pic:spPr>
+                </pic:pic>
+              </a:graphicData>
+            </a:graphic>
+          </wp:inline>
+        </w:drawing>
+      </w:r>
+    </w:p>
+    <w:p>
+      <w:pPr>
+        <w:ind w:left="540" w:hanging="540"/>
+        <w:rPr>
+          <w:rFonts w:cs="Times New Roman"/>
+          <w:b/>
+          <w:bCs/>
+          <w:szCs w:val="24"/>
+          <w:lang w:val="en-US"/>
+        </w:rPr>
+      </w:pPr>
+      <w:r>
+        <w:rPr>
+          <w:rFonts w:cs="Times New Roman"/>
+          <w:b/>
+          <w:bCs/>
+          <w:noProof/>
+          <w:szCs w:val="24"/>
+          <w:lang w:val="en-US"/>
+        </w:rPr>
+        <w:lastRenderedPageBreak/>
+        <w:drawing>
+          <wp:inline distT="0" distB="0" distL="0" distR="0" wp14:anchorId="7F08AF5F" wp14:editId="01EDAC56">
+            <wp:extent cx="5039995" cy="7232015"/>
+            <wp:effectExtent l="0" t="0" r="8255" b="6985"/>
+            <wp:docPr id="21" name="Picture 21"/>
+            <wp:cNvGraphicFramePr>
+              <a:graphicFrameLocks xmlns:a="http://schemas.openxmlformats.org/drawingml/2006/main" noChangeAspect="1"/>
+            </wp:cNvGraphicFramePr>
+            <a:graphic xmlns:a="http://schemas.openxmlformats.org/drawingml/2006/main">
+              <a:graphicData uri="http://schemas.openxmlformats.org/drawingml/2006/picture">
+                <pic:pic xmlns:pic="http://schemas.openxmlformats.org/drawingml/2006/picture">
+                  <pic:nvPicPr>
+                    <pic:cNvPr id="21" name="Picture 21"/>
+                    <pic:cNvPicPr/>
+                  </pic:nvPicPr>
+                  <pic:blipFill>
+                    <a:blip r:embed="rId40">
+                      <a:extLst>
+                        <a:ext uri="{28A0092B-C50C-407E-A947-70E740481C1C}">
+                          <a14:useLocalDpi xmlns:a14="http://schemas.microsoft.com/office/drawing/2010/main" val="0"/>
+                        </a:ext>
+                      </a:extLst>
+                    </a:blip>
+                    <a:stretch>
+                      <a:fillRect/>
+                    </a:stretch>
+                  </pic:blipFill>
+                  <pic:spPr>
+                    <a:xfrm>
+                      <a:off x="0" y="0"/>
+                      <a:ext cx="5039995" cy="7232015"/>
+                    </a:xfrm>
+                    <a:prstGeom prst="rect">
+                      <a:avLst/>
+                    </a:prstGeom>
+                  </pic:spPr>
+                </pic:pic>
+              </a:graphicData>
+            </a:graphic>
+          </wp:inline>
+        </w:drawing>
+      </w:r>
+    </w:p>
+    <w:p>
+      <w:pPr>
+        <w:ind w:left="540" w:hanging="540"/>
+        <w:rPr>
+          <w:rFonts w:cs="Times New Roman"/>
+          <w:b/>
+          <w:bCs/>
+          <w:szCs w:val="24"/>
+          <w:lang w:val="en-US"/>
+        </w:rPr>
+      </w:pPr>
+      <w:r>
+        <w:rPr>
+          <w:rFonts w:cs="Times New Roman"/>
+          <w:b/>
+          <w:bCs/>
+          <w:noProof/>
+          <w:szCs w:val="24"/>
+          <w:lang w:val="en-US"/>
+        </w:rPr>
+        <w:lastRenderedPageBreak/>
+        <w:drawing>
+          <wp:inline distT="0" distB="0" distL="0" distR="0" wp14:anchorId="4B3A7401" wp14:editId="1B9D28F3">
+            <wp:extent cx="5039995" cy="7397115"/>
+            <wp:effectExtent l="0" t="0" r="8255" b="0"/>
+            <wp:docPr id="22" name="Picture 22"/>
+            <wp:cNvGraphicFramePr>
+              <a:graphicFrameLocks xmlns:a="http://schemas.openxmlformats.org/drawingml/2006/main" noChangeAspect="1"/>
+            </wp:cNvGraphicFramePr>
+            <a:graphic xmlns:a="http://schemas.openxmlformats.org/drawingml/2006/main">
+              <a:graphicData uri="http://schemas.openxmlformats.org/drawingml/2006/picture">
+                <pic:pic xmlns:pic="http://schemas.openxmlformats.org/drawingml/2006/picture">
+                  <pic:nvPicPr>
+                    <pic:cNvPr id="22" name="Picture 22"/>
+                    <pic:cNvPicPr/>
+                  </pic:nvPicPr>
+                  <pic:blipFill>
+                    <a:blip r:embed="rId41" cstate="print">
+                      <a:extLst>
+                        <a:ext uri="{28A0092B-C50C-407E-A947-70E740481C1C}">
+                          <a14:useLocalDpi xmlns:a14="http://schemas.microsoft.com/office/drawing/2010/main" val="0"/>
+                        </a:ext>
+                      </a:extLst>
+                    </a:blip>
+                    <a:stretch>
+                      <a:fillRect/>
+                    </a:stretch>
+                  </pic:blipFill>
+                  <pic:spPr>
+                    <a:xfrm>
+                      <a:off x="0" y="0"/>
+                      <a:ext cx="5039995" cy="7397115"/>
+                    </a:xfrm>
+                    <a:prstGeom prst="rect">
+                      <a:avLst/>
+                    </a:prstGeom>
+                  </pic:spPr>
+                </pic:pic>
+              </a:graphicData>
+            </a:graphic>
+          </wp:inline>
+        </w:drawing>
+      </w:r>
+    </w:p>
+    <w:p>
+      <w:pPr>
+        <w:ind w:left="540" w:hanging="540"/>
+        <w:rPr>
+          <w:rFonts w:cs="Times New Roman"/>
+          <w:b/>
+          <w:bCs/>
+          <w:szCs w:val="24"/>
+          <w:lang w:val="en-US"/>
+        </w:rPr>
+      </w:pPr>
+      <w:r>
+        <w:rPr>
+          <w:rFonts w:cs="Times New Roman"/>
+          <w:b/>
+          <w:bCs/>
+          <w:noProof/>
+          <w:szCs w:val="24"/>
+          <w:lang w:val="en-US"/>
+        </w:rPr>
+        <w:lastRenderedPageBreak/>
+        <w:drawing>
+          <wp:inline distT="0" distB="0" distL="0" distR="0" wp14:anchorId="3C74033A" wp14:editId="7F88AD47">
+            <wp:extent cx="5039995" cy="7512050"/>
+            <wp:effectExtent l="0" t="0" r="8255" b="0"/>
+            <wp:docPr id="23" name="Picture 23"/>
+            <wp:cNvGraphicFramePr>
+              <a:graphicFrameLocks xmlns:a="http://schemas.openxmlformats.org/drawingml/2006/main" noChangeAspect="1"/>
+            </wp:cNvGraphicFramePr>
+            <a:graphic xmlns:a="http://schemas.openxmlformats.org/drawingml/2006/main">
+              <a:graphicData uri="http://schemas.openxmlformats.org/drawingml/2006/picture">
+                <pic:pic xmlns:pic="http://schemas.openxmlformats.org/drawingml/2006/picture">
+                  <pic:nvPicPr>
+                    <pic:cNvPr id="23" name="Picture 23"/>
+                    <pic:cNvPicPr/>
+                  </pic:nvPicPr>
+                  <pic:blipFill>
+                    <a:blip r:embed="rId42" cstate="print">
+                      <a:extLst>
+                        <a:ext uri="{28A0092B-C50C-407E-A947-70E740481C1C}">
+                          <a14:useLocalDpi xmlns:a14="http://schemas.microsoft.com/office/drawing/2010/main" val="0"/>
+                        </a:ext>
+                      </a:extLst>
+                    </a:blip>
+                    <a:stretch>
+                      <a:fillRect/>
+                    </a:stretch>
+                  </pic:blipFill>
+                  <pic:spPr>
+                    <a:xfrm>
+                      <a:off x="0" y="0"/>
+                      <a:ext cx="5039995" cy="7512050"/>
+                    </a:xfrm>
+                    <a:prstGeom prst="rect">
+                      <a:avLst/>
+                    </a:prstGeom>
+                  </pic:spPr>
+                </pic:pic>
+              </a:graphicData>
+            </a:graphic>
+          </wp:inline>
+        </w:drawing>
+      </w:r>
+    </w:p>
+    <w:p>
+      <w:pPr>
+        <w:ind w:left="540" w:hanging="540"/>
+        <w:rPr>
+          <w:rFonts w:cs="Times New Roman"/>
+          <w:b/>
+          <w:bCs/>
+          <w:szCs w:val="24"/>
+          <w:lang w:val="en-US"/>
+        </w:rPr>
+      </w:pPr>
+      <w:r>
+        <w:rPr>
+          <w:rFonts w:cs="Times New Roman"/>
+          <w:b/>
+          <w:bCs/>
+          <w:noProof/>
+          <w:szCs w:val="24"/>
+          <w:lang w:val="en-US"/>
+        </w:rPr>
+        <w:lastRenderedPageBreak/>
+        <w:drawing>
+          <wp:inline distT="0" distB="0" distL="0" distR="0" wp14:anchorId="63D46CA3" wp14:editId="1DCC291B">
+            <wp:extent cx="5039995" cy="7721600"/>
+            <wp:effectExtent l="0" t="0" r="8255" b="0"/>
+            <wp:docPr id="24" name="Picture 24"/>
+            <wp:cNvGraphicFramePr>
+              <a:graphicFrameLocks xmlns:a="http://schemas.openxmlformats.org/drawingml/2006/main" noChangeAspect="1"/>
+            </wp:cNvGraphicFramePr>
+            <a:graphic xmlns:a="http://schemas.openxmlformats.org/drawingml/2006/main">
+              <a:graphicData uri="http://schemas.openxmlformats.org/drawingml/2006/picture">
+                <pic:pic xmlns:pic="http://schemas.openxmlformats.org/drawingml/2006/picture">
+                  <pic:nvPicPr>
+                    <pic:cNvPr id="24" name="Picture 24"/>
+                    <pic:cNvPicPr/>
+                  </pic:nvPicPr>
+                  <pic:blipFill>
+                    <a:blip r:embed="rId43" cstate="print">
+                      <a:extLst>
+                        <a:ext uri="{28A0092B-C50C-407E-A947-70E740481C1C}">
+                          <a14:useLocalDpi xmlns:a14="http://schemas.microsoft.com/office/drawing/2010/main" val="0"/>
+                        </a:ext>
+                      </a:extLst>
+                    </a:blip>
+                    <a:stretch>
+                      <a:fillRect/>
+                    </a:stretch>
+                  </pic:blipFill>
+                  <pic:spPr>
+                    <a:xfrm>
+                      <a:off x="0" y="0"/>
+                      <a:ext cx="5039995" cy="7721600"/>
+                    </a:xfrm>
+                    <a:prstGeom prst="rect">
+                      <a:avLst/>
+                    </a:prstGeom>
+                  </pic:spPr>
+                </pic:pic>
+              </a:graphicData>
+            </a:graphic>
+          </wp:inline>
+        </w:drawing>
+      </w:r>
+    </w:p>
+    <w:p>
+      <w:pPr>
+        <w:ind w:left="540" w:hanging="540"/>
+        <w:rPr>
+          <w:rFonts w:cs="Times New Roman"/>
+          <w:b/>
+          <w:bCs/>
+          <w:szCs w:val="24"/>
+          <w:lang w:val="en-US"/>
+        </w:rPr>
+      </w:pPr>
+      <w:r>
+        <w:rPr>
+          <w:rFonts w:cs="Times New Roman"/>
+          <w:b/>
+          <w:bCs/>
+          <w:noProof/>
+          <w:szCs w:val="24"/>
+          <w:lang w:val="en-US"/>
+        </w:rPr>
+        <w:lastRenderedPageBreak/>
+        <w:drawing>
+          <wp:inline distT="0" distB="0" distL="0" distR="0" wp14:anchorId="61E05AB6" wp14:editId="495FF1DE">
+            <wp:extent cx="5039995" cy="7841615"/>
+            <wp:effectExtent l="0" t="0" r="8255" b="6985"/>
+            <wp:docPr id="25" name="Picture 25"/>
+            <wp:cNvGraphicFramePr>
+              <a:graphicFrameLocks xmlns:a="http://schemas.openxmlformats.org/drawingml/2006/main" noChangeAspect="1"/>
+            </wp:cNvGraphicFramePr>
+            <a:graphic xmlns:a="http://schemas.openxmlformats.org/drawingml/2006/main">
+              <a:graphicData uri="http://schemas.openxmlformats.org/drawingml/2006/picture">
+                <pic:pic xmlns:pic="http://schemas.openxmlformats.org/drawingml/2006/picture">
+                  <pic:nvPicPr>
+                    <pic:cNvPr id="25" name="Picture 25"/>
+                    <pic:cNvPicPr/>
+                  </pic:nvPicPr>
+                  <pic:blipFill>
+                    <a:blip r:embed="rId44" cstate="print">
+                      <a:extLst>
+                        <a:ext uri="{28A0092B-C50C-407E-A947-70E740481C1C}">
+                          <a14:useLocalDpi xmlns:a14="http://schemas.microsoft.com/office/drawing/2010/main" val="0"/>
+                        </a:ext>
+                      </a:extLst>
+                    </a:blip>
+                    <a:stretch>
+                      <a:fillRect/>
+                    </a:stretch>
+                  </pic:blipFill>
+                  <pic:spPr>
+                    <a:xfrm>
+                      <a:off x="0" y="0"/>
+                      <a:ext cx="5039995" cy="7841615"/>
+                    </a:xfrm>
+                    <a:prstGeom prst="rect">
+                      <a:avLst/>
+                    </a:prstGeom>
+                  </pic:spPr>
+                </pic:pic>
+              </a:graphicData>
+            </a:graphic>
+          </wp:inline>
+        </w:drawing>
+      </w:r>
+      <w:r>
+        <w:rPr>
+          <w:rFonts w:cs="Times New Roman"/>
+          <w:b/>
+          <w:bCs/>
+          <w:noProof/>
+          <w:szCs w:val="24"/>
+          <w:lang w:val="en-US"/>
+        </w:rPr>
+        <w:lastRenderedPageBreak/>
+        <w:drawing>
+          <wp:inline distT="0" distB="0" distL="0" distR="0" wp14:anchorId="64B7BA32" wp14:editId="23D983E4">
+            <wp:extent cx="5039995" cy="6978015"/>
+            <wp:effectExtent l="0" t="0" r="8255" b="0"/>
+            <wp:docPr id="26" name="Picture 26"/>
+            <wp:cNvGraphicFramePr>
+              <a:graphicFrameLocks xmlns:a="http://schemas.openxmlformats.org/drawingml/2006/main" noChangeAspect="1"/>
+            </wp:cNvGraphicFramePr>
+            <a:graphic xmlns:a="http://schemas.openxmlformats.org/drawingml/2006/main">
+              <a:graphicData uri="http://schemas.openxmlformats.org/drawingml/2006/picture">
+                <pic:pic xmlns:pic="http://schemas.openxmlformats.org/drawingml/2006/picture">
+                  <pic:nvPicPr>
+                    <pic:cNvPr id="26" name="Picture 26"/>
+                    <pic:cNvPicPr/>
+                  </pic:nvPicPr>
+                  <pic:blipFill>
+                    <a:blip r:embed="rId45" cstate="print">
+                      <a:extLst>
+                        <a:ext uri="{28A0092B-C50C-407E-A947-70E740481C1C}">
+                          <a14:useLocalDpi xmlns:a14="http://schemas.microsoft.com/office/drawing/2010/main" val="0"/>
+                        </a:ext>
+                      </a:extLst>
+                    </a:blip>
+                    <a:stretch>
+                      <a:fillRect/>
+                    </a:stretch>
+                  </pic:blipFill>
+                  <pic:spPr>
+                    <a:xfrm>
+                      <a:off x="0" y="0"/>
+                      <a:ext cx="5039995" cy="6978015"/>
+                    </a:xfrm>
+                    <a:prstGeom prst="rect">
+                      <a:avLst/>
+                    </a:prstGeom>
+                  </pic:spPr>
+                </pic:pic>
+              </a:graphicData>
+            </a:graphic>
+          </wp:inline>
+        </w:drawing>
+      </w:r>
+    </w:p>
+    <w:p>
+      <w:pPr>
+        <w:ind w:left="540" w:hanging="540"/>
+        <w:rPr>
+          <w:rFonts w:cs="Times New Roman"/>
+          <w:b/>
+          <w:bCs/>
+          <w:szCs w:val="24"/>
+          <w:lang w:val="en-US"/>
+        </w:rPr>
+      </w:pPr>
+      <w:r>
+        <w:rPr>
+          <w:rFonts w:cs="Times New Roman"/>
+          <w:b/>
+          <w:bCs/>
+          <w:noProof/>
+          <w:szCs w:val="24"/>
+          <w:lang w:val="en-US"/>
+        </w:rPr>
+        <w:lastRenderedPageBreak/>
+        <w:drawing>
+          <wp:inline distT="0" distB="0" distL="0" distR="0" wp14:anchorId="2A319AC8" wp14:editId="7FED2C33">
+            <wp:extent cx="5039995" cy="6806565"/>
+            <wp:effectExtent l="0" t="0" r="8255" b="0"/>
+            <wp:docPr id="27" name="Picture 27"/>
+            <wp:cNvGraphicFramePr>
+              <a:graphicFrameLocks xmlns:a="http://schemas.openxmlformats.org/drawingml/2006/main" noChangeAspect="1"/>
+            </wp:cNvGraphicFramePr>
+            <a:graphic xmlns:a="http://schemas.openxmlformats.org/drawingml/2006/main">
+              <a:graphicData uri="http://schemas.openxmlformats.org/drawingml/2006/picture">
+                <pic:pic xmlns:pic="http://schemas.openxmlformats.org/drawingml/2006/picture">
+                  <pic:nvPicPr>
+                    <pic:cNvPr id="27" name="Picture 27"/>
+                    <pic:cNvPicPr/>
+                  </pic:nvPicPr>
+                  <pic:blipFill>
+                    <a:blip r:embed="rId46" cstate="print">
+                      <a:extLst>
+                        <a:ext uri="{28A0092B-C50C-407E-A947-70E740481C1C}">
+                          <a14:useLocalDpi xmlns:a14="http://schemas.microsoft.com/office/drawing/2010/main" val="0"/>
+                        </a:ext>
+                      </a:extLst>
+                    </a:blip>
+                    <a:stretch>
+                      <a:fillRect/>
+                    </a:stretch>
+                  </pic:blipFill>
+                  <pic:spPr>
+                    <a:xfrm>
+                      <a:off x="0" y="0"/>
+                      <a:ext cx="5039995" cy="6806565"/>
+                    </a:xfrm>
+                    <a:prstGeom prst="rect">
+                      <a:avLst/>
+                    </a:prstGeom>
+                  </pic:spPr>
+                </pic:pic>
+              </a:graphicData>
+            </a:graphic>
+          </wp:inline>
+        </w:drawing>
+      </w:r>
+    </w:p>
     <w:sectPr>
-      <w:headerReference w:type="default" r:id="rId35"/>
-      <w:footerReference w:type="default" r:id="rId36"/>
-      <w:headerReference w:type="first" r:id="rId37"/>
+      <w:headerReference w:type="default" r:id="rId47"/>
+      <w:footerReference w:type="default" r:id="rId48"/>
+      <w:type w:val="continuous"/>
       <w:pgSz w:w="11906" w:h="16838" w:code="9"/>
       <w:pgMar w:top="2268" w:right="1701" w:bottom="1701" w:left="2268" w:header="720" w:footer="720" w:gutter="0"/>
       <w:cols w:space="720"/>
@@ -27032,49 +27710,56 @@
 
 <file path=word/footer5.xml><?xml version="1.0" encoding="utf-8"?>
 <w:ftr xmlns:wpc="http://schemas.microsoft.com/office/word/2010/wordprocessingCanvas" xmlns:cx="http://schemas.microsoft.com/office/drawing/2014/chartex" xmlns:cx1="http://schemas.microsoft.com/office/drawing/2015/9/8/chartex" xmlns:cx2="http://schemas.microsoft.com/office/drawing/2015/10/21/chartex" xmlns:cx3="http://schemas.microsoft.com/office/drawing/2016/5/9/chartex" xmlns:cx4="http://schemas.microsoft.com/office/drawing/2016/5/10/chartex" xmlns:cx5="http://schemas.microsoft.com/office/drawing/2016/5/11/chartex" xmlns:cx6="http://schemas.microsoft.com/office/drawing/2016/5/12/chartex" xmlns:cx7="http://schemas.microsoft.com/office/drawing/2016/5/13/chartex" xmlns:cx8="http://schemas.microsoft.com/office/drawing/2016/5/14/chartex" xmlns:mc="http://schemas.openxmlformats.org/markup-compatibility/2006" xmlns:aink="http://schemas.microsoft.com/office/drawing/2016/ink" xmlns:am3d="http://schemas.microsoft.com/office/drawing/2017/model3d" xmlns:o="urn:schemas-microsoft-com:office:office" xmlns:r="http://schemas.openxmlformats.org/officeDocument/2006/relationships" xmlns:m="http://schemas.openxmlformats.org/officeDocument/2006/math" xmlns:v="urn:schemas-microsoft-com:vml" xmlns:wp14="http://schemas.microsoft.com/office/word/2010/wordprocessingDrawing" xmlns:wp="http://schemas.openxmlformats.org/drawingml/2006/wordprocessingDrawing" xmlns:w10="urn:schemas-microsoft-com:office:word" xmlns:w="http://schemas.openxmlformats.org/wordprocessingml/2006/main" xmlns:w14="http://schemas.microsoft.com/office/word/2010/wordml" xmlns:w15="http://schemas.microsoft.com/office/word/2012/wordml" xmlns:w16cex="http://schemas.microsoft.com/office/word/2018/wordml/cex" xmlns:w16cid="http://schemas.microsoft.com/office/word/2016/wordml/cid" xmlns:w16="http://schemas.microsoft.com/office/word/2018/wordml" xmlns:w16sdtdh="http://schemas.microsoft.com/office/word/2020/wordml/sdtdatahash" xmlns:w16se="http://schemas.microsoft.com/office/word/2015/wordml/symex" xmlns:wpg="http://schemas.microsoft.com/office/word/2010/wordprocessingGroup" xmlns:wpi="http://schemas.microsoft.com/office/word/2010/wordprocessingInk" xmlns:wne="http://schemas.microsoft.com/office/word/2006/wordml" xmlns:wps="http://schemas.microsoft.com/office/word/2010/wordprocessingShape" mc:Ignorable="w14 w15 w16se w16cid w16 w16cex w16sdtdh wp14">
-  <w:sdt>
-    <w:sdtPr>
-      <w:id w:val="971484177"/>
-      <w:docPartObj>
-        <w:docPartGallery w:val="Page Numbers (Bottom of Page)"/>
-        <w:docPartUnique/>
-      </w:docPartObj>
-    </w:sdtPr>
-    <w:sdtEndPr>
+  <w:p>
+    <w:pPr>
+      <w:pStyle w:val="Footer"/>
+      <w:jc w:val="center"/>
+    </w:pPr>
+  </w:p>
+  <w:p>
+    <w:pPr>
+      <w:pStyle w:val="Footer"/>
+    </w:pPr>
+  </w:p>
+</w:ftr>
+</file>
+
+<file path=word/footer6.xml><?xml version="1.0" encoding="utf-8"?>
+<w:ftr xmlns:wpc="http://schemas.microsoft.com/office/word/2010/wordprocessingCanvas" xmlns:cx="http://schemas.microsoft.com/office/drawing/2014/chartex" xmlns:cx1="http://schemas.microsoft.com/office/drawing/2015/9/8/chartex" xmlns:cx2="http://schemas.microsoft.com/office/drawing/2015/10/21/chartex" xmlns:cx3="http://schemas.microsoft.com/office/drawing/2016/5/9/chartex" xmlns:cx4="http://schemas.microsoft.com/office/drawing/2016/5/10/chartex" xmlns:cx5="http://schemas.microsoft.com/office/drawing/2016/5/11/chartex" xmlns:cx6="http://schemas.microsoft.com/office/drawing/2016/5/12/chartex" xmlns:cx7="http://schemas.microsoft.com/office/drawing/2016/5/13/chartex" xmlns:cx8="http://schemas.microsoft.com/office/drawing/2016/5/14/chartex" xmlns:mc="http://schemas.openxmlformats.org/markup-compatibility/2006" xmlns:aink="http://schemas.microsoft.com/office/drawing/2016/ink" xmlns:am3d="http://schemas.microsoft.com/office/drawing/2017/model3d" xmlns:o="urn:schemas-microsoft-com:office:office" xmlns:r="http://schemas.openxmlformats.org/officeDocument/2006/relationships" xmlns:m="http://schemas.openxmlformats.org/officeDocument/2006/math" xmlns:v="urn:schemas-microsoft-com:vml" xmlns:wp14="http://schemas.microsoft.com/office/word/2010/wordprocessingDrawing" xmlns:wp="http://schemas.openxmlformats.org/drawingml/2006/wordprocessingDrawing" xmlns:w10="urn:schemas-microsoft-com:office:word" xmlns:w="http://schemas.openxmlformats.org/wordprocessingml/2006/main" xmlns:w14="http://schemas.microsoft.com/office/word/2010/wordml" xmlns:w15="http://schemas.microsoft.com/office/word/2012/wordml" xmlns:w16cex="http://schemas.microsoft.com/office/word/2018/wordml/cex" xmlns:w16cid="http://schemas.microsoft.com/office/word/2016/wordml/cid" xmlns:w16="http://schemas.microsoft.com/office/word/2018/wordml" xmlns:w16sdtdh="http://schemas.microsoft.com/office/word/2020/wordml/sdtdatahash" xmlns:w16se="http://schemas.microsoft.com/office/word/2015/wordml/symex" xmlns:wpg="http://schemas.microsoft.com/office/word/2010/wordprocessingGroup" xmlns:wpi="http://schemas.microsoft.com/office/word/2010/wordprocessingInk" xmlns:wne="http://schemas.microsoft.com/office/word/2006/wordml" xmlns:wps="http://schemas.microsoft.com/office/word/2010/wordprocessingShape" mc:Ignorable="w14 w15 w16se w16cid w16 w16cex w16sdtdh wp14">
+  <w:p>
+    <w:pPr>
+      <w:pStyle w:val="Footer"/>
+      <w:tabs>
+        <w:tab w:val="center" w:pos="3968"/>
+        <w:tab w:val="left" w:pos="4590"/>
+      </w:tabs>
+      <w:jc w:val="left"/>
+    </w:pPr>
+    <w:r>
+      <w:tab/>
+    </w:r>
+    <w:sdt>
+      <w:sdtPr>
+        <w:id w:val="-2044821571"/>
+        <w:docPartObj>
+          <w:docPartGallery w:val="Page Numbers (Bottom of Page)"/>
+          <w:docPartUnique/>
+        </w:docPartObj>
+      </w:sdtPr>
+      <w:sdtEndPr>
+        <w:rPr>
+          <w:noProof/>
+        </w:rPr>
+      </w:sdtEndPr>
+      <w:sdtContent/>
+    </w:sdt>
+    <w:r>
       <w:rPr>
         <w:noProof/>
       </w:rPr>
-    </w:sdtEndPr>
-    <w:sdtContent>
-      <w:p>
-        <w:pPr>
-          <w:pStyle w:val="Footer"/>
-          <w:jc w:val="center"/>
-        </w:pPr>
-        <w:r>
-          <w:fldChar w:fldCharType="begin"/>
-        </w:r>
-        <w:r>
-          <w:instrText xml:space="preserve"> PAGE   \* MERGEFORMAT </w:instrText>
-        </w:r>
-        <w:r>
-          <w:fldChar w:fldCharType="separate"/>
-        </w:r>
-        <w:r>
-          <w:rPr>
-            <w:noProof/>
-          </w:rPr>
-          <w:t>2</w:t>
-        </w:r>
-        <w:r>
-          <w:rPr>
-            <w:noProof/>
-          </w:rPr>
-          <w:fldChar w:fldCharType="end"/>
-        </w:r>
-      </w:p>
-    </w:sdtContent>
-  </w:sdt>
+      <w:tab/>
+    </w:r>
+  </w:p>
   <w:p>
     <w:pPr>
       <w:pStyle w:val="Footer"/>
@@ -27199,6 +27884,49 @@
 
 <file path=word/header5.xml><?xml version="1.0" encoding="utf-8"?>
 <w:hdr xmlns:wpc="http://schemas.microsoft.com/office/word/2010/wordprocessingCanvas" xmlns:cx="http://schemas.microsoft.com/office/drawing/2014/chartex" xmlns:cx1="http://schemas.microsoft.com/office/drawing/2015/9/8/chartex" xmlns:cx2="http://schemas.microsoft.com/office/drawing/2015/10/21/chartex" xmlns:cx3="http://schemas.microsoft.com/office/drawing/2016/5/9/chartex" xmlns:cx4="http://schemas.microsoft.com/office/drawing/2016/5/10/chartex" xmlns:cx5="http://schemas.microsoft.com/office/drawing/2016/5/11/chartex" xmlns:cx6="http://schemas.microsoft.com/office/drawing/2016/5/12/chartex" xmlns:cx7="http://schemas.microsoft.com/office/drawing/2016/5/13/chartex" xmlns:cx8="http://schemas.microsoft.com/office/drawing/2016/5/14/chartex" xmlns:mc="http://schemas.openxmlformats.org/markup-compatibility/2006" xmlns:aink="http://schemas.microsoft.com/office/drawing/2016/ink" xmlns:am3d="http://schemas.microsoft.com/office/drawing/2017/model3d" xmlns:o="urn:schemas-microsoft-com:office:office" xmlns:r="http://schemas.openxmlformats.org/officeDocument/2006/relationships" xmlns:m="http://schemas.openxmlformats.org/officeDocument/2006/math" xmlns:v="urn:schemas-microsoft-com:vml" xmlns:wp14="http://schemas.microsoft.com/office/word/2010/wordprocessingDrawing" xmlns:wp="http://schemas.openxmlformats.org/drawingml/2006/wordprocessingDrawing" xmlns:w10="urn:schemas-microsoft-com:office:word" xmlns:w="http://schemas.openxmlformats.org/wordprocessingml/2006/main" xmlns:w14="http://schemas.microsoft.com/office/word/2010/wordml" xmlns:w15="http://schemas.microsoft.com/office/word/2012/wordml" xmlns:w16cex="http://schemas.microsoft.com/office/word/2018/wordml/cex" xmlns:w16cid="http://schemas.microsoft.com/office/word/2016/wordml/cid" xmlns:w16="http://schemas.microsoft.com/office/word/2018/wordml" xmlns:w16sdtdh="http://schemas.microsoft.com/office/word/2020/wordml/sdtdatahash" xmlns:w16se="http://schemas.microsoft.com/office/word/2015/wordml/symex" xmlns:wpg="http://schemas.microsoft.com/office/word/2010/wordprocessingGroup" xmlns:wpi="http://schemas.microsoft.com/office/word/2010/wordprocessingInk" xmlns:wne="http://schemas.microsoft.com/office/word/2006/wordml" xmlns:wps="http://schemas.microsoft.com/office/word/2010/wordprocessingShape" mc:Ignorable="w14 w15 w16se w16cid w16 w16cex w16sdtdh wp14">
+  <w:sdt>
+    <w:sdtPr>
+      <w:id w:val="-1131011576"/>
+      <w:docPartObj>
+        <w:docPartGallery w:val="Page Numbers (Top of Page)"/>
+        <w:docPartUnique/>
+      </w:docPartObj>
+    </w:sdtPr>
+    <w:sdtEndPr>
+      <w:rPr>
+        <w:noProof/>
+      </w:rPr>
+    </w:sdtEndPr>
+    <w:sdtContent>
+      <w:p>
+        <w:pPr>
+          <w:pStyle w:val="Header"/>
+          <w:jc w:val="right"/>
+        </w:pPr>
+        <w:r>
+          <w:fldChar w:fldCharType="begin"/>
+        </w:r>
+        <w:r>
+          <w:instrText xml:space="preserve"> PAGE   \* MERGEFORMAT </w:instrText>
+        </w:r>
+        <w:r>
+          <w:fldChar w:fldCharType="separate"/>
+        </w:r>
+        <w:r>
+          <w:rPr>
+            <w:noProof/>
+          </w:rPr>
+          <w:t>2</w:t>
+        </w:r>
+        <w:r>
+          <w:rPr>
+            <w:noProof/>
+          </w:rPr>
+          <w:fldChar w:fldCharType="end"/>
+        </w:r>
+      </w:p>
+    </w:sdtContent>
+  </w:sdt>
   <w:p>
     <w:pPr>
       <w:pStyle w:val="Header"/>
@@ -27208,6 +27936,16 @@
 </file>
 
 <file path=word/header6.xml><?xml version="1.0" encoding="utf-8"?>
+<w:hdr xmlns:wpc="http://schemas.microsoft.com/office/word/2010/wordprocessingCanvas" xmlns:cx="http://schemas.microsoft.com/office/drawing/2014/chartex" xmlns:cx1="http://schemas.microsoft.com/office/drawing/2015/9/8/chartex" xmlns:cx2="http://schemas.microsoft.com/office/drawing/2015/10/21/chartex" xmlns:cx3="http://schemas.microsoft.com/office/drawing/2016/5/9/chartex" xmlns:cx4="http://schemas.microsoft.com/office/drawing/2016/5/10/chartex" xmlns:cx5="http://schemas.microsoft.com/office/drawing/2016/5/11/chartex" xmlns:cx6="http://schemas.microsoft.com/office/drawing/2016/5/12/chartex" xmlns:cx7="http://schemas.microsoft.com/office/drawing/2016/5/13/chartex" xmlns:cx8="http://schemas.microsoft.com/office/drawing/2016/5/14/chartex" xmlns:mc="http://schemas.openxmlformats.org/markup-compatibility/2006" xmlns:aink="http://schemas.microsoft.com/office/drawing/2016/ink" xmlns:am3d="http://schemas.microsoft.com/office/drawing/2017/model3d" xmlns:o="urn:schemas-microsoft-com:office:office" xmlns:r="http://schemas.openxmlformats.org/officeDocument/2006/relationships" xmlns:m="http://schemas.openxmlformats.org/officeDocument/2006/math" xmlns:v="urn:schemas-microsoft-com:vml" xmlns:wp14="http://schemas.microsoft.com/office/word/2010/wordprocessingDrawing" xmlns:wp="http://schemas.openxmlformats.org/drawingml/2006/wordprocessingDrawing" xmlns:w10="urn:schemas-microsoft-com:office:word" xmlns:w="http://schemas.openxmlformats.org/wordprocessingml/2006/main" xmlns:w14="http://schemas.microsoft.com/office/word/2010/wordml" xmlns:w15="http://schemas.microsoft.com/office/word/2012/wordml" xmlns:w16cex="http://schemas.microsoft.com/office/word/2018/wordml/cex" xmlns:w16cid="http://schemas.microsoft.com/office/word/2016/wordml/cid" xmlns:w16="http://schemas.microsoft.com/office/word/2018/wordml" xmlns:w16sdtdh="http://schemas.microsoft.com/office/word/2020/wordml/sdtdatahash" xmlns:w16se="http://schemas.microsoft.com/office/word/2015/wordml/symex" xmlns:wpg="http://schemas.microsoft.com/office/word/2010/wordprocessingGroup" xmlns:wpi="http://schemas.microsoft.com/office/word/2010/wordprocessingInk" xmlns:wne="http://schemas.microsoft.com/office/word/2006/wordml" xmlns:wps="http://schemas.microsoft.com/office/word/2010/wordprocessingShape" mc:Ignorable="w14 w15 w16se w16cid w16 w16cex w16sdtdh wp14">
+  <w:p>
+    <w:pPr>
+      <w:pStyle w:val="Header"/>
+    </w:pPr>
+  </w:p>
+</w:hdr>
+</file>
+
+<file path=word/header7.xml><?xml version="1.0" encoding="utf-8"?>
 <w:hdr xmlns:wpc="http://schemas.microsoft.com/office/word/2010/wordprocessingCanvas" xmlns:cx="http://schemas.microsoft.com/office/drawing/2014/chartex" xmlns:cx1="http://schemas.microsoft.com/office/drawing/2015/9/8/chartex" xmlns:cx2="http://schemas.microsoft.com/office/drawing/2015/10/21/chartex" xmlns:cx3="http://schemas.microsoft.com/office/drawing/2016/5/9/chartex" xmlns:cx4="http://schemas.microsoft.com/office/drawing/2016/5/10/chartex" xmlns:cx5="http://schemas.microsoft.com/office/drawing/2016/5/11/chartex" xmlns:cx6="http://schemas.microsoft.com/office/drawing/2016/5/12/chartex" xmlns:cx7="http://schemas.microsoft.com/office/drawing/2016/5/13/chartex" xmlns:cx8="http://schemas.microsoft.com/office/drawing/2016/5/14/chartex" xmlns:mc="http://schemas.openxmlformats.org/markup-compatibility/2006" xmlns:aink="http://schemas.microsoft.com/office/drawing/2016/ink" xmlns:am3d="http://schemas.microsoft.com/office/drawing/2017/model3d" xmlns:o="urn:schemas-microsoft-com:office:office" xmlns:r="http://schemas.openxmlformats.org/officeDocument/2006/relationships" xmlns:m="http://schemas.openxmlformats.org/officeDocument/2006/math" xmlns:v="urn:schemas-microsoft-com:vml" xmlns:wp14="http://schemas.microsoft.com/office/word/2010/wordprocessingDrawing" xmlns:wp="http://schemas.openxmlformats.org/drawingml/2006/wordprocessingDrawing" xmlns:w10="urn:schemas-microsoft-com:office:word" xmlns:w="http://schemas.openxmlformats.org/wordprocessingml/2006/main" xmlns:w14="http://schemas.microsoft.com/office/word/2010/wordml" xmlns:w15="http://schemas.microsoft.com/office/word/2012/wordml" xmlns:w16cex="http://schemas.microsoft.com/office/word/2018/wordml/cex" xmlns:w16cid="http://schemas.microsoft.com/office/word/2016/wordml/cid" xmlns:w16="http://schemas.microsoft.com/office/word/2018/wordml" xmlns:w16sdtdh="http://schemas.microsoft.com/office/word/2020/wordml/sdtdatahash" xmlns:w16se="http://schemas.microsoft.com/office/word/2015/wordml/symex" xmlns:wpg="http://schemas.microsoft.com/office/word/2010/wordprocessingGroup" xmlns:wpi="http://schemas.microsoft.com/office/word/2010/wordprocessingInk" xmlns:wne="http://schemas.microsoft.com/office/word/2006/wordml" xmlns:wps="http://schemas.microsoft.com/office/word/2010/wordprocessingShape" mc:Ignorable="w14 w15 w16se w16cid w16 w16cex w16sdtdh wp14">
   <w:p>
     <w:pPr>

</xml_diff>